<commit_message>
docs: updated draft thesis and added raw brd markdown
</commit_message>
<xml_diff>
--- a/docs/v2/draft_thesis/v1.2/Template-TA.docx
+++ b/docs/v2/draft_thesis/v1.2/Template-TA.docx
@@ -1224,7 +1224,7 @@
               </wp:anchor>
             </w:drawing>
           </mc:Choice>
-          <mc:Fallback xmlns:asvg="http://schemas.microsoft.com/office/drawing/2016/SVG/main" xmlns:a14="http://schemas.microsoft.com/office/drawing/2010/main" xmlns:pic="http://schemas.openxmlformats.org/drawingml/2006/picture" xmlns:a="http://schemas.openxmlformats.org/drawingml/2006/main" xmlns:w16sdtfl="http://schemas.microsoft.com/office/word/2024/wordml/sdtformatlock" xmlns:w16sdtdh="http://schemas.microsoft.com/office/word/2020/wordml/sdtdatahash" xmlns:w16du="http://schemas.microsoft.com/office/word/2023/wordml/word16du" xmlns:w16="http://schemas.microsoft.com/office/word/2018/wordml" xmlns:w16cid="http://schemas.microsoft.com/office/word/2016/wordml/cid" xmlns:w16cex="http://schemas.microsoft.com/office/word/2018/wordml/cex" xmlns:oel="http://schemas.microsoft.com/office/2019/extlst" xmlns:am3d="http://schemas.microsoft.com/office/drawing/2017/model3d" xmlns:aink="http://schemas.microsoft.com/office/drawing/2016/ink" xmlns:cx8="http://schemas.microsoft.com/office/drawing/2016/5/14/chartex" xmlns:cx7="http://schemas.microsoft.com/office/drawing/2016/5/13/chartex" xmlns:cx6="http://schemas.microsoft.com/office/drawing/2016/5/12/chartex" xmlns:cx5="http://schemas.microsoft.com/office/drawing/2016/5/11/chartex" xmlns:cx4="http://schemas.microsoft.com/office/drawing/2016/5/10/chartex" xmlns:cx3="http://schemas.microsoft.com/office/drawing/2016/5/9/chartex" xmlns:cx2="http://schemas.microsoft.com/office/drawing/2015/10/21/chartex" xmlns:cx1="http://schemas.microsoft.com/office/drawing/2015/9/8/chartex">
+          <mc:Fallback xmlns:cx1="http://schemas.microsoft.com/office/drawing/2015/9/8/chartex" xmlns:cx2="http://schemas.microsoft.com/office/drawing/2015/10/21/chartex" xmlns:cx3="http://schemas.microsoft.com/office/drawing/2016/5/9/chartex" xmlns:cx4="http://schemas.microsoft.com/office/drawing/2016/5/10/chartex" xmlns:cx5="http://schemas.microsoft.com/office/drawing/2016/5/11/chartex" xmlns:cx6="http://schemas.microsoft.com/office/drawing/2016/5/12/chartex" xmlns:cx7="http://schemas.microsoft.com/office/drawing/2016/5/13/chartex" xmlns:cx8="http://schemas.microsoft.com/office/drawing/2016/5/14/chartex" xmlns:aink="http://schemas.microsoft.com/office/drawing/2016/ink" xmlns:am3d="http://schemas.microsoft.com/office/drawing/2017/model3d" xmlns:oel="http://schemas.microsoft.com/office/2019/extlst" xmlns:w16cex="http://schemas.microsoft.com/office/word/2018/wordml/cex" xmlns:w16cid="http://schemas.microsoft.com/office/word/2016/wordml/cid" xmlns:w16="http://schemas.microsoft.com/office/word/2018/wordml" xmlns:w16du="http://schemas.microsoft.com/office/word/2023/wordml/word16du" xmlns:w16sdtdh="http://schemas.microsoft.com/office/word/2020/wordml/sdtdatahash" xmlns:w16sdtfl="http://schemas.microsoft.com/office/word/2024/wordml/sdtformatlock" xmlns:a="http://schemas.openxmlformats.org/drawingml/2006/main" xmlns:pic="http://schemas.openxmlformats.org/drawingml/2006/picture" xmlns:a14="http://schemas.microsoft.com/office/drawing/2010/main" xmlns:asvg="http://schemas.microsoft.com/office/drawing/2016/SVG/main">
             <w:pict>
               <v:rect id="Rectangle 205" style="position:absolute;margin-left:-58.55pt;margin-top:100.75pt;width:597.7pt;height:28.3pt;z-index:251661312;visibility:visible;mso-wrap-style:square;mso-width-percent:0;mso-height-percent:0;mso-wrap-distance-left:9pt;mso-wrap-distance-top:0;mso-wrap-distance-right:9pt;mso-wrap-distance-bottom:0;mso-position-horizontal:absolute;mso-position-horizontal-relative:text;mso-position-vertical:absolute;mso-position-vertical-relative:text;mso-width-percent:0;mso-height-percent:0;mso-width-relative:margin;mso-height-relative:margin;v-text-anchor:middle" o:spid="_x0000_s1026" fillcolor="#0067ac" stroked="f" strokeweight="1pt" w14:anchorId="50CB37E9" o:gfxdata="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"/>
             </w:pict>
@@ -2512,7 +2512,7 @@
               </wp:anchor>
             </w:drawing>
           </mc:Choice>
-          <mc:Fallback xmlns:asvg="http://schemas.microsoft.com/office/drawing/2016/SVG/main" xmlns:a14="http://schemas.microsoft.com/office/drawing/2010/main" xmlns:pic="http://schemas.openxmlformats.org/drawingml/2006/picture" xmlns:a="http://schemas.openxmlformats.org/drawingml/2006/main" xmlns:w16sdtfl="http://schemas.microsoft.com/office/word/2024/wordml/sdtformatlock" xmlns:w16sdtdh="http://schemas.microsoft.com/office/word/2020/wordml/sdtdatahash" xmlns:w16du="http://schemas.microsoft.com/office/word/2023/wordml/word16du" xmlns:w16="http://schemas.microsoft.com/office/word/2018/wordml" xmlns:w16cid="http://schemas.microsoft.com/office/word/2016/wordml/cid" xmlns:w16cex="http://schemas.microsoft.com/office/word/2018/wordml/cex" xmlns:oel="http://schemas.microsoft.com/office/2019/extlst" xmlns:am3d="http://schemas.microsoft.com/office/drawing/2017/model3d" xmlns:aink="http://schemas.microsoft.com/office/drawing/2016/ink" xmlns:cx8="http://schemas.microsoft.com/office/drawing/2016/5/14/chartex" xmlns:cx7="http://schemas.microsoft.com/office/drawing/2016/5/13/chartex" xmlns:cx6="http://schemas.microsoft.com/office/drawing/2016/5/12/chartex" xmlns:cx5="http://schemas.microsoft.com/office/drawing/2016/5/11/chartex" xmlns:cx4="http://schemas.microsoft.com/office/drawing/2016/5/10/chartex" xmlns:cx3="http://schemas.microsoft.com/office/drawing/2016/5/9/chartex" xmlns:cx2="http://schemas.microsoft.com/office/drawing/2015/10/21/chartex" xmlns:cx1="http://schemas.microsoft.com/office/drawing/2015/9/8/chartex">
+          <mc:Fallback xmlns:cx1="http://schemas.microsoft.com/office/drawing/2015/9/8/chartex" xmlns:cx2="http://schemas.microsoft.com/office/drawing/2015/10/21/chartex" xmlns:cx3="http://schemas.microsoft.com/office/drawing/2016/5/9/chartex" xmlns:cx4="http://schemas.microsoft.com/office/drawing/2016/5/10/chartex" xmlns:cx5="http://schemas.microsoft.com/office/drawing/2016/5/11/chartex" xmlns:cx6="http://schemas.microsoft.com/office/drawing/2016/5/12/chartex" xmlns:cx7="http://schemas.microsoft.com/office/drawing/2016/5/13/chartex" xmlns:cx8="http://schemas.microsoft.com/office/drawing/2016/5/14/chartex" xmlns:aink="http://schemas.microsoft.com/office/drawing/2016/ink" xmlns:am3d="http://schemas.microsoft.com/office/drawing/2017/model3d" xmlns:oel="http://schemas.microsoft.com/office/2019/extlst" xmlns:w16cex="http://schemas.microsoft.com/office/word/2018/wordml/cex" xmlns:w16cid="http://schemas.microsoft.com/office/word/2016/wordml/cid" xmlns:w16="http://schemas.microsoft.com/office/word/2018/wordml" xmlns:w16du="http://schemas.microsoft.com/office/word/2023/wordml/word16du" xmlns:w16sdtdh="http://schemas.microsoft.com/office/word/2020/wordml/sdtdatahash" xmlns:w16sdtfl="http://schemas.microsoft.com/office/word/2024/wordml/sdtformatlock" xmlns:a="http://schemas.openxmlformats.org/drawingml/2006/main" xmlns:pic="http://schemas.openxmlformats.org/drawingml/2006/picture" xmlns:a14="http://schemas.microsoft.com/office/drawing/2010/main" xmlns:asvg="http://schemas.microsoft.com/office/drawing/2016/SVG/main">
             <w:pict>
               <v:rect id="Rectangle 5" style="position:absolute;margin-left:-58.55pt;margin-top:100.75pt;width:597.7pt;height:28.3pt;z-index:251664384;visibility:visible;mso-wrap-style:square;mso-width-percent:0;mso-height-percent:0;mso-wrap-distance-left:9pt;mso-wrap-distance-top:0;mso-wrap-distance-right:9pt;mso-wrap-distance-bottom:0;mso-position-horizontal:absolute;mso-position-horizontal-relative:text;mso-position-vertical:absolute;mso-position-vertical-relative:text;mso-width-percent:0;mso-height-percent:0;mso-width-relative:margin;mso-height-relative:margin;v-text-anchor:middle" o:spid="_x0000_s1026" fillcolor="#0067ac" stroked="f" strokeweight="1pt" w14:anchorId="09E6387F" o:gfxdata="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"/>
             </w:pict>
@@ -4481,7 +4481,6 @@
           <w:w w:val="99"/>
         </w:rPr>
       </w:pPr>
-      <w:proofErr w:type="gramStart"/>
       <w:r>
         <w:t>O</w:t>
       </w:r>
@@ -4507,11 +4506,7 @@
         <w:t xml:space="preserve"> </w:t>
       </w:r>
       <w:r>
-        <w:t>:</w:t>
-      </w:r>
-      <w:proofErr w:type="gramEnd"/>
-      <w:r>
-        <w:t xml:space="preserve"> &lt;</w:t>
+        <w:t>: &lt;</w:t>
       </w:r>
       <w:r>
         <w:rPr>
@@ -4697,7 +4692,6 @@
         </w:rPr>
         <w:t xml:space="preserve"> </w:t>
       </w:r>
-      <w:proofErr w:type="gramStart"/>
       <w:r>
         <w:t>Akh</w:t>
       </w:r>
@@ -4719,7 +4713,6 @@
       <w:r>
         <w:t>:</w:t>
       </w:r>
-      <w:proofErr w:type="gramEnd"/>
     </w:p>
     <w:p>
       <w:pPr>
@@ -12882,7 +12875,2012 @@
         <w:rPr>
           <w:lang w:val="en-ID"/>
         </w:rPr>
-        <w:t>. Perbedaan</w:t>
+        <w:t>. Perbedaan tersebut relevan untuk penelitian ini karena memperlihatkan bahwa similarity dari representasi kata tidak selalu sejalan dengan persepsi expert mengenai kesesuaian antarartefak. Cosine similarity dapat menunjukkan seberapa banyak representasi tekstual memiliki term yang berkaitan, tetapi tidak secara eksplisit membuktikan bahwa sender, receiver, direction, ordering, condition, dan alternative behavior sudah benar.</w:t>
+      </w:r>
+    </w:p>
+    <w:p>
+      <w:pPr>
+        <w:rPr>
+          <w:lang w:val="en-ID"/>
+        </w:rPr>
+      </w:pPr>
+      <w:r>
+        <w:rPr>
+          <w:lang w:val="en-ID"/>
+        </w:rPr>
+        <w:t xml:space="preserve">Apriyanto </w:t>
+      </w:r>
+      <w:r>
+        <w:rPr>
+          <w:lang w:val="en-ID"/>
+        </w:rPr>
+        <w:t xml:space="preserve">et al. </w:t>
+      </w:r>
+      <w:r>
+        <w:rPr>
+          <w:lang w:val="en-ID"/>
+        </w:rPr>
+        <w:fldChar w:fldCharType="begin" w:fldLock="1"/>
+      </w:r>
+      <w:r>
+        <w:rPr>
+          <w:lang w:val="en-ID"/>
+        </w:rPr>
+        <w:instrText>ADDIN CSL_CITATION {"citationItems":[{"id":"ITEM-1","itemData":{"DOI":"10.1109/AIIoT54504.2022.9817341","ISBN":"9781665484534","abstract":"Extraction is an essential part of processing a document to ensure the success of the text mining process. In this study, the example of the SRS document used is the Integrated Service Application (APTU) KPKNL Bandung, an application to manage the process of submitting service tickets at the State Property and Auction Service Office. There is a difference in interpreting the activities that exist in the Use Case Description artifact with a Sequence Diagram that provides an overview of the functionality of a process to show the involvement of an activity related to the Use Case Description. This study aims to perform step extraction on the Use Case description. The results of this extraction are compared for their suitability with the sequence diagram using the concept of text mining. There are core results from this research activity. First, the highest similarity between documents is in the SP01 and SD01 documents, with the similarity value being 0.69108792. Second, the highest similarity between words is found in words 'list' and 'menu,' with the similarity value being 0.9412. Third, the Kappa Score from Gwet's AC1 formula using the Python programming language is 0.12362, which means 'Slight Agreement,' while the Kappa Score value using a questionnaire filled in by the expert is 0.97464, which means 'Almost perfect.","author":[{"dropping-particle":"","family":"Apriyanto","given":"Nur","non-dropping-particle":"","parse-names":false,"suffix":""},{"dropping-particle":"","family":"Priyadi","given":"Yudi","non-dropping-particle":"","parse-names":false,"suffix":""},{"dropping-particle":"","family":"Kusumo","given":"Dana Sulistyo","non-dropping-particle":"","parse-names":false,"suffix":""}],"container-title":"2022 IEEE World AI IoT Congress, AIIoT 2022","id":"ITEM-1","issued":{"date-parts":[["2022"]]},"page":"476-482","publisher":"IEEE","title":"Extraction of Step Performed in Use Case Description as a Reference for Conformity of Sequence Diagrams Using Text Mining (Case Study: SRS APTU)","type":"article-journal"},"uris":["http://www.mendeley.com/documents/?uuid=74d112c7-d545-4fc4-9f56-164adc9ecc08"]}],"mendeley":{"formattedCitation":"[4]","plainTextFormattedCitation":"[4]","previouslyFormattedCitation":"[4]"},"properties":{"noteIndex":0},"schema":"https://github.com/citation-style-language/schema/raw/master/csl-citation.json"}</w:instrText>
+      </w:r>
+      <w:r>
+        <w:rPr>
+          <w:lang w:val="en-ID"/>
+        </w:rPr>
+        <w:fldChar w:fldCharType="separate"/>
+      </w:r>
+      <w:r>
+        <w:rPr>
+          <w:noProof/>
+          <w:lang w:val="en-ID"/>
+        </w:rPr>
+        <w:t>[4]</w:t>
+      </w:r>
+      <w:r>
+        <w:rPr>
+          <w:lang w:val="en-ID"/>
+        </w:rPr>
+        <w:fldChar w:fldCharType="end"/>
+      </w:r>
+      <w:r>
+        <w:rPr>
+          <w:lang w:val="en-ID"/>
+        </w:rPr>
+        <w:t xml:space="preserve"> menggunakan pendekatan yang mirip pada SRS APTU. Penelitian tersebut melakukan artifact modeling terhadap use case description dan sequence diagram, mengekstrak Step Performed serta isi sequence diagram, kemudian menjalankan preprocessing yang mencakup case folding, tokenization, stemming, dan stopwords. Setelah preprocessing dilakukan, cosine similarity digunakan untuk mencari tingkat kesamaan dan Gwet's AC1 digunakan untuk menguji validity dan reliability ter</w:t>
+      </w:r>
+      <w:r>
+        <w:rPr>
+          <w:lang w:val="en-ID"/>
+        </w:rPr>
+        <w:t xml:space="preserve">hadap penilaian expert </w:t>
+      </w:r>
+      <w:r>
+        <w:rPr>
+          <w:lang w:val="en-ID"/>
+        </w:rPr>
+        <w:fldChar w:fldCharType="begin" w:fldLock="1"/>
+      </w:r>
+      <w:r>
+        <w:rPr>
+          <w:lang w:val="en-ID"/>
+        </w:rPr>
+        <w:instrText>ADDIN CSL_CITATION {"citationItems":[{"id":"ITEM-1","itemData":{"DOI":"10.1109/AIIoT54504.2022.9817341","ISBN":"9781665484534","abstract":"Extraction is an essential part of processing a document to ensure the success of the text mining process. In this study, the example of the SRS document used is the Integrated Service Application (APTU) KPKNL Bandung, an application to manage the process of submitting service tickets at the State Property and Auction Service Office. There is a difference in interpreting the activities that exist in the Use Case Description artifact with a Sequence Diagram that provides an overview of the functionality of a process to show the involvement of an activity related to the Use Case Description. This study aims to perform step extraction on the Use Case description. The results of this extraction are compared for their suitability with the sequence diagram using the concept of text mining. There are core results from this research activity. First, the highest similarity between documents is in the SP01 and SD01 documents, with the similarity value being 0.69108792. Second, the highest similarity between words is found in words 'list' and 'menu,' with the similarity value being 0.9412. Third, the Kappa Score from Gwet's AC1 formula using the Python programming language is 0.12362, which means 'Slight Agreement,' while the Kappa Score value using a questionnaire filled in by the expert is 0.97464, which means 'Almost perfect.","author":[{"dropping-particle":"","family":"Apriyanto","given":"Nur","non-dropping-particle":"","parse-names":false,"suffix":""},{"dropping-particle":"","family":"Priyadi","given":"Yudi","non-dropping-particle":"","parse-names":false,"suffix":""},{"dropping-particle":"","family":"Kusumo","given":"Dana Sulistyo","non-dropping-particle":"","parse-names":false,"suffix":""}],"container-title":"2022 IEEE World AI IoT Congress, AIIoT 2022","id":"ITEM-1","issued":{"date-parts":[["2022"]]},"page":"476-482","publisher":"IEEE","title":"Extraction of Step Performed in Use Case Description as a Reference for Conformity of Sequence Diagrams Using Text Mining (Case Study: SRS APTU)","type":"article-journal"},"uris":["http://www.mendeley.com/documents/?uuid=74d112c7-d545-4fc4-9f56-164adc9ecc08"]}],"mendeley":{"formattedCitation":"[4]","plainTextFormattedCitation":"[4]","previouslyFormattedCitation":"[4]"},"properties":{"noteIndex":0},"schema":"https://github.com/citation-style-language/schema/raw/master/csl-citation.json"}</w:instrText>
+      </w:r>
+      <w:r>
+        <w:rPr>
+          <w:lang w:val="en-ID"/>
+        </w:rPr>
+        <w:fldChar w:fldCharType="separate"/>
+      </w:r>
+      <w:r>
+        <w:rPr>
+          <w:noProof/>
+          <w:lang w:val="en-ID"/>
+        </w:rPr>
+        <w:t>[4]</w:t>
+      </w:r>
+      <w:r>
+        <w:rPr>
+          <w:lang w:val="en-ID"/>
+        </w:rPr>
+        <w:fldChar w:fldCharType="end"/>
+      </w:r>
+      <w:r>
+        <w:rPr>
+          <w:lang w:val="en-ID"/>
+        </w:rPr>
+        <w:t xml:space="preserve">. </w:t>
+      </w:r>
+      <w:r>
+        <w:rPr>
+          <w:lang w:val="en-ID"/>
+        </w:rPr>
+        <w:t>Dataset APTU sebenarnya memiliki 28 use cases, 29 use case descriptions, dan 29 sequence diagrams, tetapi contoh evaluasi yang dibahas menggunakan lima Step Performed dan lima Sequence Diagram.</w:t>
+      </w:r>
+    </w:p>
+    <w:p>
+      <w:pPr>
+        <w:rPr>
+          <w:lang w:val="en-ID"/>
+        </w:rPr>
+      </w:pPr>
+      <w:r>
+        <w:rPr>
+          <w:lang w:val="en-ID"/>
+        </w:rPr>
+        <w:t>Penelitian APTU memperoleh similarity dokumen tertinggi sebesar 0,69108792 dan word similarity tertinggi sebesar 0,9412. Namun, Kappa Score yang dihasilkan program hanya 0,12362 atau Slight Agreement, sedangkan questionnaire expert menghasilkan 0,97464 atau Al</w:t>
+      </w:r>
+      <w:r>
+        <w:rPr>
+          <w:lang w:val="en-ID"/>
+        </w:rPr>
+        <w:t xml:space="preserve">most Perfect Agreement [4]. </w:t>
+      </w:r>
+      <w:r>
+        <w:rPr>
+          <w:lang w:val="en-ID"/>
+        </w:rPr>
+        <w:t>Selisih yang sangat besar tersebut semakin memperkuat indikasi bahwa pencocokan berbasis term similarity belum cukup untuk menjadi consistency checker pada relationship specification-to-design yang memiliki semantic dan behavioral constraint.</w:t>
+      </w:r>
+    </w:p>
+    <w:p>
+      <w:pPr>
+        <w:rPr>
+          <w:lang w:val="en-ID"/>
+        </w:rPr>
+      </w:pPr>
+      <w:r>
+        <w:rPr>
+          <w:lang w:val="en-ID"/>
+        </w:rPr>
+        <w:t xml:space="preserve">Abibi et al. </w:t>
+      </w:r>
+      <w:r>
+        <w:rPr>
+          <w:lang w:val="en-ID"/>
+        </w:rPr>
+        <w:fldChar w:fldCharType="begin" w:fldLock="1"/>
+      </w:r>
+      <w:r>
+        <w:rPr>
+          <w:lang w:val="en-ID"/>
+        </w:rPr>
+        <w:instrText>ADDIN CSL_CITATION {"citationItems":[{"id":"ITEM-1","itemData":{"DOI":"10.1109/AIIoT58121.2023.10174461","ISBN":"9798350337617","abstract":"In the Use Case Diagram, a Step Performed in Tabulation contains an object's explanation flow. A sequence diagram attempts to depict in detail the interaction of objects in a system, the messages or commands sent, and the implementation time. In other words, the Sequence Diagram, like the Use Case Diagram, encapsulates an object's explanation flow in a graphical diagram. The Step Performed and the Sequence Diagram should be related, yet the Step Performed and Sequence Diagram diverge while creating the Sipranta Application SRS. By adopting Text Pre-processing, this research intends to quantify the value of conformance between the Sequence Diagram and the Step Performed in Use Case Description. This study identifies the Step Performed and the Sequence Diagram using 22 documents, 11 of which are Step Performed and 11 of which are Sequence Diagrams. In addition, the Text Analysis process produces two documents with the highest conformity: d1 with d12 of 0.933461. Cohen Cappa Score produces a validation value of 0.29195, which is included in the \"Fair Agreement\"category. While the reliability results from 2 groups of experts, which is 0.8275, so it is included in the \"Substantial agreement\"category. The results differ between the two methods, which is 0.536.","author":[{"dropping-particle":"","family":"Abibi","given":"Muhammad Alfath","non-dropping-particle":"","parse-names":false,"suffix":""},{"dropping-particle":"","family":"Priyadi","given":"Yudi","non-dropping-particle":"","parse-names":false,"suffix":""},{"dropping-particle":"","family":"Dian Martha","given":"Ati Suci","non-dropping-particle":"","parse-names":false,"suffix":""}],"container-title":"2023 IEEE World AI IoT Congress, AIIoT 2023","id":"ITEM-1","issued":{"date-parts":[["2023"]]},"page":"284-290","publisher":"IEEE","title":"Object on Use Case Description: Sequence Diagram Conformance based on Step Performed using Text Pre-Processing on Sipranta Application SRS","type":"article-journal"},"uris":["http://www.mendeley.com/documents/?uuid=c3aaa1fd-999f-4a4c-ba56-77819cb824db"]}],"mendeley":{"formattedCitation":"[5]","plainTextFormattedCitation":"[5]","previouslyFormattedCitation":"[5]"},"properties":{"noteIndex":0},"schema":"https://github.com/citation-style-language/schema/raw/master/csl-citation.json"}</w:instrText>
+      </w:r>
+      <w:r>
+        <w:rPr>
+          <w:lang w:val="en-ID"/>
+        </w:rPr>
+        <w:fldChar w:fldCharType="separate"/>
+      </w:r>
+      <w:r>
+        <w:rPr>
+          <w:noProof/>
+          <w:lang w:val="en-ID"/>
+        </w:rPr>
+        <w:t>[5]</w:t>
+      </w:r>
+      <w:r>
+        <w:rPr>
+          <w:lang w:val="en-ID"/>
+        </w:rPr>
+        <w:fldChar w:fldCharType="end"/>
+      </w:r>
+      <w:r>
+        <w:rPr>
+          <w:lang w:val="en-ID"/>
+        </w:rPr>
+        <w:t xml:space="preserve"> menerapkan pendekatan serupa pada Sipranta Application SRS. Dataset berupa sebelas Step Performed dan sebelas Sequence Diagram. Setelah ekstraksi, setiap dokumen menjalani case folding, tokenization, stemming, stop-word removal, dan pembobotan TF-IDF, kemudian cosine similarity digunakan sebagai conformity measurement. Penelitian menetapkan nilai di atas 0,8 sebagai threshold kesesuaian dan menggunakan Cohen's Kappa serta Gwet's AC1 untuk vali</w:t>
+      </w:r>
+      <w:r>
+        <w:rPr>
+          <w:lang w:val="en-ID"/>
+        </w:rPr>
+        <w:t xml:space="preserve">dation dan reliability </w:t>
+      </w:r>
+      <w:r>
+        <w:rPr>
+          <w:lang w:val="en-ID"/>
+        </w:rPr>
+        <w:fldChar w:fldCharType="begin" w:fldLock="1"/>
+      </w:r>
+      <w:r>
+        <w:rPr>
+          <w:lang w:val="en-ID"/>
+        </w:rPr>
+        <w:instrText>ADDIN CSL_CITATION {"citationItems":[{"id":"ITEM-1","itemData":{"DOI":"10.1109/AIIoT58121.2023.10174461","ISBN":"9798350337617","abstract":"In the Use Case Diagram, a Step Performed in Tabulation contains an object's explanation flow. A sequence diagram attempts to depict in detail the interaction of objects in a system, the messages or commands sent, and the implementation time. In other words, the Sequence Diagram, like the Use Case Diagram, encapsulates an object's explanation flow in a graphical diagram. The Step Performed and the Sequence Diagram should be related, yet the Step Performed and Sequence Diagram diverge while creating the Sipranta Application SRS. By adopting Text Pre-processing, this research intends to quantify the value of conformance between the Sequence Diagram and the Step Performed in Use Case Description. This study identifies the Step Performed and the Sequence Diagram using 22 documents, 11 of which are Step Performed and 11 of which are Sequence Diagrams. In addition, the Text Analysis process produces two documents with the highest conformity: d1 with d12 of 0.933461. Cohen Cappa Score produces a validation value of 0.29195, which is included in the \"Fair Agreement\"category. While the reliability results from 2 groups of experts, which is 0.8275, so it is included in the \"Substantial agreement\"category. The results differ between the two methods, which is 0.536.","author":[{"dropping-particle":"","family":"Abibi","given":"Muhammad Alfath","non-dropping-particle":"","parse-names":false,"suffix":""},{"dropping-particle":"","family":"Priyadi","given":"Yudi","non-dropping-particle":"","parse-names":false,"suffix":""},{"dropping-particle":"","family":"Dian Martha","given":"Ati Suci","non-dropping-particle":"","parse-names":false,"suffix":""}],"container-title":"2023 IEEE World AI IoT Congress, AIIoT 2023","id":"ITEM-1","issued":{"date-parts":[["2023"]]},"page":"284-290","publisher":"IEEE","title":"Object on Use Case Description: Sequence Diagram Conformance based on Step Performed using Text Pre-Processing on Sipranta Application SRS","type":"article-journal"},"uris":["http://www.mendeley.com/documents/?uuid=c3aaa1fd-999f-4a4c-ba56-77819cb824db"]}],"mendeley":{"formattedCitation":"[5]","plainTextFormattedCitation":"[5]","previouslyFormattedCitation":"[5]"},"properties":{"noteIndex":0},"schema":"https://github.com/citation-style-language/schema/raw/master/csl-citation.json"}</w:instrText>
+      </w:r>
+      <w:r>
+        <w:rPr>
+          <w:lang w:val="en-ID"/>
+        </w:rPr>
+        <w:fldChar w:fldCharType="separate"/>
+      </w:r>
+      <w:r>
+        <w:rPr>
+          <w:noProof/>
+          <w:lang w:val="en-ID"/>
+        </w:rPr>
+        <w:t>[5]</w:t>
+      </w:r>
+      <w:r>
+        <w:rPr>
+          <w:lang w:val="en-ID"/>
+        </w:rPr>
+        <w:fldChar w:fldCharType="end"/>
+      </w:r>
+      <w:r>
+        <w:rPr>
+          <w:lang w:val="en-ID"/>
+        </w:rPr>
+        <w:t>.</w:t>
+      </w:r>
+      <w:r>
+        <w:rPr>
+          <w:lang w:val="en-ID"/>
+        </w:rPr>
+        <w:t xml:space="preserve"> </w:t>
+      </w:r>
+      <w:r>
+        <w:rPr>
+          <w:lang w:val="en-ID"/>
+        </w:rPr>
+        <w:t>Penilaian expert mencapai nilai 0,8275, dan penelitian menyarankan perbaikan terhadap pasangan dokumen yang memiliki conformity di bawah threshold dengan mengidentifikasi kembal</w:t>
+      </w:r>
+      <w:r>
+        <w:rPr>
+          <w:lang w:val="en-ID"/>
+        </w:rPr>
+        <w:t xml:space="preserve">i object dari Step Performed </w:t>
+      </w:r>
+      <w:r>
+        <w:rPr>
+          <w:lang w:val="en-ID"/>
+        </w:rPr>
+        <w:fldChar w:fldCharType="begin" w:fldLock="1"/>
+      </w:r>
+      <w:r>
+        <w:rPr>
+          <w:lang w:val="en-ID"/>
+        </w:rPr>
+        <w:instrText>ADDIN CSL_CITATION {"citationItems":[{"id":"ITEM-1","itemData":{"DOI":"10.1109/AIIoT58121.2023.10174461","ISBN":"9798350337617","abstract":"In the Use Case Diagram, a Step Performed in Tabulation contains an object's explanation flow. A sequence diagram attempts to depict in detail the interaction of objects in a system, the messages or commands sent, and the implementation time. In other words, the Sequence Diagram, like the Use Case Diagram, encapsulates an object's explanation flow in a graphical diagram. The Step Performed and the Sequence Diagram should be related, yet the Step Performed and Sequence Diagram diverge while creating the Sipranta Application SRS. By adopting Text Pre-processing, this research intends to quantify the value of conformance between the Sequence Diagram and the Step Performed in Use Case Description. This study identifies the Step Performed and the Sequence Diagram using 22 documents, 11 of which are Step Performed and 11 of which are Sequence Diagrams. In addition, the Text Analysis process produces two documents with the highest conformity: d1 with d12 of 0.933461. Cohen Cappa Score produces a validation value of 0.29195, which is included in the \"Fair Agreement\"category. While the reliability results from 2 groups of experts, which is 0.8275, so it is included in the \"Substantial agreement\"category. The results differ between the two methods, which is 0.536.","author":[{"dropping-particle":"","family":"Abibi","given":"Muhammad Alfath","non-dropping-particle":"","parse-names":false,"suffix":""},{"dropping-particle":"","family":"Priyadi","given":"Yudi","non-dropping-particle":"","parse-names":false,"suffix":""},{"dropping-particle":"","family":"Dian Martha","given":"Ati Suci","non-dropping-particle":"","parse-names":false,"suffix":""}],"container-title":"2023 IEEE World AI IoT Congress, AIIoT 2023","id":"ITEM-1","issued":{"date-parts":[["2023"]]},"page":"284-290","publisher":"IEEE","title":"Object on Use Case Description: Sequence Diagram Conformance based on Step Performed using Text Pre-Processing on Sipranta Application SRS","type":"article-journal"},"uris":["http://www.mendeley.com/documents/?uuid=c3aaa1fd-999f-4a4c-ba56-77819cb824db"]}],"mendeley":{"formattedCitation":"[5]","plainTextFormattedCitation":"[5]","previouslyFormattedCitation":"[5]"},"properties":{"noteIndex":0},"schema":"https://github.com/citation-style-language/schema/raw/master/csl-citation.json"}</w:instrText>
+      </w:r>
+      <w:r>
+        <w:rPr>
+          <w:lang w:val="en-ID"/>
+        </w:rPr>
+        <w:fldChar w:fldCharType="separate"/>
+      </w:r>
+      <w:r>
+        <w:rPr>
+          <w:noProof/>
+          <w:lang w:val="en-ID"/>
+        </w:rPr>
+        <w:t>[5]</w:t>
+      </w:r>
+      <w:r>
+        <w:rPr>
+          <w:lang w:val="en-ID"/>
+        </w:rPr>
+        <w:fldChar w:fldCharType="end"/>
+      </w:r>
+      <w:r>
+        <w:rPr>
+          <w:lang w:val="en-ID"/>
+        </w:rPr>
+        <w:t>.</w:t>
+      </w:r>
+    </w:p>
+    <w:p>
+      <w:pPr>
+        <w:rPr>
+          <w:lang w:val="en-ID"/>
+        </w:rPr>
+      </w:pPr>
+      <w:r>
+        <w:rPr>
+          <w:lang w:val="en-ID"/>
+        </w:rPr>
+        <w:t xml:space="preserve">Syamsir et al. </w:t>
+      </w:r>
+      <w:r>
+        <w:rPr>
+          <w:lang w:val="en-ID"/>
+        </w:rPr>
+        <w:fldChar w:fldCharType="begin" w:fldLock="1"/>
+      </w:r>
+      <w:r>
+        <w:rPr>
+          <w:lang w:val="en-ID"/>
+        </w:rPr>
+        <w:instrText>ADDIN CSL_CITATION {"citationItems":[{"id":"ITEM-1","itemData":{"DOI":"10.1109/ICE3IS59323.2023.10335375","ISBN":"9798350327762","abstract":"Only some applications that are built are successful once the client uses them. This problem occurs because there is an inconsistency between applications built with the client's needs, especially in the Software Requirements Specification (SRS) document as the reference data for software development. These losses can be avoided by implementing consistency in the contents of the SRS document. Therefore, before application development, the SRS document consistency process is crucial to match the client's needs and the developer's understanding of developing software. This study aims to propose recommendations for fixing artifacts based on the lowest value of consistency between Step Performed and Sequence Diagrams through a text-mining approach. The results of the validation and reliability tests using Gwet's AC1 formula through the Python programming language produced a Kappa Score of 0.500000, while through expert questionnaires of 0.159998. Based on the comparison of artifact consistency calculations, recommendations for fixing artifacts were made for the lowest consistency measurement values in the comparison of SP09 (d9) with SD09 (d23), which had a value of 0.840124.","author":[{"dropping-particle":"","family":"Syamsir","given":"Fiyona Anmila","non-dropping-particle":"","parse-names":false,"suffix":""},{"dropping-particle":"","family":"Jatmiko Suwawi","given":"Dawam Dwi","non-dropping-particle":"","parse-names":false,"suffix":""},{"dropping-particle":"","family":"Priyadi","given":"Yudi","non-dropping-particle":"","parse-names":false,"suffix":""}],"container-title":"Proceedings - 2023 3rd International Conference on Electronic and Electrical Engineering and Intelligent System: Responsible Technology for Sustainable Humanity, ICE3IS 2023","id":"ITEM-1","issue":"August","issued":{"date-parts":[["2023"]]},"page":"442-447","publisher":"IEEE","title":"Recommendations for Fixing of Step Performed and Sequence Diagram Based on Text Mining on SRS Digibrary","type":"article-journal"},"uris":["http://www.mendeley.com/documents/?uuid=18b59ea1-c788-4279-9985-8ca5b39e8d42"]}],"mendeley":{"formattedCitation":"[6]","plainTextFormattedCitation":"[6]","previouslyFormattedCitation":"[6]"},"properties":{"noteIndex":0},"schema":"https://github.com/citation-style-language/schema/raw/master/csl-citation.json"}</w:instrText>
+      </w:r>
+      <w:r>
+        <w:rPr>
+          <w:lang w:val="en-ID"/>
+        </w:rPr>
+        <w:fldChar w:fldCharType="separate"/>
+      </w:r>
+      <w:r>
+        <w:rPr>
+          <w:noProof/>
+          <w:lang w:val="en-ID"/>
+        </w:rPr>
+        <w:t>[6]</w:t>
+      </w:r>
+      <w:r>
+        <w:rPr>
+          <w:lang w:val="en-ID"/>
+        </w:rPr>
+        <w:fldChar w:fldCharType="end"/>
+      </w:r>
+      <w:r>
+        <w:rPr>
+          <w:lang w:val="en-ID"/>
+        </w:rPr>
+        <w:t xml:space="preserve"> kemudian mengembangkan penelitian pada SRS Digibrary dengan orientasi bukan hanya menghitung consistency tetapi juga memberikan rekomendasi perbaikan. Digibrary memiliki 14 Step Performed dan 14 Sequence Diagram. Pipeline meliputi requirements elicitation, artifact identification, extraction dan text preprocessing, TF-IDF, cosine similarity, validity/reliability testing menggunakan Gwet's AC1, kemudian fixing artifact berdasarkan pasangan denga</w:t>
+      </w:r>
+      <w:r>
+        <w:rPr>
+          <w:lang w:val="en-ID"/>
+        </w:rPr>
+        <w:t xml:space="preserve">n consistency terendah </w:t>
+      </w:r>
+      <w:r>
+        <w:rPr>
+          <w:lang w:val="en-ID"/>
+        </w:rPr>
+        <w:fldChar w:fldCharType="begin" w:fldLock="1"/>
+      </w:r>
+      <w:r>
+        <w:rPr>
+          <w:lang w:val="en-ID"/>
+        </w:rPr>
+        <w:instrText>ADDIN CSL_CITATION {"citationItems":[{"id":"ITEM-1","itemData":{"DOI":"10.1109/ICE3IS59323.2023.10335375","ISBN":"9798350327762","abstract":"Only some applications that are built are successful once the client uses them. This problem occurs because there is an inconsistency between applications built with the client's needs, especially in the Software Requirements Specification (SRS) document as the reference data for software development. These losses can be avoided by implementing consistency in the contents of the SRS document. Therefore, before application development, the SRS document consistency process is crucial to match the client's needs and the developer's understanding of developing software. This study aims to propose recommendations for fixing artifacts based on the lowest value of consistency between Step Performed and Sequence Diagrams through a text-mining approach. The results of the validation and reliability tests using Gwet's AC1 formula through the Python programming language produced a Kappa Score of 0.500000, while through expert questionnaires of 0.159998. Based on the comparison of artifact consistency calculations, recommendations for fixing artifacts were made for the lowest consistency measurement values in the comparison of SP09 (d9) with SD09 (d23), which had a value of 0.840124.","author":[{"dropping-particle":"","family":"Syamsir","given":"Fiyona Anmila","non-dropping-particle":"","parse-names":false,"suffix":""},{"dropping-particle":"","family":"Jatmiko Suwawi","given":"Dawam Dwi","non-dropping-particle":"","parse-names":false,"suffix":""},{"dropping-particle":"","family":"Priyadi","given":"Yudi","non-dropping-particle":"","parse-names":false,"suffix":""}],"container-title":"Proceedings - 2023 3rd International Conference on Electronic and Electrical Engineering and Intelligent System: Responsible Technology for Sustainable Humanity, ICE3IS 2023","id":"ITEM-1","issue":"August","issued":{"date-parts":[["2023"]]},"page":"442-447","publisher":"IEEE","title":"Recommendations for Fixing of Step Performed and Sequence Diagram Based on Text Mining on SRS Digibrary","type":"article-journal"},"uris":["http://www.mendeley.com/documents/?uuid=18b59ea1-c788-4279-9985-8ca5b39e8d42"]}],"mendeley":{"formattedCitation":"[6]","plainTextFormattedCitation":"[6]","previouslyFormattedCitation":"[6]"},"properties":{"noteIndex":0},"schema":"https://github.com/citation-style-language/schema/raw/master/csl-citation.json"}</w:instrText>
+      </w:r>
+      <w:r>
+        <w:rPr>
+          <w:lang w:val="en-ID"/>
+        </w:rPr>
+        <w:fldChar w:fldCharType="separate"/>
+      </w:r>
+      <w:r>
+        <w:rPr>
+          <w:noProof/>
+          <w:lang w:val="en-ID"/>
+        </w:rPr>
+        <w:t>[6]</w:t>
+      </w:r>
+      <w:r>
+        <w:rPr>
+          <w:lang w:val="en-ID"/>
+        </w:rPr>
+        <w:fldChar w:fldCharType="end"/>
+      </w:r>
+      <w:r>
+        <w:rPr>
+          <w:lang w:val="en-ID"/>
+        </w:rPr>
+        <w:t xml:space="preserve">. </w:t>
+      </w:r>
+      <w:r>
+        <w:rPr>
+          <w:lang w:val="en-ID"/>
+        </w:rPr>
+        <w:t>Pada penelitian tersebut, rekomendasi perbaikan diberikan pada SP09 dan SD09 yang memiliki nilai consistency terendah sebesar 0,840124 dengan melakukan perubahan placement object berdasarkan ha</w:t>
+      </w:r>
+      <w:r>
+        <w:rPr>
+          <w:lang w:val="en-ID"/>
+        </w:rPr>
+        <w:t xml:space="preserve">sil text preprocessing </w:t>
+      </w:r>
+      <w:r>
+        <w:rPr>
+          <w:lang w:val="en-ID"/>
+        </w:rPr>
+        <w:fldChar w:fldCharType="begin" w:fldLock="1"/>
+      </w:r>
+      <w:r>
+        <w:rPr>
+          <w:lang w:val="en-ID"/>
+        </w:rPr>
+        <w:instrText>ADDIN CSL_CITATION {"citationItems":[{"id":"ITEM-1","itemData":{"DOI":"10.1109/ICE3IS59323.2023.10335375","ISBN":"9798350327762","abstract":"Only some applications that are built are successful once the client uses them. This problem occurs because there is an inconsistency between applications built with the client's needs, especially in the Software Requirements Specification (SRS) document as the reference data for software development. These losses can be avoided by implementing consistency in the contents of the SRS document. Therefore, before application development, the SRS document consistency process is crucial to match the client's needs and the developer's understanding of developing software. This study aims to propose recommendations for fixing artifacts based on the lowest value of consistency between Step Performed and Sequence Diagrams through a text-mining approach. The results of the validation and reliability tests using Gwet's AC1 formula through the Python programming language produced a Kappa Score of 0.500000, while through expert questionnaires of 0.159998. Based on the comparison of artifact consistency calculations, recommendations for fixing artifacts were made for the lowest consistency measurement values in the comparison of SP09 (d9) with SD09 (d23), which had a value of 0.840124.","author":[{"dropping-particle":"","family":"Syamsir","given":"Fiyona Anmila","non-dropping-particle":"","parse-names":false,"suffix":""},{"dropping-particle":"","family":"Jatmiko Suwawi","given":"Dawam Dwi","non-dropping-particle":"","parse-names":false,"suffix":""},{"dropping-particle":"","family":"Priyadi","given":"Yudi","non-dropping-particle":"","parse-names":false,"suffix":""}],"container-title":"Proceedings - 2023 3rd International Conference on Electronic and Electrical Engineering and Intelligent System: Responsible Technology for Sustainable Humanity, ICE3IS 2023","id":"ITEM-1","issue":"August","issued":{"date-parts":[["2023"]]},"page":"442-447","publisher":"IEEE","title":"Recommendations for Fixing of Step Performed and Sequence Diagram Based on Text Mining on SRS Digibrary","type":"article-journal"},"uris":["http://www.mendeley.com/documents/?uuid=18b59ea1-c788-4279-9985-8ca5b39e8d42"]}],"mendeley":{"formattedCitation":"[6]","plainTextFormattedCitation":"[6]","previouslyFormattedCitation":"[6]"},"properties":{"noteIndex":0},"schema":"https://github.com/citation-style-language/schema/raw/master/csl-citation.json"}</w:instrText>
+      </w:r>
+      <w:r>
+        <w:rPr>
+          <w:lang w:val="en-ID"/>
+        </w:rPr>
+        <w:fldChar w:fldCharType="separate"/>
+      </w:r>
+      <w:r>
+        <w:rPr>
+          <w:noProof/>
+          <w:lang w:val="en-ID"/>
+        </w:rPr>
+        <w:t>[6]</w:t>
+      </w:r>
+      <w:r>
+        <w:rPr>
+          <w:lang w:val="en-ID"/>
+        </w:rPr>
+        <w:fldChar w:fldCharType="end"/>
+      </w:r>
+      <w:r>
+        <w:rPr>
+          <w:lang w:val="en-ID"/>
+        </w:rPr>
+        <w:t xml:space="preserve">. </w:t>
+      </w:r>
+      <w:r>
+        <w:rPr>
+          <w:lang w:val="en-ID"/>
+        </w:rPr>
+        <w:t>Pada penelitian tersebut, rekomendasi perbaikan diberikan pada SP09 dan SD09 yang memiliki nilai consistency terendah sebesar 0,840124 dengan melakukan perubahan placement object berdasarkan ha</w:t>
+      </w:r>
+      <w:r>
+        <w:rPr>
+          <w:lang w:val="en-ID"/>
+        </w:rPr>
+        <w:t>sil text preprocessing [6].</w:t>
+      </w:r>
+    </w:p>
+    <w:p>
+      <w:pPr>
+        <w:rPr>
+          <w:lang w:val="en-ID"/>
+        </w:rPr>
+      </w:pPr>
+      <w:r>
+        <w:rPr>
+          <w:lang w:val="en-ID"/>
+        </w:rPr>
+        <w:t xml:space="preserve">Rachmanda </w:t>
+      </w:r>
+      <w:r>
+        <w:rPr>
+          <w:lang w:val="en-ID"/>
+        </w:rPr>
+        <w:t xml:space="preserve">et al. </w:t>
+      </w:r>
+      <w:r>
+        <w:rPr>
+          <w:lang w:val="en-ID"/>
+        </w:rPr>
+        <w:fldChar w:fldCharType="begin" w:fldLock="1"/>
+      </w:r>
+      <w:r>
+        <w:rPr>
+          <w:lang w:val="en-ID"/>
+        </w:rPr>
+        <w:instrText>ADDIN CSL_CITATION {"citationItems":[{"id":"ITEM-1","itemData":{"DOI":"10.1109/ICE3IS66769.2025.11280707","ISBN":"9798331585235","abstract":"Inconsistencies in the creation of Unified Modeling Language (UML) artifacts occur due to differences in interpretation by each individual. These differences may arise because each individual has a different understanding of the causes and effects in an environment/system, influenced by experience, learning process, insight, intuition, and assumptions. In the process of identifying variables in a case study called IdVar4VL, there is an inconsistency between the artifacts, making this case an example of implementation in identifying UML artifacts for conformity. Our research aims to identify objects derived from all Use Case Scenario tabulations, and then use the resulting objects for the Sequence Diagram. This research has implemented stages to identify objects that produce datasets in the form of Use Case Diagrams consisting of 3 actors. The Use Case Scenario tabulation produces 10 Step-Perform documents, namely d2 to d11. After all stages are completed, this research produces an alternative dataset for UCD in the form of OCR text document, forming object tabulations based on 10 Step-Performs from 10 UCS and making improvement recommendations for Step-Performs in UCS artifacts. Additionally, the validity and reliability of the generated object tabulation against the Step-Performed score is 0.23, calculated using Gwet's AC1 formula. The resulting scores fall into the 'Fair Agreement' category based on Gwet's AC1 index, making the generated object tabulation a reference for forming a complete Sequence Diagram.","author":[{"dropping-particle":"","family":"Rachmanda","given":"Moch Alif","non-dropping-particle":"","parse-names":false,"suffix":""},{"dropping-particle":"","family":"Priyadi","given":"Yudi","non-dropping-particle":"","parse-names":false,"suffix":""},{"dropping-particle":"","family":"Fathoni","given":"M. Faris","non-dropping-particle":"","parse-names":false,"suffix":""}],"container-title":"ICE3IS 2025 - Conference Proceedings: 5th International Conference on Electronic and Electrical Engineering and Intelligent System","id":"ITEM-1","issue":"August","issued":{"date-parts":[["2025"]]},"page":"125-130","publisher":"IEEE","title":"Object Identification for Sequence Diagram based on Use Case Scenario using Text Semantic: Case Study of IdVar4CL Artefact","type":"article-journal"},"uris":["http://www.mendeley.com/documents/?uuid=8c180c32-8471-4015-981b-fcb3d272050b"]}],"mendeley":{"formattedCitation":"[7]","plainTextFormattedCitation":"[7]","previouslyFormattedCitation":"[7]"},"properties":{"noteIndex":0},"schema":"https://github.com/citation-style-language/schema/raw/master/csl-citation.json"}</w:instrText>
+      </w:r>
+      <w:r>
+        <w:rPr>
+          <w:lang w:val="en-ID"/>
+        </w:rPr>
+        <w:fldChar w:fldCharType="separate"/>
+      </w:r>
+      <w:r>
+        <w:rPr>
+          <w:noProof/>
+          <w:lang w:val="en-ID"/>
+        </w:rPr>
+        <w:t>[7]</w:t>
+      </w:r>
+      <w:r>
+        <w:rPr>
+          <w:lang w:val="en-ID"/>
+        </w:rPr>
+        <w:fldChar w:fldCharType="end"/>
+      </w:r>
+      <w:r>
+        <w:rPr>
+          <w:lang w:val="en-ID"/>
+        </w:rPr>
+        <w:t xml:space="preserve"> menggeser pendekatan dari cosine similarity murni menuju semantic processing pada penelitian Object Identification for Sequence Diagram based on Use Case Scenario using Text Semantic. Dataset IdVar4CL terdiri atas Use Case Diagram dengan tiga </w:t>
+      </w:r>
+      <w:r>
+        <w:rPr>
+          <w:lang w:val="en-ID"/>
+        </w:rPr>
+        <w:lastRenderedPageBreak/>
+        <w:t>actor dan sepuluh Use Case Scenario. Use Case Diagram terlebih dahulu diubah ke teks melalui OCR, sedangkan setiap Step-Perform pada Use Case Scenario dianalisis dengan struktur Subject-Verb-Object. Pipeline berikutnya mencakup extraction, text preprocessing, text semantic processing, dan pembentukan object tabulation yang dapat digunakan sebagai referensi dalam</w:t>
+      </w:r>
+      <w:r>
+        <w:rPr>
+          <w:lang w:val="en-ID"/>
+        </w:rPr>
+        <w:t xml:space="preserve"> pembentukan Sequence Diagram </w:t>
+      </w:r>
+      <w:r>
+        <w:rPr>
+          <w:lang w:val="en-ID"/>
+        </w:rPr>
+        <w:fldChar w:fldCharType="begin" w:fldLock="1"/>
+      </w:r>
+      <w:r>
+        <w:rPr>
+          <w:lang w:val="en-ID"/>
+        </w:rPr>
+        <w:instrText>ADDIN CSL_CITATION {"citationItems":[{"id":"ITEM-1","itemData":{"DOI":"10.1109/ICE3IS66769.2025.11280707","ISBN":"9798331585235","abstract":"Inconsistencies in the creation of Unified Modeling Language (UML) artifacts occur due to differences in interpretation by each individual. These differences may arise because each individual has a different understanding of the causes and effects in an environment/system, influenced by experience, learning process, insight, intuition, and assumptions. In the process of identifying variables in a case study called IdVar4VL, there is an inconsistency between the artifacts, making this case an example of implementation in identifying UML artifacts for conformity. Our research aims to identify objects derived from all Use Case Scenario tabulations, and then use the resulting objects for the Sequence Diagram. This research has implemented stages to identify objects that produce datasets in the form of Use Case Diagrams consisting of 3 actors. The Use Case Scenario tabulation produces 10 Step-Perform documents, namely d2 to d11. After all stages are completed, this research produces an alternative dataset for UCD in the form of OCR text document, forming object tabulations based on 10 Step-Performs from 10 UCS and making improvement recommendations for Step-Performs in UCS artifacts. Additionally, the validity and reliability of the generated object tabulation against the Step-Performed score is 0.23, calculated using Gwet's AC1 formula. The resulting scores fall into the 'Fair Agreement' category based on Gwet's AC1 index, making the generated object tabulation a reference for forming a complete Sequence Diagram.","author":[{"dropping-particle":"","family":"Rachmanda","given":"Moch Alif","non-dropping-particle":"","parse-names":false,"suffix":""},{"dropping-particle":"","family":"Priyadi","given":"Yudi","non-dropping-particle":"","parse-names":false,"suffix":""},{"dropping-particle":"","family":"Fathoni","given":"M. Faris","non-dropping-particle":"","parse-names":false,"suffix":""}],"container-title":"ICE3IS 2025 - Conference Proceedings: 5th International Conference on Electronic and Electrical Engineering and Intelligent System","id":"ITEM-1","issue":"August","issued":{"date-parts":[["2025"]]},"page":"125-130","publisher":"IEEE","title":"Object Identification for Sequence Diagram based on Use Case Scenario using Text Semantic: Case Study of IdVar4CL Artefact","type":"article-journal"},"uris":["http://www.mendeley.com/documents/?uuid=8c180c32-8471-4015-981b-fcb3d272050b"]}],"mendeley":{"formattedCitation":"[7]","plainTextFormattedCitation":"[7]","previouslyFormattedCitation":"[7]"},"properties":{"noteIndex":0},"schema":"https://github.com/citation-style-language/schema/raw/master/csl-citation.json"}</w:instrText>
+      </w:r>
+      <w:r>
+        <w:rPr>
+          <w:lang w:val="en-ID"/>
+        </w:rPr>
+        <w:fldChar w:fldCharType="separate"/>
+      </w:r>
+      <w:r>
+        <w:rPr>
+          <w:noProof/>
+          <w:lang w:val="en-ID"/>
+        </w:rPr>
+        <w:t>[7]</w:t>
+      </w:r>
+      <w:r>
+        <w:rPr>
+          <w:lang w:val="en-ID"/>
+        </w:rPr>
+        <w:fldChar w:fldCharType="end"/>
+      </w:r>
+      <w:r>
+        <w:rPr>
+          <w:lang w:val="en-ID"/>
+        </w:rPr>
+        <w:t xml:space="preserve">. </w:t>
+      </w:r>
+      <w:r>
+        <w:rPr>
+          <w:lang w:val="en-ID"/>
+        </w:rPr>
+        <w:t>Pendekatan tersebut lebih dekat dengan semantic mapping yang dibutuhkan penelitian ini, tetapi hasil validation dan reliability terhadap object tabulation hanya memperoleh nilai 0,23 atau Fair Agreement dan output masih berupa kandidat object, bukan hasil consistency checking pada k</w:t>
+      </w:r>
+      <w:r>
+        <w:rPr>
+          <w:lang w:val="en-ID"/>
+        </w:rPr>
+        <w:t xml:space="preserve">eseluruhan sequence behavior </w:t>
+      </w:r>
+      <w:r>
+        <w:rPr>
+          <w:lang w:val="en-ID"/>
+        </w:rPr>
+        <w:fldChar w:fldCharType="begin" w:fldLock="1"/>
+      </w:r>
+      <w:r>
+        <w:rPr>
+          <w:lang w:val="en-ID"/>
+        </w:rPr>
+        <w:instrText>ADDIN CSL_CITATION {"citationItems":[{"id":"ITEM-1","itemData":{"DOI":"10.1109/ICE3IS66769.2025.11280707","ISBN":"9798331585235","abstract":"Inconsistencies in the creation of Unified Modeling Language (UML) artifacts occur due to differences in interpretation by each individual. These differences may arise because each individual has a different understanding of the causes and effects in an environment/system, influenced by experience, learning process, insight, intuition, and assumptions. In the process of identifying variables in a case study called IdVar4VL, there is an inconsistency between the artifacts, making this case an example of implementation in identifying UML artifacts for conformity. Our research aims to identify objects derived from all Use Case Scenario tabulations, and then use the resulting objects for the Sequence Diagram. This research has implemented stages to identify objects that produce datasets in the form of Use Case Diagrams consisting of 3 actors. The Use Case Scenario tabulation produces 10 Step-Perform documents, namely d2 to d11. After all stages are completed, this research produces an alternative dataset for UCD in the form of OCR text document, forming object tabulations based on 10 Step-Performs from 10 UCS and making improvement recommendations for Step-Performs in UCS artifacts. Additionally, the validity and reliability of the generated object tabulation against the Step-Performed score is 0.23, calculated using Gwet's AC1 formula. The resulting scores fall into the 'Fair Agreement' category based on Gwet's AC1 index, making the generated object tabulation a reference for forming a complete Sequence Diagram.","author":[{"dropping-particle":"","family":"Rachmanda","given":"Moch Alif","non-dropping-particle":"","parse-names":false,"suffix":""},{"dropping-particle":"","family":"Priyadi","given":"Yudi","non-dropping-particle":"","parse-names":false,"suffix":""},{"dropping-particle":"","family":"Fathoni","given":"M. Faris","non-dropping-particle":"","parse-names":false,"suffix":""}],"container-title":"ICE3IS 2025 - Conference Proceedings: 5th International Conference on Electronic and Electrical Engineering and Intelligent System","id":"ITEM-1","issue":"August","issued":{"date-parts":[["2025"]]},"page":"125-130","publisher":"IEEE","title":"Object Identification for Sequence Diagram based on Use Case Scenario using Text Semantic: Case Study of IdVar4CL Artefact","type":"article-journal"},"uris":["http://www.mendeley.com/documents/?uuid=8c180c32-8471-4015-981b-fcb3d272050b"]}],"mendeley":{"formattedCitation":"[7]","plainTextFormattedCitation":"[7]","previouslyFormattedCitation":"[7]"},"properties":{"noteIndex":0},"schema":"https://github.com/citation-style-language/schema/raw/master/csl-citation.json"}</w:instrText>
+      </w:r>
+      <w:r>
+        <w:rPr>
+          <w:lang w:val="en-ID"/>
+        </w:rPr>
+        <w:fldChar w:fldCharType="separate"/>
+      </w:r>
+      <w:r>
+        <w:rPr>
+          <w:noProof/>
+          <w:lang w:val="en-ID"/>
+        </w:rPr>
+        <w:t>[7]</w:t>
+      </w:r>
+      <w:r>
+        <w:rPr>
+          <w:lang w:val="en-ID"/>
+        </w:rPr>
+        <w:fldChar w:fldCharType="end"/>
+      </w:r>
+      <w:r>
+        <w:rPr>
+          <w:lang w:val="en-ID"/>
+        </w:rPr>
+        <w:t>.</w:t>
+      </w:r>
+    </w:p>
+    <w:p>
+      <w:pPr>
+        <w:rPr>
+          <w:lang w:val="en-ID"/>
+        </w:rPr>
+      </w:pPr>
+      <w:r>
+        <w:rPr>
+          <w:lang w:val="en-ID"/>
+        </w:rPr>
+        <w:t xml:space="preserve">Alyami </w:t>
+      </w:r>
+      <w:r>
+        <w:rPr>
+          <w:lang w:val="en-ID"/>
+        </w:rPr>
+        <w:t xml:space="preserve">et al. </w:t>
+      </w:r>
+      <w:r>
+        <w:rPr>
+          <w:lang w:val="en-ID"/>
+        </w:rPr>
+        <w:fldChar w:fldCharType="begin" w:fldLock="1"/>
+      </w:r>
+      <w:r>
+        <w:rPr>
+          <w:lang w:val="en-ID"/>
+        </w:rPr>
+        <w:instrText>ADDIN CSL_CITATION {"citationItems":[{"id":"ITEM-1","itemData":{"DOI":"10.7717/PEERJ-CS.1444","ISSN":"23765992","abstract":"System design is an essential subject taught in information systems and has become a core course in its curriculum. Unified modelling language (UML) has been broadly adopted, and it is common to support the system design process using different diagrams. Each diagram serves a purpose by focusing on a specific part of a particular system. Design consistency ensures a seamless process, as the diagrams are generally interrelated. However, creating a well-designed system takes a lot of work, especially for university students with work experience. To overcome this challenge, aligning the concepts across diagrams is essential, which can help achieve better consistency and management of the design system, especially in an educational setting. This article is an extension of our previous work, as we have discussed a simple scenario of Automated teller machines to demonstrate the alignment concepts between UML diagrams. From a more technical perspective, the current contribution provides a Java program that aligns concepts by converting text-based use cases to text-based sequence diagrams. Then, the text is transformed in PlantUML to generate its graphical representation. The developed alignment tool is expected to contribute to helping students and instructors during the system design phases to be more consistent and practical. Limitations and future work are presented.","author":[{"dropping-particle":"","family":"Alyami","given":"Abdulrahman","non-dropping-particle":"","parse-names":false,"suffix":""},{"dropping-particle":"","family":"Pileggi","given":"Salvatore Flavio","non-dropping-particle":"","parse-names":false,"suffix":""},{"dropping-particle":"","family":"Sohaib","given":"Osama","non-dropping-particle":"","parse-names":false,"suffix":""},{"dropping-particle":"","family":"Hawryszkiewycz","given":"Igor","non-dropping-particle":"","parse-names":false,"suffix":""}],"container-title":"PeerJ Computer Science","id":"ITEM-1","issued":{"date-parts":[["2023"]]},"page":"1-26","title":"Seamless transformation from use case to sequence diagrams","type":"article-journal","volume":"9"},"uris":["http://www.mendeley.com/documents/?uuid=49563a86-dbdb-4be9-85ea-60c8f97000b7"]}],"mendeley":{"formattedCitation":"[8]","plainTextFormattedCitation":"[8]","previouslyFormattedCitation":"[8]"},"properties":{"noteIndex":0},"schema":"https://github.com/citation-style-language/schema/raw/master/csl-citation.json"}</w:instrText>
+      </w:r>
+      <w:r>
+        <w:rPr>
+          <w:lang w:val="en-ID"/>
+        </w:rPr>
+        <w:fldChar w:fldCharType="separate"/>
+      </w:r>
+      <w:r>
+        <w:rPr>
+          <w:noProof/>
+          <w:lang w:val="en-ID"/>
+        </w:rPr>
+        <w:t>[8]</w:t>
+      </w:r>
+      <w:r>
+        <w:rPr>
+          <w:lang w:val="en-ID"/>
+        </w:rPr>
+        <w:fldChar w:fldCharType="end"/>
+      </w:r>
+      <w:r>
+        <w:rPr>
+          <w:lang w:val="en-ID"/>
+        </w:rPr>
+        <w:t xml:space="preserve"> </w:t>
+      </w:r>
+      <w:r>
+        <w:rPr>
+          <w:lang w:val="en-ID"/>
+        </w:rPr>
+        <w:t>mengambil perspektif yang berbeda melalui Seamless Transformation from Use Case to Sequence Diagrams. Penelitian tersebut mengembangkan Java program untuk mengubah text-based use case menjadi text-based sequence diagram dan menggunakan PlantUML untuk membangun representasi grafis. Java, Eclipse, dan PlantUML menjadi tiga komponen ut</w:t>
+      </w:r>
+      <w:r>
+        <w:rPr>
+          <w:lang w:val="en-ID"/>
+        </w:rPr>
+        <w:t xml:space="preserve">ama dari tool tersebut </w:t>
+      </w:r>
+      <w:r>
+        <w:rPr>
+          <w:lang w:val="en-ID"/>
+        </w:rPr>
+        <w:fldChar w:fldCharType="begin" w:fldLock="1"/>
+      </w:r>
+      <w:r>
+        <w:rPr>
+          <w:lang w:val="en-ID"/>
+        </w:rPr>
+        <w:instrText>ADDIN CSL_CITATION {"citationItems":[{"id":"ITEM-1","itemData":{"DOI":"10.7717/PEERJ-CS.1444","ISSN":"23765992","abstract":"System design is an essential subject taught in information systems and has become a core course in its curriculum. Unified modelling language (UML) has been broadly adopted, and it is common to support the system design process using different diagrams. Each diagram serves a purpose by focusing on a specific part of a particular system. Design consistency ensures a seamless process, as the diagrams are generally interrelated. However, creating a well-designed system takes a lot of work, especially for university students with work experience. To overcome this challenge, aligning the concepts across diagrams is essential, which can help achieve better consistency and management of the design system, especially in an educational setting. This article is an extension of our previous work, as we have discussed a simple scenario of Automated teller machines to demonstrate the alignment concepts between UML diagrams. From a more technical perspective, the current contribution provides a Java program that aligns concepts by converting text-based use cases to text-based sequence diagrams. Then, the text is transformed in PlantUML to generate its graphical representation. The developed alignment tool is expected to contribute to helping students and instructors during the system design phases to be more consistent and practical. Limitations and future work are presented.","author":[{"dropping-particle":"","family":"Alyami","given":"Abdulrahman","non-dropping-particle":"","parse-names":false,"suffix":""},{"dropping-particle":"","family":"Pileggi","given":"Salvatore Flavio","non-dropping-particle":"","parse-names":false,"suffix":""},{"dropping-particle":"","family":"Sohaib","given":"Osama","non-dropping-particle":"","parse-names":false,"suffix":""},{"dropping-particle":"","family":"Hawryszkiewycz","given":"Igor","non-dropping-particle":"","parse-names":false,"suffix":""}],"container-title":"PeerJ Computer Science","id":"ITEM-1","issued":{"date-parts":[["2023"]]},"page":"1-26","title":"Seamless transformation from use case to sequence diagrams","type":"article-journal","volume":"9"},"uris":["http://www.mendeley.com/documents/?uuid=49563a86-dbdb-4be9-85ea-60c8f97000b7"]}],"mendeley":{"formattedCitation":"[8]","plainTextFormattedCitation":"[8]","previouslyFormattedCitation":"[8]"},"properties":{"noteIndex":0},"schema":"https://github.com/citation-style-language/schema/raw/master/csl-citation.json"}</w:instrText>
+      </w:r>
+      <w:r>
+        <w:rPr>
+          <w:lang w:val="en-ID"/>
+        </w:rPr>
+        <w:fldChar w:fldCharType="separate"/>
+      </w:r>
+      <w:r>
+        <w:rPr>
+          <w:noProof/>
+          <w:lang w:val="en-ID"/>
+        </w:rPr>
+        <w:t>[8]</w:t>
+      </w:r>
+      <w:r>
+        <w:rPr>
+          <w:lang w:val="en-ID"/>
+        </w:rPr>
+        <w:fldChar w:fldCharType="end"/>
+      </w:r>
+      <w:r>
+        <w:rPr>
+          <w:lang w:val="en-ID"/>
+        </w:rPr>
+        <w:t xml:space="preserve">. </w:t>
+      </w:r>
+      <w:r>
+        <w:rPr>
+          <w:lang w:val="en-ID"/>
+        </w:rPr>
+        <w:t>Pendekatan transformation mengandalkan alignment terhadap concept yang sama pada kedua diagram, seperti actors, actions, dan messages. Dengan text-to-text transformation, perubahan model menjadi lebih mudah dikelola dan dapat diotomatisasi dibandingkan transf</w:t>
+      </w:r>
+      <w:r>
+        <w:rPr>
+          <w:lang w:val="en-ID"/>
+        </w:rPr>
+        <w:t xml:space="preserve">ormasi melalui format grafis </w:t>
+      </w:r>
+      <w:r>
+        <w:rPr>
+          <w:lang w:val="en-ID"/>
+        </w:rPr>
+        <w:fldChar w:fldCharType="begin" w:fldLock="1"/>
+      </w:r>
+      <w:r>
+        <w:rPr>
+          <w:lang w:val="en-ID"/>
+        </w:rPr>
+        <w:instrText>ADDIN CSL_CITATION {"citationItems":[{"id":"ITEM-1","itemData":{"DOI":"10.7717/PEERJ-CS.1444","ISSN":"23765992","abstract":"System design is an essential subject taught in information systems and has become a core course in its curriculum. Unified modelling language (UML) has been broadly adopted, and it is common to support the system design process using different diagrams. Each diagram serves a purpose by focusing on a specific part of a particular system. Design consistency ensures a seamless process, as the diagrams are generally interrelated. However, creating a well-designed system takes a lot of work, especially for university students with work experience. To overcome this challenge, aligning the concepts across diagrams is essential, which can help achieve better consistency and management of the design system, especially in an educational setting. This article is an extension of our previous work, as we have discussed a simple scenario of Automated teller machines to demonstrate the alignment concepts between UML diagrams. From a more technical perspective, the current contribution provides a Java program that aligns concepts by converting text-based use cases to text-based sequence diagrams. Then, the text is transformed in PlantUML to generate its graphical representation. The developed alignment tool is expected to contribute to helping students and instructors during the system design phases to be more consistent and practical. Limitations and future work are presented.","author":[{"dropping-particle":"","family":"Alyami","given":"Abdulrahman","non-dropping-particle":"","parse-names":false,"suffix":""},{"dropping-particle":"","family":"Pileggi","given":"Salvatore Flavio","non-dropping-particle":"","parse-names":false,"suffix":""},{"dropping-particle":"","family":"Sohaib","given":"Osama","non-dropping-particle":"","parse-names":false,"suffix":""},{"dropping-particle":"","family":"Hawryszkiewycz","given":"Igor","non-dropping-particle":"","parse-names":false,"suffix":""}],"container-title":"PeerJ Computer Science","id":"ITEM-1","issued":{"date-parts":[["2023"]]},"page":"1-26","title":"Seamless transformation from use case to sequence diagrams","type":"article-journal","volume":"9"},"uris":["http://www.mendeley.com/documents/?uuid=49563a86-dbdb-4be9-85ea-60c8f97000b7"]}],"mendeley":{"formattedCitation":"[8]","plainTextFormattedCitation":"[8]","previouslyFormattedCitation":"[8]"},"properties":{"noteIndex":0},"schema":"https://github.com/citation-style-language/schema/raw/master/csl-citation.json"}</w:instrText>
+      </w:r>
+      <w:r>
+        <w:rPr>
+          <w:lang w:val="en-ID"/>
+        </w:rPr>
+        <w:fldChar w:fldCharType="separate"/>
+      </w:r>
+      <w:r>
+        <w:rPr>
+          <w:noProof/>
+          <w:lang w:val="en-ID"/>
+        </w:rPr>
+        <w:t>[8]</w:t>
+      </w:r>
+      <w:r>
+        <w:rPr>
+          <w:lang w:val="en-ID"/>
+        </w:rPr>
+        <w:fldChar w:fldCharType="end"/>
+      </w:r>
+      <w:r>
+        <w:rPr>
+          <w:lang w:val="en-ID"/>
+        </w:rPr>
+        <w:t>.</w:t>
+      </w:r>
+    </w:p>
+    <w:p>
+      <w:pPr>
+        <w:rPr>
+          <w:lang w:val="en-ID"/>
+        </w:rPr>
+      </w:pPr>
+      <w:r>
+        <w:rPr>
+          <w:lang w:val="en-ID"/>
+        </w:rPr>
+        <w:t xml:space="preserve">Meskipun relevan terhadap traceability antara use case dan sequence diagram, Alyami </w:t>
+      </w:r>
+      <w:r>
+        <w:rPr>
+          <w:lang w:val="en-ID"/>
+        </w:rPr>
+        <w:t>et al</w:t>
+      </w:r>
+      <w:r>
+        <w:rPr>
+          <w:lang w:val="en-ID"/>
+        </w:rPr>
+        <w:t>. tidak berfokus pada evaluasi sequence diagram independen yang mungkin telah mengandung kesalahan terhadap specification aslinya. Penulis juga menyatakan bahwa pendekatannya baru mendukung primary and essential features dari use case dan sequence diagram, serta input harus ditulis mengikuti format</w:t>
+      </w:r>
+      <w:r>
+        <w:rPr>
+          <w:lang w:val="en-ID"/>
+        </w:rPr>
+        <w:t xml:space="preserve"> yang telah ditentukan </w:t>
+      </w:r>
+      <w:r>
+        <w:rPr>
+          <w:lang w:val="en-ID"/>
+        </w:rPr>
+        <w:fldChar w:fldCharType="begin" w:fldLock="1"/>
+      </w:r>
+      <w:r>
+        <w:rPr>
+          <w:lang w:val="en-ID"/>
+        </w:rPr>
+        <w:instrText>ADDIN CSL_CITATION {"citationItems":[{"id":"ITEM-1","itemData":{"DOI":"10.7717/PEERJ-CS.1444","ISSN":"23765992","abstract":"System design is an essential subject taught in information systems and has become a core course in its curriculum. Unified modelling language (UML) has been broadly adopted, and it is common to support the system design process using different diagrams. Each diagram serves a purpose by focusing on a specific part of a particular system. Design consistency ensures a seamless process, as the diagrams are generally interrelated. However, creating a well-designed system takes a lot of work, especially for university students with work experience. To overcome this challenge, aligning the concepts across diagrams is essential, which can help achieve better consistency and management of the design system, especially in an educational setting. This article is an extension of our previous work, as we have discussed a simple scenario of Automated teller machines to demonstrate the alignment concepts between UML diagrams. From a more technical perspective, the current contribution provides a Java program that aligns concepts by converting text-based use cases to text-based sequence diagrams. Then, the text is transformed in PlantUML to generate its graphical representation. The developed alignment tool is expected to contribute to helping students and instructors during the system design phases to be more consistent and practical. Limitations and future work are presented.","author":[{"dropping-particle":"","family":"Alyami","given":"Abdulrahman","non-dropping-particle":"","parse-names":false,"suffix":""},{"dropping-particle":"","family":"Pileggi","given":"Salvatore Flavio","non-dropping-particle":"","parse-names":false,"suffix":""},{"dropping-particle":"","family":"Sohaib","given":"Osama","non-dropping-particle":"","parse-names":false,"suffix":""},{"dropping-particle":"","family":"Hawryszkiewycz","given":"Igor","non-dropping-particle":"","parse-names":false,"suffix":""}],"container-title":"PeerJ Computer Science","id":"ITEM-1","issued":{"date-parts":[["2023"]]},"page":"1-26","title":"Seamless transformation from use case to sequence diagrams","type":"article-journal","volume":"9"},"uris":["http://www.mendeley.com/documents/?uuid=49563a86-dbdb-4be9-85ea-60c8f97000b7"]}],"mendeley":{"formattedCitation":"[8]","plainTextFormattedCitation":"[8]","previouslyFormattedCitation":"[8]"},"properties":{"noteIndex":0},"schema":"https://github.com/citation-style-language/schema/raw/master/csl-citation.json"}</w:instrText>
+      </w:r>
+      <w:r>
+        <w:rPr>
+          <w:lang w:val="en-ID"/>
+        </w:rPr>
+        <w:fldChar w:fldCharType="separate"/>
+      </w:r>
+      <w:r>
+        <w:rPr>
+          <w:noProof/>
+          <w:lang w:val="en-ID"/>
+        </w:rPr>
+        <w:t>[8]</w:t>
+      </w:r>
+      <w:r>
+        <w:rPr>
+          <w:lang w:val="en-ID"/>
+        </w:rPr>
+        <w:fldChar w:fldCharType="end"/>
+      </w:r>
+      <w:r>
+        <w:rPr>
+          <w:lang w:val="en-ID"/>
+        </w:rPr>
+        <w:t xml:space="preserve">. </w:t>
+      </w:r>
+      <w:r>
+        <w:rPr>
+          <w:lang w:val="en-ID"/>
+        </w:rPr>
+        <w:t>Oleh karena itu, transformation dan consistency checking perlu dibedakan: model yang berhasil ditransformasikan secara sintaktik belum tentu memberikan mekanisme diagnosis ketika artefak desain yang telah tersedia berbeda dari spesifikasi.</w:t>
+      </w:r>
+    </w:p>
+    <w:p>
+      <w:pPr>
+        <w:rPr>
+          <w:lang w:val="en-ID"/>
+        </w:rPr>
+      </w:pPr>
+      <w:r>
+        <w:rPr>
+          <w:lang w:val="en-ID"/>
+        </w:rPr>
+        <w:t xml:space="preserve">Pada ranah formal verification, Chen </w:t>
+      </w:r>
+      <w:r>
+        <w:rPr>
+          <w:lang w:val="en-ID"/>
+        </w:rPr>
+        <w:t xml:space="preserve">et al. </w:t>
+      </w:r>
+      <w:r>
+        <w:rPr>
+          <w:lang w:val="en-ID"/>
+        </w:rPr>
+        <w:fldChar w:fldCharType="begin" w:fldLock="1"/>
+      </w:r>
+      <w:r>
+        <w:rPr>
+          <w:lang w:val="en-ID"/>
+        </w:rPr>
+        <w:instrText>ADDIN CSL_CITATION {"citationItems":[{"id":"ITEM-1","itemData":{"DOI":"10.1016/j.scico.2022.102777","ISSN":"01676423","abstract":"UML interactions, aka sequence diagrams, are frequently used by engineers to describe expected scenarios of good or bad behaviors of systems under design, as they provide allegedly a simple enough syntax to express a quite large variety of behaviors. This paper uses them to express safety requirements for safety critical systems in an incremental way, where the scenarios are progressively refined after checking the consistency of the requirements. The semantics of these scenarios are expressed by transforming them into an intermediate semantic model amenable to formal verification. In this paper, we rely on the Clock Constraint Specification Language (CCSL) as the intermediate semantic language. In some sense, sequence diagrams and CCSL constraints both express a family of acceptable infinite traces that must include the behaviors given by the finite set of finite execution traces against which we validate. We compare these requirements to actual execution traces to prove the validity of our transformation. As to check the consistency of the sequence diagrams, we present two verification methods based on SMT and clock graphs respectively. The SMT based method relies on our analysis tool called MyCCSL to analyze CCSL constraints. The clock graph based method transforms CCSL constraints into a clock graph, and does the analysis through traversing the clock graph. Finally, these two methods are evaluated against real cases from the railway transit systems. The results show that the SMT based method provides accurate but slow analysis, while the clock graph based method dramatically increases the verification efficiency aiming at two kinds of typical inconsistencies found by the SMT based method.","author":[{"dropping-particle":"","family":"Chen","given":"Xiaohong","non-dropping-particle":"","parse-names":false,"suffix":""},{"dropping-particle":"","family":"Liu","given":"Qianqian","non-dropping-particle":"","parse-names":false,"suffix":""},{"dropping-particle":"","family":"Mallet","given":"Frédéric","non-dropping-particle":"","parse-names":false,"suffix":""},{"dropping-particle":"","family":"Li","given":"Qin","non-dropping-particle":"","parse-names":false,"suffix":""},{"dropping-particle":"","family":"Cai","given":"Shubin","non-dropping-particle":"","parse-names":false,"suffix":""},{"dropping-particle":"","family":"Jin","given":"Zhi","non-dropping-particle":"","parse-names":false,"suffix":""}],"container-title":"Science of Computer Programming","id":"ITEM-1","issued":{"date-parts":[["2022"]]},"page":"102777","publisher":"Elsevier B.V.","title":"Formally verifying consistency of sequence diagrams for safety critical systems","type":"article-journal","volume":"216"},"uris":["http://www.mendeley.com/documents/?uuid=7d5efa8c-94fd-4222-822e-d08c87976723"]}],"mendeley":{"formattedCitation":"[9]","plainTextFormattedCitation":"[9]","previouslyFormattedCitation":"[9]"},"properties":{"noteIndex":0},"schema":"https://github.com/citation-style-language/schema/raw/master/csl-citation.json"}</w:instrText>
+      </w:r>
+      <w:r>
+        <w:rPr>
+          <w:lang w:val="en-ID"/>
+        </w:rPr>
+        <w:fldChar w:fldCharType="separate"/>
+      </w:r>
+      <w:r>
+        <w:rPr>
+          <w:noProof/>
+          <w:lang w:val="en-ID"/>
+        </w:rPr>
+        <w:t>[9]</w:t>
+      </w:r>
+      <w:r>
+        <w:rPr>
+          <w:lang w:val="en-ID"/>
+        </w:rPr>
+        <w:fldChar w:fldCharType="end"/>
+      </w:r>
+      <w:r>
+        <w:rPr>
+          <w:lang w:val="en-ID"/>
+        </w:rPr>
+        <w:t xml:space="preserve"> mengembangkan pendekatan untuk consistency verification sequence diagram pada safety-critical systems. Sequence diagram terlebih dahulu ditransformasikan menjadi intermediate semantic model dalam Clock Constraint Specification Language. CCSL merepresentasikan causal dan temporal relation antar-event. Verifikasi kemudian dilakukan melalui dua mekanisme, yaitu SMT-based verification menggunakan MyCCSL dan clock-graph-based verification yang mengubah constraint menjad</w:t>
+      </w:r>
+      <w:r>
+        <w:rPr>
+          <w:lang w:val="en-ID"/>
+        </w:rPr>
+        <w:t xml:space="preserve">i graph search problem </w:t>
+      </w:r>
+      <w:r>
+        <w:rPr>
+          <w:lang w:val="en-ID"/>
+        </w:rPr>
+        <w:fldChar w:fldCharType="begin" w:fldLock="1"/>
+      </w:r>
+      <w:r>
+        <w:rPr>
+          <w:lang w:val="en-ID"/>
+        </w:rPr>
+        <w:instrText>ADDIN CSL_CITATION {"citationItems":[{"id":"ITEM-1","itemData":{"DOI":"10.1016/j.scico.2022.102777","ISSN":"01676423","abstract":"UML interactions, aka sequence diagrams, are frequently used by engineers to describe expected scenarios of good or bad behaviors of systems under design, as they provide allegedly a simple enough syntax to express a quite large variety of behaviors. This paper uses them to express safety requirements for safety critical systems in an incremental way, where the scenarios are progressively refined after checking the consistency of the requirements. The semantics of these scenarios are expressed by transforming them into an intermediate semantic model amenable to formal verification. In this paper, we rely on the Clock Constraint Specification Language (CCSL) as the intermediate semantic language. In some sense, sequence diagrams and CCSL constraints both express a family of acceptable infinite traces that must include the behaviors given by the finite set of finite execution traces against which we validate. We compare these requirements to actual execution traces to prove the validity of our transformation. As to check the consistency of the sequence diagrams, we present two verification methods based on SMT and clock graphs respectively. The SMT based method relies on our analysis tool called MyCCSL to analyze CCSL constraints. The clock graph based method transforms CCSL constraints into a clock graph, and does the analysis through traversing the clock graph. Finally, these two methods are evaluated against real cases from the railway transit systems. The results show that the SMT based method provides accurate but slow analysis, while the clock graph based method dramatically increases the verification efficiency aiming at two kinds of typical inconsistencies found by the SMT based method.","author":[{"dropping-particle":"","family":"Chen","given":"Xiaohong","non-dropping-particle":"","parse-names":false,"suffix":""},{"dropping-particle":"","family":"Liu","given":"Qianqian","non-dropping-particle":"","parse-names":false,"suffix":""},{"dropping-particle":"","family":"Mallet","given":"Frédéric","non-dropping-particle":"","parse-names":false,"suffix":""},{"dropping-particle":"","family":"Li","given":"Qin","non-dropping-particle":"","parse-names":false,"suffix":""},{"dropping-particle":"","family":"Cai","given":"Shubin","non-dropping-particle":"","parse-names":false,"suffix":""},{"dropping-particle":"","family":"Jin","given":"Zhi","non-dropping-particle":"","parse-names":false,"suffix":""}],"container-title":"Science of Computer Programming","id":"ITEM-1","issued":{"date-parts":[["2022"]]},"page":"102777","publisher":"Elsevier B.V.","title":"Formally verifying consistency of sequence diagrams for safety critical systems","type":"article-journal","volume":"216"},"uris":["http://www.mendeley.com/documents/?uuid=7d5efa8c-94fd-4222-822e-d08c87976723"]}],"mendeley":{"formattedCitation":"[9]","plainTextFormattedCitation":"[9]","previouslyFormattedCitation":"[9]"},"properties":{"noteIndex":0},"schema":"https://github.com/citation-style-language/schema/raw/master/csl-citation.json"}</w:instrText>
+      </w:r>
+      <w:r>
+        <w:rPr>
+          <w:lang w:val="en-ID"/>
+        </w:rPr>
+        <w:fldChar w:fldCharType="separate"/>
+      </w:r>
+      <w:r>
+        <w:rPr>
+          <w:noProof/>
+          <w:lang w:val="en-ID"/>
+        </w:rPr>
+        <w:t>[9]</w:t>
+      </w:r>
+      <w:r>
+        <w:rPr>
+          <w:lang w:val="en-ID"/>
+        </w:rPr>
+        <w:fldChar w:fldCharType="end"/>
+      </w:r>
+      <w:r>
+        <w:rPr>
+          <w:lang w:val="en-ID"/>
+        </w:rPr>
+        <w:t xml:space="preserve">. </w:t>
+      </w:r>
+      <w:r>
+        <w:rPr>
+          <w:lang w:val="en-ID"/>
+        </w:rPr>
+        <w:t>Evaluasi menggunakan real cases dari railway transit menunjukkan bahwa SMT memberikan analisis yang akurat tetapi lambat, sementara clock graph meningkatkan efficiency dengan memeriksa dua jenis</w:t>
+      </w:r>
+      <w:r>
+        <w:rPr>
+          <w:lang w:val="en-ID"/>
+        </w:rPr>
+        <w:t xml:space="preserve"> inconsistency tipikal </w:t>
+      </w:r>
+      <w:r>
+        <w:rPr>
+          <w:lang w:val="en-ID"/>
+        </w:rPr>
+        <w:fldChar w:fldCharType="begin" w:fldLock="1"/>
+      </w:r>
+      <w:r>
+        <w:rPr>
+          <w:lang w:val="en-ID"/>
+        </w:rPr>
+        <w:instrText>ADDIN CSL_CITATION {"citationItems":[{"id":"ITEM-1","itemData":{"DOI":"10.1016/j.scico.2022.102777","ISSN":"01676423","abstract":"UML interactions, aka sequence diagrams, are frequently used by engineers to describe expected scenarios of good or bad behaviors of systems under design, as they provide allegedly a simple enough syntax to express a quite large variety of behaviors. This paper uses them to express safety requirements for safety critical systems in an incremental way, where the scenarios are progressively refined after checking the consistency of the requirements. The semantics of these scenarios are expressed by transforming them into an intermediate semantic model amenable to formal verification. In this paper, we rely on the Clock Constraint Specification Language (CCSL) as the intermediate semantic language. In some sense, sequence diagrams and CCSL constraints both express a family of acceptable infinite traces that must include the behaviors given by the finite set of finite execution traces against which we validate. We compare these requirements to actual execution traces to prove the validity of our transformation. As to check the consistency of the sequence diagrams, we present two verification methods based on SMT and clock graphs respectively. The SMT based method relies on our analysis tool called MyCCSL to analyze CCSL constraints. The clock graph based method transforms CCSL constraints into a clock graph, and does the analysis through traversing the clock graph. Finally, these two methods are evaluated against real cases from the railway transit systems. The results show that the SMT based method provides accurate but slow analysis, while the clock graph based method dramatically increases the verification efficiency aiming at two kinds of typical inconsistencies found by the SMT based method.","author":[{"dropping-particle":"","family":"Chen","given":"Xiaohong","non-dropping-particle":"","parse-names":false,"suffix":""},{"dropping-particle":"","family":"Liu","given":"Qianqian","non-dropping-particle":"","parse-names":false,"suffix":""},{"dropping-particle":"","family":"Mallet","given":"Frédéric","non-dropping-particle":"","parse-names":false,"suffix":""},{"dropping-particle":"","family":"Li","given":"Qin","non-dropping-particle":"","parse-names":false,"suffix":""},{"dropping-particle":"","family":"Cai","given":"Shubin","non-dropping-particle":"","parse-names":false,"suffix":""},{"dropping-particle":"","family":"Jin","given":"Zhi","non-dropping-particle":"","parse-names":false,"suffix":""}],"container-title":"Science of Computer Programming","id":"ITEM-1","issued":{"date-parts":[["2022"]]},"page":"102777","publisher":"Elsevier B.V.","title":"Formally verifying consistency of sequence diagrams for safety critical systems","type":"article-journal","volume":"216"},"uris":["http://www.mendeley.com/documents/?uuid=7d5efa8c-94fd-4222-822e-d08c87976723"]}],"mendeley":{"formattedCitation":"[9]","plainTextFormattedCitation":"[9]","previouslyFormattedCitation":"[9]"},"properties":{"noteIndex":0},"schema":"https://github.com/citation-style-language/schema/raw/master/csl-citation.json"}</w:instrText>
+      </w:r>
+      <w:r>
+        <w:rPr>
+          <w:lang w:val="en-ID"/>
+        </w:rPr>
+        <w:fldChar w:fldCharType="separate"/>
+      </w:r>
+      <w:r>
+        <w:rPr>
+          <w:noProof/>
+          <w:lang w:val="en-ID"/>
+        </w:rPr>
+        <w:t>[9]</w:t>
+      </w:r>
+      <w:r>
+        <w:rPr>
+          <w:lang w:val="en-ID"/>
+        </w:rPr>
+        <w:fldChar w:fldCharType="end"/>
+      </w:r>
+      <w:r>
+        <w:rPr>
+          <w:lang w:val="en-ID"/>
+        </w:rPr>
+        <w:t xml:space="preserve">. </w:t>
+      </w:r>
+      <w:r>
+        <w:rPr>
+          <w:lang w:val="en-ID"/>
+        </w:rPr>
+        <w:t>Penelitian tersebut penting karena memperlihatkan bahwa temporal ordering dan behavioral constraint dapat dinyatakan secara eksplisit, aspek yang sering tidak ditangkap oleh text similarity.</w:t>
+      </w:r>
+    </w:p>
+    <w:p>
+      <w:pPr>
+        <w:rPr>
+          <w:lang w:val="en-ID"/>
+        </w:rPr>
+      </w:pPr>
+      <w:r>
+        <w:rPr>
+          <w:lang w:val="en-ID"/>
+        </w:rPr>
+        <w:t xml:space="preserve">Matsumoto et al. </w:t>
+      </w:r>
+      <w:r>
+        <w:rPr>
+          <w:lang w:val="en-ID"/>
+        </w:rPr>
+        <w:fldChar w:fldCharType="begin" w:fldLock="1"/>
+      </w:r>
+      <w:r>
+        <w:rPr>
+          <w:lang w:val="en-ID"/>
+        </w:rPr>
+        <w:instrText>ADDIN CSL_CITATION {"citationItems":[{"id":"ITEM-1","itemData":{"DOI":"10.52731/iee.v6.i2.529","ISSN":"2185-9884","abstract":"Automatic consistency checking for UML state machine diagrams and sequence diagrams has been expected since developers spend considerable effort to keep the consistency. In particular, the verification of diagrams with a hierarchical structure is required. Although formalization of state machine diagrams with hierarchical structure has been widely treated, it is not yet sufficient for sequence diagrams. In this paper, we propose an automatic method for verifying the consistency between state machine diagrams and sequence diagrams with a hierarchical structure. In our verification framework, the consistency of diagrams is defined as an inclusive relation between the sets of traces and is checked using the FDR model checker. FDR can check refinement relation between processes described as CSP M notation. We provide a process description of state machine diagrams and sequence diagrams and can verify the consistency by checking traces inclusion of processes using FDR. Our description supports for sequence diagrams with a hierarchical structure. We applied the proposed process representation to an example diagram that describes interactions of basic components of a wireless sensor network system and showed that the hierarchical behavior of the diagram could be correctly represented.","author":[{"dropping-particle":"","family":"Yokogawa","given":"Tomoyuki","non-dropping-particle":"","parse-names":false,"suffix":""},{"dropping-particle":"","family":"Matsumoto","given":"Akira","non-dropping-particle":"","parse-names":false,"suffix":""},{"dropping-particle":"","family":"Amasaki","given":"Sousuke","non-dropping-particle":"","parse-names":false,"suffix":""},{"dropping-particle":"","family":"Aman","given":"Hirohisa","non-dropping-particle":"","parse-names":false,"suffix":""},{"dropping-particle":"","family":"Arimoto","given":"Kazutami","non-dropping-particle":"","parse-names":false,"suffix":""}],"container-title":"Information Engineering Express","id":"ITEM-1","issue":"2","issued":{"date-parts":[["2020"]]},"page":"1-19","title":"Synthesis and Consistency Verification of UML Sequence Diagrams with Hierarchical Structure","type":"article-journal","volume":"6"},"uris":["http://www.mendeley.com/documents/?uuid=b299cf15-1135-44f4-b28f-a7b65d6a546e"]}],"mendeley":{"formattedCitation":"[10]","plainTextFormattedCitation":"[10]","previouslyFormattedCitation":"[10]"},"properties":{"noteIndex":0},"schema":"https://github.com/citation-style-language/schema/raw/master/csl-citation.json"}</w:instrText>
+      </w:r>
+      <w:r>
+        <w:rPr>
+          <w:lang w:val="en-ID"/>
+        </w:rPr>
+        <w:fldChar w:fldCharType="separate"/>
+      </w:r>
+      <w:r>
+        <w:rPr>
+          <w:noProof/>
+          <w:lang w:val="en-ID"/>
+        </w:rPr>
+        <w:t>[10]</w:t>
+      </w:r>
+      <w:r>
+        <w:rPr>
+          <w:lang w:val="en-ID"/>
+        </w:rPr>
+        <w:fldChar w:fldCharType="end"/>
+      </w:r>
+      <w:r>
+        <w:rPr>
+          <w:lang w:val="en-ID"/>
+        </w:rPr>
+        <w:t xml:space="preserve"> menggunakan pendekatan formal lain untuk consistency verification antara state machine diagram dan hierarchical sequence diagram. Model diterjemahkan ke process description menggunakan CSPM, kemudian FDR model checker memeriksa apakah trace yang direpresentasikan sequence diagram termasuk dalam behavior state machine. Pendekatan tersebut mendukung hierarchical control structure serta combined fragment seperti alt, opt</w:t>
+      </w:r>
+      <w:r>
+        <w:rPr>
+          <w:lang w:val="en-ID"/>
+        </w:rPr>
+        <w:t xml:space="preserve">, par, loop, strict, dan seq </w:t>
+      </w:r>
+      <w:r>
+        <w:rPr>
+          <w:lang w:val="en-ID"/>
+        </w:rPr>
+        <w:fldChar w:fldCharType="begin" w:fldLock="1"/>
+      </w:r>
+      <w:r>
+        <w:rPr>
+          <w:lang w:val="en-ID"/>
+        </w:rPr>
+        <w:instrText>ADDIN CSL_CITATION {"citationItems":[{"id":"ITEM-1","itemData":{"DOI":"10.52731/iee.v6.i2.529","ISSN":"2185-9884","abstract":"Automatic consistency checking for UML state machine diagrams and sequence diagrams has been expected since developers spend considerable effort to keep the consistency. In particular, the verification of diagrams with a hierarchical structure is required. Although formalization of state machine diagrams with hierarchical structure has been widely treated, it is not yet sufficient for sequence diagrams. In this paper, we propose an automatic method for verifying the consistency between state machine diagrams and sequence diagrams with a hierarchical structure. In our verification framework, the consistency of diagrams is defined as an inclusive relation between the sets of traces and is checked using the FDR model checker. FDR can check refinement relation between processes described as CSP M notation. We provide a process description of state machine diagrams and sequence diagrams and can verify the consistency by checking traces inclusion of processes using FDR. Our description supports for sequence diagrams with a hierarchical structure. We applied the proposed process representation to an example diagram that describes interactions of basic components of a wireless sensor network system and showed that the hierarchical behavior of the diagram could be correctly represented.","author":[{"dropping-particle":"","family":"Yokogawa","given":"Tomoyuki","non-dropping-particle":"","parse-names":false,"suffix":""},{"dropping-particle":"","family":"Matsumoto","given":"Akira","non-dropping-particle":"","parse-names":false,"suffix":""},{"dropping-particle":"","family":"Amasaki","given":"Sousuke","non-dropping-particle":"","parse-names":false,"suffix":""},{"dropping-particle":"","family":"Aman","given":"Hirohisa","non-dropping-particle":"","parse-names":false,"suffix":""},{"dropping-particle":"","family":"Arimoto","given":"Kazutami","non-dropping-particle":"","parse-names":false,"suffix":""}],"container-title":"Information Engineering Express","id":"ITEM-1","issue":"2","issued":{"date-parts":[["2020"]]},"page":"1-19","title":"Synthesis and Consistency Verification of UML Sequence Diagrams with Hierarchical Structure","type":"article-journal","volume":"6"},"uris":["http://www.mendeley.com/documents/?uuid=b299cf15-1135-44f4-b28f-a7b65d6a546e"]}],"mendeley":{"formattedCitation":"[10]","plainTextFormattedCitation":"[10]","previouslyFormattedCitation":"[10]"},"properties":{"noteIndex":0},"schema":"https://github.com/citation-style-language/schema/raw/master/csl-citation.json"}</w:instrText>
+      </w:r>
+      <w:r>
+        <w:rPr>
+          <w:lang w:val="en-ID"/>
+        </w:rPr>
+        <w:fldChar w:fldCharType="separate"/>
+      </w:r>
+      <w:r>
+        <w:rPr>
+          <w:noProof/>
+          <w:lang w:val="en-ID"/>
+        </w:rPr>
+        <w:t>[10]</w:t>
+      </w:r>
+      <w:r>
+        <w:rPr>
+          <w:lang w:val="en-ID"/>
+        </w:rPr>
+        <w:fldChar w:fldCharType="end"/>
+      </w:r>
+      <w:r>
+        <w:rPr>
+          <w:lang w:val="en-ID"/>
+        </w:rPr>
+        <w:t xml:space="preserve">. </w:t>
+      </w:r>
+      <w:r>
+        <w:rPr>
+          <w:lang w:val="en-ID"/>
+        </w:rPr>
+        <w:t>Penelitian sebelumnya pada domain ini banyak berfokus pada flat sequence diagrams sehingga dukungan terhadap hierarchical fragment menja</w:t>
+      </w:r>
+      <w:r>
+        <w:rPr>
+          <w:lang w:val="en-ID"/>
+        </w:rPr>
+        <w:t xml:space="preserve">di </w:t>
+      </w:r>
+      <w:r>
+        <w:rPr>
+          <w:lang w:val="en-ID"/>
+        </w:rPr>
+        <w:lastRenderedPageBreak/>
+        <w:t xml:space="preserve">kontribusi penting </w:t>
+      </w:r>
+      <w:r>
+        <w:rPr>
+          <w:lang w:val="en-ID"/>
+        </w:rPr>
+        <w:fldChar w:fldCharType="begin" w:fldLock="1"/>
+      </w:r>
+      <w:r>
+        <w:rPr>
+          <w:lang w:val="en-ID"/>
+        </w:rPr>
+        <w:instrText>ADDIN CSL_CITATION {"citationItems":[{"id":"ITEM-1","itemData":{"DOI":"10.52731/iee.v6.i2.529","ISSN":"2185-9884","abstract":"Automatic consistency checking for UML state machine diagrams and sequence diagrams has been expected since developers spend considerable effort to keep the consistency. In particular, the verification of diagrams with a hierarchical structure is required. Although formalization of state machine diagrams with hierarchical structure has been widely treated, it is not yet sufficient for sequence diagrams. In this paper, we propose an automatic method for verifying the consistency between state machine diagrams and sequence diagrams with a hierarchical structure. In our verification framework, the consistency of diagrams is defined as an inclusive relation between the sets of traces and is checked using the FDR model checker. FDR can check refinement relation between processes described as CSP M notation. We provide a process description of state machine diagrams and sequence diagrams and can verify the consistency by checking traces inclusion of processes using FDR. Our description supports for sequence diagrams with a hierarchical structure. We applied the proposed process representation to an example diagram that describes interactions of basic components of a wireless sensor network system and showed that the hierarchical behavior of the diagram could be correctly represented.","author":[{"dropping-particle":"","family":"Yokogawa","given":"Tomoyuki","non-dropping-particle":"","parse-names":false,"suffix":""},{"dropping-particle":"","family":"Matsumoto","given":"Akira","non-dropping-particle":"","parse-names":false,"suffix":""},{"dropping-particle":"","family":"Amasaki","given":"Sousuke","non-dropping-particle":"","parse-names":false,"suffix":""},{"dropping-particle":"","family":"Aman","given":"Hirohisa","non-dropping-particle":"","parse-names":false,"suffix":""},{"dropping-particle":"","family":"Arimoto","given":"Kazutami","non-dropping-particle":"","parse-names":false,"suffix":""}],"container-title":"Information Engineering Express","id":"ITEM-1","issue":"2","issued":{"date-parts":[["2020"]]},"page":"1-19","title":"Synthesis and Consistency Verification of UML Sequence Diagrams with Hierarchical Structure","type":"article-journal","volume":"6"},"uris":["http://www.mendeley.com/documents/?uuid=b299cf15-1135-44f4-b28f-a7b65d6a546e"]}],"mendeley":{"formattedCitation":"[10]","plainTextFormattedCitation":"[10]","previouslyFormattedCitation":"[10]"},"properties":{"noteIndex":0},"schema":"https://github.com/citation-style-language/schema/raw/master/csl-citation.json"}</w:instrText>
+      </w:r>
+      <w:r>
+        <w:rPr>
+          <w:lang w:val="en-ID"/>
+        </w:rPr>
+        <w:fldChar w:fldCharType="separate"/>
+      </w:r>
+      <w:r>
+        <w:rPr>
+          <w:noProof/>
+          <w:lang w:val="en-ID"/>
+        </w:rPr>
+        <w:t>[10]</w:t>
+      </w:r>
+      <w:r>
+        <w:rPr>
+          <w:lang w:val="en-ID"/>
+        </w:rPr>
+        <w:fldChar w:fldCharType="end"/>
+      </w:r>
+      <w:r>
+        <w:rPr>
+          <w:lang w:val="en-ID"/>
+        </w:rPr>
+        <w:t xml:space="preserve">. </w:t>
+      </w:r>
+      <w:r>
+        <w:rPr>
+          <w:lang w:val="en-ID"/>
+        </w:rPr>
+        <w:t>Namun, pendekatan tersebut memeriksa model-to-model consistency dan bukan hubungan natural-language specification dengan sequence diagram.</w:t>
+      </w:r>
+    </w:p>
+    <w:p>
+      <w:pPr>
+        <w:rPr>
+          <w:lang w:val="en-ID"/>
+        </w:rPr>
+      </w:pPr>
+      <w:r>
+        <w:rPr>
+          <w:lang w:val="en-ID"/>
+        </w:rPr>
+        <w:t xml:space="preserve">Pada level natural-language requirements, Fantechi </w:t>
+      </w:r>
+      <w:r>
+        <w:rPr>
+          <w:lang w:val="en-ID"/>
+        </w:rPr>
+        <w:t>et al</w:t>
+      </w:r>
+      <w:r>
+        <w:rPr>
+          <w:lang w:val="en-ID"/>
+        </w:rPr>
+        <w:t xml:space="preserve">. </w:t>
+      </w:r>
+      <w:r>
+        <w:rPr>
+          <w:lang w:val="en-ID"/>
+        </w:rPr>
+        <w:fldChar w:fldCharType="begin" w:fldLock="1"/>
+      </w:r>
+      <w:r>
+        <w:rPr>
+          <w:lang w:val="en-ID"/>
+        </w:rPr>
+        <w:instrText>ADDIN CSL_CITATION {"citationItems":[{"id":"ITEM-1","itemData":{"DOI":"10.1109/RE57278.2023.00045","ISBN":"9798350326895","ISSN":"23326441","abstract":"With the rapid advancement of tools based on Artificial Intelligence, it is interesting to assess their usefulness in requirements engineering. In early experiments, we have seen that ChatGPT can detect inconsistency defects in natural language (NL) requirements, that traditional NLP tools cannot identify or can identify with difficulties even after domain-focused training. This study is devoted to specifically measuring the performance of ChatGPT in finding inconsistency in requirements. Positive results in this respect could lead to the use of ChatGPT to complement existing requirements analysis tools to automatically detect this important quality criterion. For this purpose, we consider GPT-3.5, the Generative Pretrained Transformer language model developed by OpenAI. We evaluate its ability to detect inconsistency by comparing its predictions with those obtained from expert judgments by students with a proven knowledge of RE issues on a few example requirements documents.","author":[{"dropping-particle":"","family":"Fantechi","given":"Alessandro","non-dropping-particle":"","parse-names":false,"suffix":""},{"dropping-particle":"","family":"Gnesi","given":"Stefania","non-dropping-particle":"","parse-names":false,"suffix":""},{"dropping-particle":"","family":"Passaro","given":"Lucia","non-dropping-particle":"","parse-names":false,"suffix":""},{"dropping-particle":"","family":"Semini","given":"Laura","non-dropping-particle":"","parse-names":false,"suffix":""}],"container-title":"Proceedings of the IEEE International Conference on Requirements Engineering","id":"ITEM-1","issued":{"date-parts":[["2023"]]},"page":"335-340","publisher":"IEEE","title":"Inconsistency Detection in Natural Language Requirements using ChatGPT: a Preliminary Evaluation","type":"article-journal","volume":"2023-Septe"},"uris":["http://www.mendeley.com/documents/?uuid=9cec6ae3-206a-4ab3-a595-991609566925"]}],"mendeley":{"formattedCitation":"[11]","plainTextFormattedCitation":"[11]","previouslyFormattedCitation":"[11]"},"properties":{"noteIndex":0},"schema":"https://github.com/citation-style-language/schema/raw/master/csl-citation.json"}</w:instrText>
+      </w:r>
+      <w:r>
+        <w:rPr>
+          <w:lang w:val="en-ID"/>
+        </w:rPr>
+        <w:fldChar w:fldCharType="separate"/>
+      </w:r>
+      <w:r>
+        <w:rPr>
+          <w:noProof/>
+          <w:lang w:val="en-ID"/>
+        </w:rPr>
+        <w:t>[11]</w:t>
+      </w:r>
+      <w:r>
+        <w:rPr>
+          <w:lang w:val="en-ID"/>
+        </w:rPr>
+        <w:fldChar w:fldCharType="end"/>
+      </w:r>
+      <w:r>
+        <w:rPr>
+          <w:lang w:val="en-ID"/>
+        </w:rPr>
+        <w:t xml:space="preserve"> mengevaluasi kemampuan ChatGPT dalam mendeteksi inconsistency antarkebutuhan. Empat dataset digunakan, yaitu Coffee Machine, E-shop, Library, dan ETCS. Requirements awal yang telah divalidasi ditambahkan lima belas conflicting requirements untuk membangun groun</w:t>
+      </w:r>
+      <w:r>
+        <w:rPr>
+          <w:lang w:val="en-ID"/>
+        </w:rPr>
+        <w:t>d truth i</w:t>
+      </w:r>
+      <w:r>
+        <w:rPr>
+          <w:lang w:val="en-ID"/>
+        </w:rPr>
+        <w:t xml:space="preserve">nconsistency </w:t>
+      </w:r>
+      <w:r>
+        <w:rPr>
+          <w:lang w:val="en-ID"/>
+        </w:rPr>
+        <w:fldChar w:fldCharType="begin" w:fldLock="1"/>
+      </w:r>
+      <w:r>
+        <w:rPr>
+          <w:lang w:val="en-ID"/>
+        </w:rPr>
+        <w:instrText>ADDIN CSL_CITATION {"citationItems":[{"id":"ITEM-1","itemData":{"DOI":"10.1109/RE57278.2023.00045","ISBN":"9798350326895","ISSN":"23326441","abstract":"With the rapid advancement of tools based on Artificial Intelligence, it is interesting to assess their usefulness in requirements engineering. In early experiments, we have seen that ChatGPT can detect inconsistency defects in natural language (NL) requirements, that traditional NLP tools cannot identify or can identify with difficulties even after domain-focused training. This study is devoted to specifically measuring the performance of ChatGPT in finding inconsistency in requirements. Positive results in this respect could lead to the use of ChatGPT to complement existing requirements analysis tools to automatically detect this important quality criterion. For this purpose, we consider GPT-3.5, the Generative Pretrained Transformer language model developed by OpenAI. We evaluate its ability to detect inconsistency by comparing its predictions with those obtained from expert judgments by students with a proven knowledge of RE issues on a few example requirements documents.","author":[{"dropping-particle":"","family":"Fantechi","given":"Alessandro","non-dropping-particle":"","parse-names":false,"suffix":""},{"dropping-particle":"","family":"Gnesi","given":"Stefania","non-dropping-particle":"","parse-names":false,"suffix":""},{"dropping-particle":"","family":"Passaro","given":"Lucia","non-dropping-particle":"","parse-names":false,"suffix":""},{"dropping-particle":"","family":"Semini","given":"Laura","non-dropping-particle":"","parse-names":false,"suffix":""}],"container-title":"Proceedings of the IEEE International Conference on Requirements Engineering","id":"ITEM-1","issued":{"date-parts":[["2023"]]},"page":"335-340","publisher":"IEEE","title":"Inconsistency Detection in Natural Language Requirements using ChatGPT: a Preliminary Evaluation","type":"article-journal","volume":"2023-Septe"},"uris":["http://www.mendeley.com/documents/?uuid=9cec6ae3-206a-4ab3-a595-991609566925"]}],"mendeley":{"formattedCitation":"[11]","plainTextFormattedCitation":"[11]","previouslyFormattedCitation":"[11]"},"properties":{"noteIndex":0},"schema":"https://github.com/citation-style-language/schema/raw/master/csl-citation.json"}</w:instrText>
+      </w:r>
+      <w:r>
+        <w:rPr>
+          <w:lang w:val="en-ID"/>
+        </w:rPr>
+        <w:fldChar w:fldCharType="separate"/>
+      </w:r>
+      <w:r>
+        <w:rPr>
+          <w:noProof/>
+          <w:lang w:val="en-ID"/>
+        </w:rPr>
+        <w:t>[11]</w:t>
+      </w:r>
+      <w:r>
+        <w:rPr>
+          <w:lang w:val="en-ID"/>
+        </w:rPr>
+        <w:fldChar w:fldCharType="end"/>
+      </w:r>
+      <w:r>
+        <w:rPr>
+          <w:lang w:val="en-ID"/>
+        </w:rPr>
+        <w:t>.</w:t>
+      </w:r>
+      <w:r>
+        <w:rPr>
+          <w:lang w:val="en-ID"/>
+        </w:rPr>
+        <w:t xml:space="preserve"> </w:t>
+      </w:r>
+      <w:r>
+        <w:rPr>
+          <w:lang w:val="en-ID"/>
+        </w:rPr>
+        <w:t>Precision dan recall kemudian dibandingkan antara ChatGPT dan expert. Pada E-shop, misalnya, ChatGPT mencapai rata-rata precision 0,85 dan recall 0,53 dibandingkan expert dengan pr</w:t>
+      </w:r>
+      <w:r>
+        <w:rPr>
+          <w:lang w:val="en-ID"/>
+        </w:rPr>
+        <w:t xml:space="preserve">ecision 0,96 dan recall 0,63 </w:t>
+      </w:r>
+      <w:r>
+        <w:rPr>
+          <w:lang w:val="en-ID"/>
+        </w:rPr>
+        <w:fldChar w:fldCharType="begin" w:fldLock="1"/>
+      </w:r>
+      <w:r>
+        <w:rPr>
+          <w:lang w:val="en-ID"/>
+        </w:rPr>
+        <w:instrText>ADDIN CSL_CITATION {"citationItems":[{"id":"ITEM-1","itemData":{"DOI":"10.1109/RE57278.2023.00045","ISBN":"9798350326895","ISSN":"23326441","abstract":"With the rapid advancement of tools based on Artificial Intelligence, it is interesting to assess their usefulness in requirements engineering. In early experiments, we have seen that ChatGPT can detect inconsistency defects in natural language (NL) requirements, that traditional NLP tools cannot identify or can identify with difficulties even after domain-focused training. This study is devoted to specifically measuring the performance of ChatGPT in finding inconsistency in requirements. Positive results in this respect could lead to the use of ChatGPT to complement existing requirements analysis tools to automatically detect this important quality criterion. For this purpose, we consider GPT-3.5, the Generative Pretrained Transformer language model developed by OpenAI. We evaluate its ability to detect inconsistency by comparing its predictions with those obtained from expert judgments by students with a proven knowledge of RE issues on a few example requirements documents.","author":[{"dropping-particle":"","family":"Fantechi","given":"Alessandro","non-dropping-particle":"","parse-names":false,"suffix":""},{"dropping-particle":"","family":"Gnesi","given":"Stefania","non-dropping-particle":"","parse-names":false,"suffix":""},{"dropping-particle":"","family":"Passaro","given":"Lucia","non-dropping-particle":"","parse-names":false,"suffix":""},{"dropping-particle":"","family":"Semini","given":"Laura","non-dropping-particle":"","parse-names":false,"suffix":""}],"container-title":"Proceedings of the IEEE International Conference on Requirements Engineering","id":"ITEM-1","issued":{"date-parts":[["2023"]]},"page":"335-340","publisher":"IEEE","title":"Inconsistency Detection in Natural Language Requirements using ChatGPT: a Preliminary Evaluation","type":"article-journal","volume":"2023-Septe"},"uris":["http://www.mendeley.com/documents/?uuid=9cec6ae3-206a-4ab3-a595-991609566925"]}],"mendeley":{"formattedCitation":"[11]","plainTextFormattedCitation":"[11]","previouslyFormattedCitation":"[11]"},"properties":{"noteIndex":0},"schema":"https://github.com/citation-style-language/schema/raw/master/csl-citation.json"}</w:instrText>
+      </w:r>
+      <w:r>
+        <w:rPr>
+          <w:lang w:val="en-ID"/>
+        </w:rPr>
+        <w:fldChar w:fldCharType="separate"/>
+      </w:r>
+      <w:r>
+        <w:rPr>
+          <w:noProof/>
+          <w:lang w:val="en-ID"/>
+        </w:rPr>
+        <w:t>[11]</w:t>
+      </w:r>
+      <w:r>
+        <w:rPr>
+          <w:lang w:val="en-ID"/>
+        </w:rPr>
+        <w:fldChar w:fldCharType="end"/>
+      </w:r>
+      <w:r>
+        <w:rPr>
+          <w:lang w:val="en-ID"/>
+        </w:rPr>
+        <w:t xml:space="preserve">. </w:t>
+      </w:r>
+      <w:r>
+        <w:rPr>
+          <w:lang w:val="en-ID"/>
+        </w:rPr>
+        <w:t>Pada dokumen Library dan ETCS yang lebih panjang, ChatGPT hanya memproses sebagian requirements sehingga performan</w:t>
+      </w:r>
+      <w:r>
+        <w:rPr>
+          <w:lang w:val="en-ID"/>
+        </w:rPr>
+        <w:t xml:space="preserve">ya menurun secara signifikan </w:t>
+      </w:r>
+      <w:r>
+        <w:rPr>
+          <w:lang w:val="en-ID"/>
+        </w:rPr>
+        <w:fldChar w:fldCharType="begin" w:fldLock="1"/>
+      </w:r>
+      <w:r>
+        <w:rPr>
+          <w:lang w:val="en-ID"/>
+        </w:rPr>
+        <w:instrText>ADDIN CSL_CITATION {"citationItems":[{"id":"ITEM-1","itemData":{"DOI":"10.1109/RE57278.2023.00045","ISBN":"9798350326895","ISSN":"23326441","abstract":"With the rapid advancement of tools based on Artificial Intelligence, it is interesting to assess their usefulness in requirements engineering. In early experiments, we have seen that ChatGPT can detect inconsistency defects in natural language (NL) requirements, that traditional NLP tools cannot identify or can identify with difficulties even after domain-focused training. This study is devoted to specifically measuring the performance of ChatGPT in finding inconsistency in requirements. Positive results in this respect could lead to the use of ChatGPT to complement existing requirements analysis tools to automatically detect this important quality criterion. For this purpose, we consider GPT-3.5, the Generative Pretrained Transformer language model developed by OpenAI. We evaluate its ability to detect inconsistency by comparing its predictions with those obtained from expert judgments by students with a proven knowledge of RE issues on a few example requirements documents.","author":[{"dropping-particle":"","family":"Fantechi","given":"Alessandro","non-dropping-particle":"","parse-names":false,"suffix":""},{"dropping-particle":"","family":"Gnesi","given":"Stefania","non-dropping-particle":"","parse-names":false,"suffix":""},{"dropping-particle":"","family":"Passaro","given":"Lucia","non-dropping-particle":"","parse-names":false,"suffix":""},{"dropping-particle":"","family":"Semini","given":"Laura","non-dropping-particle":"","parse-names":false,"suffix":""}],"container-title":"Proceedings of the IEEE International Conference on Requirements Engineering","id":"ITEM-1","issued":{"date-parts":[["2023"]]},"page":"335-340","publisher":"IEEE","title":"Inconsistency Detection in Natural Language Requirements using ChatGPT: a Preliminary Evaluation","type":"article-journal","volume":"2023-Septe"},"uris":["http://www.mendeley.com/documents/?uuid=9cec6ae3-206a-4ab3-a595-991609566925"]}],"mendeley":{"formattedCitation":"[11]","plainTextFormattedCitation":"[11]","previouslyFormattedCitation":"[11]"},"properties":{"noteIndex":0},"schema":"https://github.com/citation-style-language/schema/raw/master/csl-citation.json"}</w:instrText>
+      </w:r>
+      <w:r>
+        <w:rPr>
+          <w:lang w:val="en-ID"/>
+        </w:rPr>
+        <w:fldChar w:fldCharType="separate"/>
+      </w:r>
+      <w:r>
+        <w:rPr>
+          <w:noProof/>
+          <w:lang w:val="en-ID"/>
+        </w:rPr>
+        <w:t>[11]</w:t>
+      </w:r>
+      <w:r>
+        <w:rPr>
+          <w:lang w:val="en-ID"/>
+        </w:rPr>
+        <w:fldChar w:fldCharType="end"/>
+      </w:r>
+      <w:r>
+        <w:rPr>
+          <w:lang w:val="en-ID"/>
+        </w:rPr>
+        <w:t xml:space="preserve">. </w:t>
+      </w:r>
+      <w:r>
+        <w:rPr>
+          <w:lang w:val="en-ID"/>
+        </w:rPr>
+        <w:t>Peneliti juga mengidentifikasi kurangnya explainability dan reproducibility sebagai masalah penggunaan L</w:t>
+      </w:r>
+      <w:r>
+        <w:rPr>
+          <w:lang w:val="en-ID"/>
+        </w:rPr>
+        <w:t xml:space="preserve">LM untuk quality assessment </w:t>
+      </w:r>
+      <w:r>
+        <w:rPr>
+          <w:lang w:val="en-ID"/>
+        </w:rPr>
+        <w:fldChar w:fldCharType="begin" w:fldLock="1"/>
+      </w:r>
+      <w:r>
+        <w:rPr>
+          <w:lang w:val="en-ID"/>
+        </w:rPr>
+        <w:instrText>ADDIN CSL_CITATION {"citationItems":[{"id":"ITEM-1","itemData":{"DOI":"10.1109/RE57278.2023.00045","ISBN":"9798350326895","ISSN":"23326441","abstract":"With the rapid advancement of tools based on Artificial Intelligence, it is interesting to assess their usefulness in requirements engineering. In early experiments, we have seen that ChatGPT can detect inconsistency defects in natural language (NL) requirements, that traditional NLP tools cannot identify or can identify with difficulties even after domain-focused training. This study is devoted to specifically measuring the performance of ChatGPT in finding inconsistency in requirements. Positive results in this respect could lead to the use of ChatGPT to complement existing requirements analysis tools to automatically detect this important quality criterion. For this purpose, we consider GPT-3.5, the Generative Pretrained Transformer language model developed by OpenAI. We evaluate its ability to detect inconsistency by comparing its predictions with those obtained from expert judgments by students with a proven knowledge of RE issues on a few example requirements documents.","author":[{"dropping-particle":"","family":"Fantechi","given":"Alessandro","non-dropping-particle":"","parse-names":false,"suffix":""},{"dropping-particle":"","family":"Gnesi","given":"Stefania","non-dropping-particle":"","parse-names":false,"suffix":""},{"dropping-particle":"","family":"Passaro","given":"Lucia","non-dropping-particle":"","parse-names":false,"suffix":""},{"dropping-particle":"","family":"Semini","given":"Laura","non-dropping-particle":"","parse-names":false,"suffix":""}],"container-title":"Proceedings of the IEEE International Conference on Requirements Engineering","id":"ITEM-1","issued":{"date-parts":[["2023"]]},"page":"335-340","publisher":"IEEE","title":"Inconsistency Detection in Natural Language Requirements using ChatGPT: a Preliminary Evaluation","type":"article-journal","volume":"2023-Septe"},"uris":["http://www.mendeley.com/documents/?uuid=9cec6ae3-206a-4ab3-a595-991609566925"]}],"mendeley":{"formattedCitation":"[11]","plainTextFormattedCitation":"[11]","previouslyFormattedCitation":"[11]"},"properties":{"noteIndex":0},"schema":"https://github.com/citation-style-language/schema/raw/master/csl-citation.json"}</w:instrText>
+      </w:r>
+      <w:r>
+        <w:rPr>
+          <w:lang w:val="en-ID"/>
+        </w:rPr>
+        <w:fldChar w:fldCharType="separate"/>
+      </w:r>
+      <w:r>
+        <w:rPr>
+          <w:noProof/>
+          <w:lang w:val="en-ID"/>
+        </w:rPr>
+        <w:t>[11]</w:t>
+      </w:r>
+      <w:r>
+        <w:rPr>
+          <w:lang w:val="en-ID"/>
+        </w:rPr>
+        <w:fldChar w:fldCharType="end"/>
+      </w:r>
+      <w:r>
+        <w:rPr>
+          <w:lang w:val="en-ID"/>
+        </w:rPr>
+        <w:t>.</w:t>
+      </w:r>
+    </w:p>
+    <w:p>
+      <w:pPr>
+        <w:rPr>
+          <w:lang w:val="en-ID"/>
+        </w:rPr>
+      </w:pPr>
+      <w:r>
+        <w:rPr>
+          <w:lang w:val="en-ID"/>
+        </w:rPr>
+        <w:t xml:space="preserve">Temuan Fantechi </w:t>
+      </w:r>
+      <w:r>
+        <w:rPr>
+          <w:lang w:val="en-ID"/>
+        </w:rPr>
+        <w:t>et al</w:t>
+      </w:r>
+      <w:r>
+        <w:rPr>
+          <w:lang w:val="en-ID"/>
+        </w:rPr>
+        <w:t xml:space="preserve">. menjadi relevan karena menunjukkan dua hal. Pertama, LLM mampu memahami jenis semantic conflict yang sulit ditangkap oleh teknik NLP tradisional. Kedua, keputusan LLM tidak seharusnya diterima tanpa mekanisme tambahan untuk mengendalikan incomplete context dan nondeterminism. Penelitian tersebut akhirnya menyimpulkan bahwa ChatGPT belum dapat menggantikan expert tetapi berpotensi digunakan sebagai </w:t>
+      </w:r>
+      <w:r>
+        <w:rPr>
+          <w:lang w:val="en-ID"/>
+        </w:rPr>
+        <w:t xml:space="preserve">complementary analysis tool </w:t>
+      </w:r>
+      <w:r>
+        <w:rPr>
+          <w:lang w:val="en-ID"/>
+        </w:rPr>
+        <w:fldChar w:fldCharType="begin" w:fldLock="1"/>
+      </w:r>
+      <w:r>
+        <w:rPr>
+          <w:lang w:val="en-ID"/>
+        </w:rPr>
+        <w:instrText>ADDIN CSL_CITATION {"citationItems":[{"id":"ITEM-1","itemData":{"DOI":"10.1109/RE57278.2023.00045","ISBN":"9798350326895","ISSN":"23326441","abstract":"With the rapid advancement of tools based on Artificial Intelligence, it is interesting to assess their usefulness in requirements engineering. In early experiments, we have seen that ChatGPT can detect inconsistency defects in natural language (NL) requirements, that traditional NLP tools cannot identify or can identify with difficulties even after domain-focused training. This study is devoted to specifically measuring the performance of ChatGPT in finding inconsistency in requirements. Positive results in this respect could lead to the use of ChatGPT to complement existing requirements analysis tools to automatically detect this important quality criterion. For this purpose, we consider GPT-3.5, the Generative Pretrained Transformer language model developed by OpenAI. We evaluate its ability to detect inconsistency by comparing its predictions with those obtained from expert judgments by students with a proven knowledge of RE issues on a few example requirements documents.","author":[{"dropping-particle":"","family":"Fantechi","given":"Alessandro","non-dropping-particle":"","parse-names":false,"suffix":""},{"dropping-particle":"","family":"Gnesi","given":"Stefania","non-dropping-particle":"","parse-names":false,"suffix":""},{"dropping-particle":"","family":"Passaro","given":"Lucia","non-dropping-particle":"","parse-names":false,"suffix":""},{"dropping-particle":"","family":"Semini","given":"Laura","non-dropping-particle":"","parse-names":false,"suffix":""}],"container-title":"Proceedings of the IEEE International Conference on Requirements Engineering","id":"ITEM-1","issued":{"date-parts":[["2023"]]},"page":"335-340","publisher":"IEEE","title":"Inconsistency Detection in Natural Language Requirements using ChatGPT: a Preliminary Evaluation","type":"article-journal","volume":"2023-Septe"},"uris":["http://www.mendeley.com/documents/?uuid=9cec6ae3-206a-4ab3-a595-991609566925"]}],"mendeley":{"formattedCitation":"[11]","plainTextFormattedCitation":"[11]","previouslyFormattedCitation":"[11]"},"properties":{"noteIndex":0},"schema":"https://github.com/citation-style-language/schema/raw/master/csl-citation.json"}</w:instrText>
+      </w:r>
+      <w:r>
+        <w:rPr>
+          <w:lang w:val="en-ID"/>
+        </w:rPr>
+        <w:fldChar w:fldCharType="separate"/>
+      </w:r>
+      <w:r>
+        <w:rPr>
+          <w:noProof/>
+          <w:lang w:val="en-ID"/>
+        </w:rPr>
+        <w:t>[11]</w:t>
+      </w:r>
+      <w:r>
+        <w:rPr>
+          <w:lang w:val="en-ID"/>
+        </w:rPr>
+        <w:fldChar w:fldCharType="end"/>
+      </w:r>
+      <w:r>
+        <w:rPr>
+          <w:lang w:val="en-ID"/>
+        </w:rPr>
+        <w:t>.</w:t>
+      </w:r>
+    </w:p>
+    <w:p>
+      <w:pPr>
+        <w:rPr>
+          <w:lang w:val="en-ID"/>
+        </w:rPr>
+      </w:pPr>
+      <w:r>
+        <w:rPr>
+          <w:lang w:val="en-ID"/>
+        </w:rPr>
+        <w:t xml:space="preserve">Prinsip verifikasi terhadap output LLM diperkuat oleh Chen </w:t>
+      </w:r>
+      <w:r>
+        <w:rPr>
+          <w:lang w:val="en-ID"/>
+        </w:rPr>
+        <w:t xml:space="preserve">et al. </w:t>
+      </w:r>
+      <w:r>
+        <w:rPr>
+          <w:lang w:val="en-ID"/>
+        </w:rPr>
+        <w:fldChar w:fldCharType="begin" w:fldLock="1"/>
+      </w:r>
+      <w:r>
+        <w:rPr>
+          <w:lang w:val="en-ID"/>
+        </w:rPr>
+        <w:instrText>ADDIN CSL_CITATION {"citationItems":[{"id":"ITEM-1","itemData":{"DOI":"10.1109/RE63999.2025.00030","ISBN":"9798331524135","ISSN":"23326441","abstract":"Requirements over strings, commonly represented using natural language (NL), are particularly relevant for software systems due to their heavy reliance on string data manipulation. While individual requirements can usually be analyzed manually, verifying properties (e.g., satisfiability) over sets of NL requirements is particularly challenging. Formal approaches (e.g., SMT solvers) may efficiently verify such properties, but are known to have theoretical limitations. Additionally, the translation of NL requirements into formal constraints typically requires significant manual effort. Recently, large language models (LLMs) have emerged as an alternative approach for formal reasoning tasks, but their effectiveness in verifying requirements over strings is less studied. In this paper, we introduce a hybrid approach that verifies the satisfiability of NL requirements over strings by using LLMs (1) to derive a satisfiability outcome (and a consistent string, if possible), and (2) to generate declarative (i.e., SMT) and imperative (i.e., Python) checkers, used to validate the correctness of (1). In our experiments, we assess the performance of four LLMs. Results show that LLMs effectively translate natural language into checkers, even achieving perfect testing accuracy for Python-based checkers. These checkers substantially help LLMs in generating a consistent string and accurately identifying unsatisfiable requirements, leading to more than doubled generation success rate and F1-score in certain cases compared to baselines without generated checkers.","author":[{"dropping-particle":"","family":"Chen","given":"Boqi","non-dropping-particle":"","parse-names":false,"suffix":""},{"dropping-particle":"","family":"Babikian","given":"Aren A.","non-dropping-particle":"","parse-names":false,"suffix":""},{"dropping-particle":"","family":"Feng","given":"Shuzhao","non-dropping-particle":"","parse-names":false,"suffix":""},{"dropping-particle":"","family":"Varro","given":"Daniel","non-dropping-particle":"","parse-names":false,"suffix":""},{"dropping-particle":"","family":"Mussbacher","given":"Gunter","non-dropping-particle":"","parse-names":false,"suffix":""}],"container-title":"Proceedings of the IEEE International Conference on Requirements Engineering","id":"ITEM-1","issued":{"date-parts":[["2025"]]},"page":"231-243","title":"LLM-based Satisfiability Checking of String Requirements by Consistent Data and Checker Generation","type":"article-journal"},"uris":["http://www.mendeley.com/documents/?uuid=f7a8329b-a6ff-4711-a576-a95f25d677d7"]}],"mendeley":{"formattedCitation":"[12]","plainTextFormattedCitation":"[12]","previouslyFormattedCitation":"[12]"},"properties":{"noteIndex":0},"schema":"https://github.com/citation-style-language/schema/raw/master/csl-citation.json"}</w:instrText>
+      </w:r>
+      <w:r>
+        <w:rPr>
+          <w:lang w:val="en-ID"/>
+        </w:rPr>
+        <w:fldChar w:fldCharType="separate"/>
+      </w:r>
+      <w:r>
+        <w:rPr>
+          <w:noProof/>
+          <w:lang w:val="en-ID"/>
+        </w:rPr>
+        <w:t>[12]</w:t>
+      </w:r>
+      <w:r>
+        <w:rPr>
+          <w:lang w:val="en-ID"/>
+        </w:rPr>
+        <w:fldChar w:fldCharType="end"/>
+      </w:r>
+      <w:r>
+        <w:rPr>
+          <w:lang w:val="en-ID"/>
+        </w:rPr>
+        <w:t xml:space="preserve"> melalui penelitian LLM-based Satisfiability Checking of String Requirements by Consistent Data and Checker Generation. Arsitekturnya menggunakan LLM dalam dua peran. Pertama, LLM menghasilkan verification outcome. Kedua, LLM menghasilkan checker yang digunakan untuk memvalidasi outcome tersebut. Dua jenis checker digunakan, yaitu declarative checker dalam bentuk SMT dan imperative checke</w:t>
+      </w:r>
+      <w:r>
+        <w:rPr>
+          <w:lang w:val="en-ID"/>
+        </w:rPr>
+        <w:t xml:space="preserve">r dalam bentuk Python </w:t>
+      </w:r>
+      <w:r>
+        <w:rPr>
+          <w:lang w:val="en-ID"/>
+        </w:rPr>
+        <w:fldChar w:fldCharType="begin" w:fldLock="1"/>
+      </w:r>
+      <w:r>
+        <w:rPr>
+          <w:lang w:val="en-ID"/>
+        </w:rPr>
+        <w:instrText>ADDIN CSL_CITATION {"citationItems":[{"id":"ITEM-1","itemData":{"DOI":"10.1109/RE63999.2025.00030","ISBN":"9798331524135","ISSN":"23326441","abstract":"Requirements over strings, commonly represented using natural language (NL), are particularly relevant for software systems due to their heavy reliance on string data manipulation. While individual requirements can usually be analyzed manually, verifying properties (e.g., satisfiability) over sets of NL requirements is particularly challenging. Formal approaches (e.g., SMT solvers) may efficiently verify such properties, but are known to have theoretical limitations. Additionally, the translation of NL requirements into formal constraints typically requires significant manual effort. Recently, large language models (LLMs) have emerged as an alternative approach for formal reasoning tasks, but their effectiveness in verifying requirements over strings is less studied. In this paper, we introduce a hybrid approach that verifies the satisfiability of NL requirements over strings by using LLMs (1) to derive a satisfiability outcome (and a consistent string, if possible), and (2) to generate declarative (i.e., SMT) and imperative (i.e., Python) checkers, used to validate the correctness of (1). In our experiments, we assess the performance of four LLMs. Results show that LLMs effectively translate natural language into checkers, even achieving perfect testing accuracy for Python-based checkers. These checkers substantially help LLMs in generating a consistent string and accurately identifying unsatisfiable requirements, leading to more than doubled generation success rate and F1-score in certain cases compared to baselines without generated checkers.","author":[{"dropping-particle":"","family":"Chen","given":"Boqi","non-dropping-particle":"","parse-names":false,"suffix":""},{"dropping-particle":"","family":"Babikian","given":"Aren A.","non-dropping-particle":"","parse-names":false,"suffix":""},{"dropping-particle":"","family":"Feng","given":"Shuzhao","non-dropping-particle":"","parse-names":false,"suffix":""},{"dropping-particle":"","family":"Varro","given":"Daniel","non-dropping-particle":"","parse-names":false,"suffix":""},{"dropping-particle":"","family":"Mussbacher","given":"Gunter","non-dropping-particle":"","parse-names":false,"suffix":""}],"container-title":"Proceedings of the IEEE International Conference on Requirements Engineering","id":"ITEM-1","issued":{"date-parts":[["2025"]]},"page":"231-243","title":"LLM-based Satisfiability Checking of String Requirements by Consistent Data and Checker Generation","type":"article-journal"},"uris":["http://www.mendeley.com/documents/?uuid=f7a8329b-a6ff-4711-a576-a95f25d677d7"]}],"mendeley":{"formattedCitation":"[12]","plainTextFormattedCitation":"[12]","previouslyFormattedCitation":"[12]"},"properties":{"noteIndex":0},"schema":"https://github.com/citation-style-language/schema/raw/master/csl-citation.json"}</w:instrText>
+      </w:r>
+      <w:r>
+        <w:rPr>
+          <w:lang w:val="en-ID"/>
+        </w:rPr>
+        <w:fldChar w:fldCharType="separate"/>
+      </w:r>
+      <w:r>
+        <w:rPr>
+          <w:noProof/>
+          <w:lang w:val="en-ID"/>
+        </w:rPr>
+        <w:t>[12]</w:t>
+      </w:r>
+      <w:r>
+        <w:rPr>
+          <w:lang w:val="en-ID"/>
+        </w:rPr>
+        <w:fldChar w:fldCharType="end"/>
+      </w:r>
+      <w:r>
+        <w:rPr>
+          <w:lang w:val="en-ID"/>
+        </w:rPr>
+        <w:t xml:space="preserve">. </w:t>
+      </w:r>
+      <w:r>
+        <w:rPr>
+          <w:lang w:val="en-ID"/>
+        </w:rPr>
+        <w:t>Metode tersebut juga menggunakan divide-and-conquer agar sekumpulan requirements yang kompleks dapat diperiksa dalam batch yang lebih kecil.</w:t>
+      </w:r>
+    </w:p>
+    <w:p>
+      <w:pPr>
+        <w:rPr>
+          <w:lang w:val="en-ID"/>
+        </w:rPr>
+      </w:pPr>
+      <w:r>
+        <w:rPr>
+          <w:lang w:val="en-ID"/>
+        </w:rPr>
+        <w:t>Eksperimen Chen</w:t>
+      </w:r>
+      <w:r>
+        <w:rPr>
+          <w:lang w:val="en-ID"/>
+        </w:rPr>
+        <w:t xml:space="preserve"> et al</w:t>
+      </w:r>
+      <w:r>
+        <w:rPr>
+          <w:lang w:val="en-ID"/>
+        </w:rPr>
+        <w:t xml:space="preserve">. mencakup 340 natural-language requirement sets dalam dua belas kategori string menggunakan GPT-4o, GPT-4o-mini, </w:t>
+      </w:r>
+      <w:r>
+        <w:rPr>
+          <w:lang w:val="en-ID"/>
+        </w:rPr>
+        <w:t xml:space="preserve">Llama3.1-8B, dan DeepSeek-V3 </w:t>
+      </w:r>
+      <w:r>
+        <w:rPr>
+          <w:lang w:val="en-ID"/>
+        </w:rPr>
+        <w:fldChar w:fldCharType="begin" w:fldLock="1"/>
+      </w:r>
+      <w:r>
+        <w:rPr>
+          <w:lang w:val="en-ID"/>
+        </w:rPr>
+        <w:instrText>ADDIN CSL_CITATION {"citationItems":[{"id":"ITEM-1","itemData":{"DOI":"10.1109/RE63999.2025.00030","ISBN":"9798331524135","ISSN":"23326441","abstract":"Requirements over strings, commonly represented using natural language (NL), are particularly relevant for software systems due to their heavy reliance on string data manipulation. While individual requirements can usually be analyzed manually, verifying properties (e.g., satisfiability) over sets of NL requirements is particularly challenging. Formal approaches (e.g., SMT solvers) may efficiently verify such properties, but are known to have theoretical limitations. Additionally, the translation of NL requirements into formal constraints typically requires significant manual effort. Recently, large language models (LLMs) have emerged as an alternative approach for formal reasoning tasks, but their effectiveness in verifying requirements over strings is less studied. In this paper, we introduce a hybrid approach that verifies the satisfiability of NL requirements over strings by using LLMs (1) to derive a satisfiability outcome (and a consistent string, if possible), and (2) to generate declarative (i.e., SMT) and imperative (i.e., Python) checkers, used to validate the correctness of (1). In our experiments, we assess the performance of four LLMs. Results show that LLMs effectively translate natural language into checkers, even achieving perfect testing accuracy for Python-based checkers. These checkers substantially help LLMs in generating a consistent string and accurately identifying unsatisfiable requirements, leading to more than doubled generation success rate and F1-score in certain cases compared to baselines without generated checkers.","author":[{"dropping-particle":"","family":"Chen","given":"Boqi","non-dropping-particle":"","parse-names":false,"suffix":""},{"dropping-particle":"","family":"Babikian","given":"Aren A.","non-dropping-particle":"","parse-names":false,"suffix":""},{"dropping-particle":"","family":"Feng","given":"Shuzhao","non-dropping-particle":"","parse-names":false,"suffix":""},{"dropping-particle":"","family":"Varro","given":"Daniel","non-dropping-particle":"","parse-names":false,"suffix":""},{"dropping-particle":"","family":"Mussbacher","given":"Gunter","non-dropping-particle":"","parse-names":false,"suffix":""}],"container-title":"Proceedings of the IEEE International Conference on Requirements Engineering","id":"ITEM-1","issued":{"date-parts":[["2025"]]},"page":"231-243","title":"LLM-based Satisfiability Checking of String Requirements by Consistent Data and Checker Generation","type":"article-journal"},"uris":["http://www.mendeley.com/documents/?uuid=f7a8329b-a6ff-4711-a576-a95f25d677d7"]}],"mendeley":{"formattedCitation":"[12]","plainTextFormattedCitation":"[12]","previouslyFormattedCitation":"[12]"},"properties":{"noteIndex":0},"schema":"https://github.com/citation-style-language/schema/raw/master/csl-citation.json"}</w:instrText>
+      </w:r>
+      <w:r>
+        <w:rPr>
+          <w:lang w:val="en-ID"/>
+        </w:rPr>
+        <w:fldChar w:fldCharType="separate"/>
+      </w:r>
+      <w:r>
+        <w:rPr>
+          <w:noProof/>
+          <w:lang w:val="en-ID"/>
+        </w:rPr>
+        <w:t>[12]</w:t>
+      </w:r>
+      <w:r>
+        <w:rPr>
+          <w:lang w:val="en-ID"/>
+        </w:rPr>
+        <w:fldChar w:fldCharType="end"/>
+      </w:r>
+      <w:r>
+        <w:rPr>
+          <w:lang w:val="en-ID"/>
+        </w:rPr>
+        <w:t xml:space="preserve">. </w:t>
+      </w:r>
+      <w:r>
+        <w:rPr>
+          <w:lang w:val="en-ID"/>
+        </w:rPr>
+        <w:t>Hasilnya menunjukkan bahwa LLM mampu mengubah natural language menjadi checker dengan baik dan imperative Python checker bahkan mencapai testing accuracy yang sangat tinggi pada eksperimen mereka. Checker juga membantu meningkatkan keberhasilan LLM dalam menentukan satisfiable maupu</w:t>
+      </w:r>
+      <w:r>
+        <w:rPr>
+          <w:lang w:val="en-ID"/>
+        </w:rPr>
+        <w:t xml:space="preserve">n unsatisfiable requirements </w:t>
+      </w:r>
+      <w:r>
+        <w:rPr>
+          <w:lang w:val="en-ID"/>
+        </w:rPr>
+        <w:fldChar w:fldCharType="begin" w:fldLock="1"/>
+      </w:r>
+      <w:r>
+        <w:rPr>
+          <w:lang w:val="en-ID"/>
+        </w:rPr>
+        <w:instrText>ADDIN CSL_CITATION {"citationItems":[{"id":"ITEM-1","itemData":{"DOI":"10.1109/RE63999.2025.00030","ISBN":"9798331524135","ISSN":"23326441","abstract":"Requirements over strings, commonly represented using natural language (NL), are particularly relevant for software systems due to their heavy reliance on string data manipulation. While individual requirements can usually be analyzed manually, verifying properties (e.g., satisfiability) over sets of NL requirements is particularly challenging. Formal approaches (e.g., SMT solvers) may efficiently verify such properties, but are known to have theoretical limitations. Additionally, the translation of NL requirements into formal constraints typically requires significant manual effort. Recently, large language models (LLMs) have emerged as an alternative approach for formal reasoning tasks, but their effectiveness in verifying requirements over strings is less studied. In this paper, we introduce a hybrid approach that verifies the satisfiability of NL requirements over strings by using LLMs (1) to derive a satisfiability outcome (and a consistent string, if possible), and (2) to generate declarative (i.e., SMT) and imperative (i.e., Python) checkers, used to validate the correctness of (1). In our experiments, we assess the performance of four LLMs. Results show that LLMs effectively translate natural language into checkers, even achieving perfect testing accuracy for Python-based checkers. These checkers substantially help LLMs in generating a consistent string and accurately identifying unsatisfiable requirements, leading to more than doubled generation success rate and F1-score in certain cases compared to baselines without generated checkers.","author":[{"dropping-particle":"","family":"Chen","given":"Boqi","non-dropping-particle":"","parse-names":false,"suffix":""},{"dropping-particle":"","family":"Babikian","given":"Aren A.","non-dropping-particle":"","parse-names":false,"suffix":""},{"dropping-particle":"","family":"Feng","given":"Shuzhao","non-dropping-particle":"","parse-names":false,"suffix":""},{"dropping-particle":"","family":"Varro","given":"Daniel","non-dropping-particle":"","parse-names":false,"suffix":""},{"dropping-particle":"","family":"Mussbacher","given":"Gunter","non-dropping-particle":"","parse-names":false,"suffix":""}],"container-title":"Proceedings of the IEEE International Conference on Requirements Engineering","id":"ITEM-1","issued":{"date-parts":[["2025"]]},"page":"231-243","title":"LLM-based Satisfiability Checking of String Requirements by Consistent Data and Checker Generation","type":"article-journal"},"uris":["http://www.mendeley.com/documents/?uuid=f7a8329b-a6ff-4711-a576-a95f25d677d7"]}],"mendeley":{"formattedCitation":"[12]","plainTextFormattedCitation":"[12]","previouslyFormattedCitation":"[12]"},"properties":{"noteIndex":0},"schema":"https://github.com/citation-style-language/schema/raw/master/csl-citation.json"}</w:instrText>
+      </w:r>
+      <w:r>
+        <w:rPr>
+          <w:lang w:val="en-ID"/>
+        </w:rPr>
+        <w:fldChar w:fldCharType="separate"/>
+      </w:r>
+      <w:r>
+        <w:rPr>
+          <w:noProof/>
+          <w:lang w:val="en-ID"/>
+        </w:rPr>
+        <w:t>[12]</w:t>
+      </w:r>
+      <w:r>
+        <w:rPr>
+          <w:lang w:val="en-ID"/>
+        </w:rPr>
+        <w:fldChar w:fldCharType="end"/>
+      </w:r>
+      <w:r>
+        <w:rPr>
+          <w:lang w:val="en-ID"/>
+        </w:rPr>
+        <w:t xml:space="preserve">. </w:t>
+      </w:r>
+      <w:r>
+        <w:rPr>
+          <w:lang w:val="en-ID"/>
+        </w:rPr>
+        <w:t>Walaupun domainnya masih terbatas pada string requirements, konsep bahwa keluaran LLM perlu melalui checker terpisah merupakan motiv</w:t>
+      </w:r>
+      <w:r>
+        <w:rPr>
+          <w:lang w:val="en-ID"/>
+        </w:rPr>
+        <w:t>asi penting bagi penelitian ini bahwa</w:t>
+      </w:r>
+      <w:r>
+        <w:rPr>
+          <w:lang w:val="en-ID"/>
+        </w:rPr>
+        <w:t xml:space="preserve"> LLM digunakan untuk semantic interpretation sedangkan keputusan consistency diperkuat menggunakan rule-based verification.</w:t>
+      </w:r>
+    </w:p>
+    <w:p>
+      <w:pPr>
+        <w:rPr>
+          <w:lang w:val="en-ID"/>
+        </w:rPr>
+      </w:pPr>
+      <w:r>
+        <w:rPr>
+          <w:lang w:val="en-ID"/>
+        </w:rPr>
+        <w:t xml:space="preserve">Hayashi </w:t>
+      </w:r>
+      <w:r>
+        <w:rPr>
+          <w:lang w:val="en-ID"/>
+        </w:rPr>
+        <w:t>et al</w:t>
+      </w:r>
+      <w:r>
+        <w:rPr>
+          <w:lang w:val="en-ID"/>
+        </w:rPr>
+        <w:t xml:space="preserve">. </w:t>
+      </w:r>
+      <w:r>
+        <w:rPr>
+          <w:lang w:val="en-ID"/>
+        </w:rPr>
+        <w:fldChar w:fldCharType="begin" w:fldLock="1"/>
+      </w:r>
+      <w:r>
+        <w:rPr>
+          <w:lang w:val="en-ID"/>
+        </w:rPr>
+        <w:instrText>ADDIN CSL_CITATION {"citationItems":[{"id":"ITEM-1","itemData":{"DOI":"10.1016/j.procs.2024.09.265","ISSN":"18770509","abstract":"In the development of software systems, multiple members create models of requirement specifications under the guidance of experienced professionals. In such cases, the time taken to create models and the quality of the resulting models depends on the members' system development experience and the characteristics of the specifications. Consequently, the cost of modeling and the quality of deliverables can make development more challenging. In this study, we identified the elements necessary to develop models of uniform quality during the process of converting specifications into the requirements analysis model defined in this study. We developed a modeling method that consists of information that should be agreed upon in advance between experienced professionals and members, and patterns of specification description analysis.","author":[{"dropping-particle":"","family":"Hayashi","given":"Masami","non-dropping-particle":"","parse-names":false,"suffix":""},{"dropping-particle":"","family":"Hayashi","given":"Kaori","non-dropping-particle":"","parse-names":false,"suffix":""},{"dropping-particle":"","family":"Sonobe","given":"Yohei","non-dropping-particle":"","parse-names":false,"suffix":""},{"dropping-particle":"","family":"Sato","given":"Hiroyuki","non-dropping-particle":"","parse-names":false,"suffix":""},{"dropping-particle":"","family":"Takeuchi","given":"Hironori","non-dropping-particle":"","parse-names":false,"suffix":""}],"container-title":"Procedia Computer Science","id":"ITEM-1","issue":"C","issued":{"date-parts":[["2024"]]},"page":"189-198","publisher":"Elsevier B.V.","title":"Specification description analysis method for requirement modeling","type":"article-journal","volume":"246"},"uris":["http://www.mendeley.com/documents/?uuid=21e2a0dd-2000-4a1b-b4dc-204dd76d0bd6"]}],"mendeley":{"formattedCitation":"[13]","plainTextFormattedCitation":"[13]","previouslyFormattedCitation":"[13]"},"properties":{"noteIndex":0},"schema":"https://github.com/citation-style-language/schema/raw/master/csl-citation.json"}</w:instrText>
+      </w:r>
+      <w:r>
+        <w:rPr>
+          <w:lang w:val="en-ID"/>
+        </w:rPr>
+        <w:fldChar w:fldCharType="separate"/>
+      </w:r>
+      <w:r>
+        <w:rPr>
+          <w:noProof/>
+          <w:lang w:val="en-ID"/>
+        </w:rPr>
+        <w:t>[13]</w:t>
+      </w:r>
+      <w:r>
+        <w:rPr>
+          <w:lang w:val="en-ID"/>
+        </w:rPr>
+        <w:fldChar w:fldCharType="end"/>
+      </w:r>
+      <w:r>
+        <w:rPr>
+          <w:lang w:val="en-ID"/>
+        </w:rPr>
+        <w:t xml:space="preserve"> memberikan perspektif pendukung mengenai proses mengubah requirement specification menjadi model. Penelitian tersebut mengembangkan modeling process dan specification-description analysis pattern agar anggota tim dengan tingkat pengalaman berbeda dapat menghasilkan requirements analysis model dengan </w:t>
+      </w:r>
+      <w:r>
+        <w:rPr>
+          <w:lang w:val="en-ID"/>
+        </w:rPr>
+        <w:t xml:space="preserve">kualitas yang lebih seragam </w:t>
+      </w:r>
+      <w:r>
+        <w:rPr>
+          <w:lang w:val="en-ID"/>
+        </w:rPr>
+        <w:fldChar w:fldCharType="begin" w:fldLock="1"/>
+      </w:r>
+      <w:r>
+        <w:rPr>
+          <w:lang w:val="en-ID"/>
+        </w:rPr>
+        <w:instrText>ADDIN CSL_CITATION {"citationItems":[{"id":"ITEM-1","itemData":{"DOI":"10.1016/j.procs.2024.09.265","ISSN":"18770509","abstract":"In the development of software systems, multiple members create models of requirement specifications under the guidance of experienced professionals. In such cases, the time taken to create models and the quality of the resulting models depends on the members' system development experience and the characteristics of the specifications. Consequently, the cost of modeling and the quality of deliverables can make development more challenging. In this study, we identified the elements necessary to develop models of uniform quality during the process of converting specifications into the requirements analysis model defined in this study. We developed a modeling method that consists of information that should be agreed upon in advance between experienced professionals and members, and patterns of specification description analysis.","author":[{"dropping-particle":"","family":"Hayashi","given":"Masami","non-dropping-particle":"","parse-names":false,"suffix":""},{"dropping-particle":"","family":"Hayashi","given":"Kaori","non-dropping-particle":"","parse-names":false,"suffix":""},{"dropping-particle":"","family":"Sonobe","given":"Yohei","non-dropping-particle":"","parse-names":false,"suffix":""},{"dropping-particle":"","family":"Sato","given":"Hiroyuki","non-dropping-particle":"","parse-names":false,"suffix":""},{"dropping-particle":"","family":"Takeuchi","given":"Hironori","non-dropping-particle":"","parse-names":false,"suffix":""}],"container-title":"Procedia Computer Science","id":"ITEM-1","issue":"C","issued":{"date-parts":[["2024"]]},"page":"189-198","publisher":"Elsevier B.V.","title":"Specification description analysis method for requirement modeling","type":"article-journal","volume":"246"},"uris":["http://www.mendeley.com/documents/?uuid=21e2a0dd-2000-4a1b-b4dc-204dd76d0bd6"]}],"mendeley":{"formattedCitation":"[13]","plainTextFormattedCitation":"[13]","previouslyFormattedCitation":"[13]"},"properties":{"noteIndex":0},"schema":"https://github.com/citation-style-language/schema/raw/master/csl-citation.json"}</w:instrText>
+      </w:r>
+      <w:r>
+        <w:rPr>
+          <w:lang w:val="en-ID"/>
+        </w:rPr>
+        <w:fldChar w:fldCharType="separate"/>
+      </w:r>
+      <w:r>
+        <w:rPr>
+          <w:noProof/>
+          <w:lang w:val="en-ID"/>
+        </w:rPr>
+        <w:t>[13]</w:t>
+      </w:r>
+      <w:r>
+        <w:rPr>
+          <w:lang w:val="en-ID"/>
+        </w:rPr>
+        <w:fldChar w:fldCharType="end"/>
+      </w:r>
+      <w:r>
+        <w:rPr>
+          <w:lang w:val="en-ID"/>
+        </w:rPr>
+        <w:t>.</w:t>
+      </w:r>
+      <w:r>
+        <w:rPr>
+          <w:lang w:val="en-ID"/>
+        </w:rPr>
+        <w:t xml:space="preserve"> </w:t>
+      </w:r>
+      <w:r>
+        <w:rPr>
+          <w:lang w:val="en-ID"/>
+        </w:rPr>
+        <w:t xml:space="preserve">Evaluasinya menunjukkan bahwa function dan trigger element dapat diekstrak secara konsisten, tetapi data element </w:t>
+      </w:r>
+      <w:r>
+        <w:rPr>
+          <w:lang w:val="en-ID"/>
+        </w:rPr>
+        <w:t xml:space="preserve">masih mengalami discrepancy </w:t>
+      </w:r>
+      <w:r>
+        <w:rPr>
+          <w:lang w:val="en-ID"/>
+        </w:rPr>
+        <w:fldChar w:fldCharType="begin" w:fldLock="1"/>
+      </w:r>
+      <w:r>
+        <w:rPr>
+          <w:lang w:val="en-ID"/>
+        </w:rPr>
+        <w:instrText>ADDIN CSL_CITATION {"citationItems":[{"id":"ITEM-1","itemData":{"DOI":"10.1016/j.procs.2024.09.265","ISSN":"18770509","abstract":"In the development of software systems, multiple members create models of requirement specifications under the guidance of experienced professionals. In such cases, the time taken to create models and the quality of the resulting models depends on the members' system development experience and the characteristics of the specifications. Consequently, the cost of modeling and the quality of deliverables can make development more challenging. In this study, we identified the elements necessary to develop models of uniform quality during the process of converting specifications into the requirements analysis model defined in this study. We developed a modeling method that consists of information that should be agreed upon in advance between experienced professionals and members, and patterns of specification description analysis.","author":[{"dropping-particle":"","family":"Hayashi","given":"Masami","non-dropping-particle":"","parse-names":false,"suffix":""},{"dropping-particle":"","family":"Hayashi","given":"Kaori","non-dropping-particle":"","parse-names":false,"suffix":""},{"dropping-particle":"","family":"Sonobe","given":"Yohei","non-dropping-particle":"","parse-names":false,"suffix":""},{"dropping-particle":"","family":"Sato","given":"Hiroyuki","non-dropping-particle":"","parse-names":false,"suffix":""},{"dropping-particle":"","family":"Takeuchi","given":"Hironori","non-dropping-particle":"","parse-names":false,"suffix":""}],"container-title":"Procedia Computer Science","id":"ITEM-1","issue":"C","issued":{"date-parts":[["2024"]]},"page":"189-198","publisher":"Elsevier B.V.","title":"Specification description analysis method for requirement modeling","type":"article-journal","volume":"246"},"uris":["http://www.mendeley.com/documents/?uuid=21e2a0dd-2000-4a1b-b4dc-204dd76d0bd6"]}],"mendeley":{"formattedCitation":"[13]","plainTextFormattedCitation":"[13]","previouslyFormattedCitation":"[13]"},"properties":{"noteIndex":0},"schema":"https://github.com/citation-style-language/schema/raw/master/csl-citation.json"}</w:instrText>
+      </w:r>
+      <w:r>
+        <w:rPr>
+          <w:lang w:val="en-ID"/>
+        </w:rPr>
+        <w:fldChar w:fldCharType="separate"/>
+      </w:r>
+      <w:r>
+        <w:rPr>
+          <w:noProof/>
+          <w:lang w:val="en-ID"/>
+        </w:rPr>
+        <w:t>[13]</w:t>
+      </w:r>
+      <w:r>
+        <w:rPr>
+          <w:lang w:val="en-ID"/>
+        </w:rPr>
+        <w:fldChar w:fldCharType="end"/>
+      </w:r>
+      <w:r>
+        <w:rPr>
+          <w:lang w:val="en-ID"/>
+        </w:rPr>
+        <w:t>.</w:t>
+      </w:r>
+      <w:r>
+        <w:rPr>
+          <w:lang w:val="en-ID"/>
+        </w:rPr>
+        <w:t xml:space="preserve"> </w:t>
+      </w:r>
+      <w:r>
+        <w:rPr>
+          <w:lang w:val="en-ID"/>
+        </w:rPr>
+        <w:t>Peneliti menemukan salah satu penyebabnya ad</w:t>
+      </w:r>
+      <w:r>
+        <w:rPr>
+          <w:lang w:val="en-ID"/>
+        </w:rPr>
+        <w:t>alah cara specification ditulis seperti</w:t>
+      </w:r>
+      <w:r>
+        <w:rPr>
+          <w:lang w:val="en-ID"/>
+        </w:rPr>
+        <w:t xml:space="preserve"> kalimat dapat mencampurkan user action dengan system behavior sehingga pembuat model kesulitan </w:t>
+      </w:r>
+      <w:r>
+        <w:rPr>
+          <w:lang w:val="en-ID"/>
+        </w:rPr>
+        <w:lastRenderedPageBreak/>
+        <w:t xml:space="preserve">menentukan bagian yang </w:t>
+      </w:r>
+      <w:r>
+        <w:rPr>
+          <w:lang w:val="en-ID"/>
+        </w:rPr>
+        <w:t xml:space="preserve">seharusnya dimodelkan </w:t>
+      </w:r>
+      <w:r>
+        <w:rPr>
+          <w:lang w:val="en-ID"/>
+        </w:rPr>
+        <w:fldChar w:fldCharType="begin" w:fldLock="1"/>
+      </w:r>
+      <w:r>
+        <w:rPr>
+          <w:lang w:val="en-ID"/>
+        </w:rPr>
+        <w:instrText>ADDIN CSL_CITATION {"citationItems":[{"id":"ITEM-1","itemData":{"DOI":"10.1016/j.procs.2024.09.265","ISSN":"18770509","abstract":"In the development of software systems, multiple members create models of requirement specifications under the guidance of experienced professionals. In such cases, the time taken to create models and the quality of the resulting models depends on the members' system development experience and the characteristics of the specifications. Consequently, the cost of modeling and the quality of deliverables can make development more challenging. In this study, we identified the elements necessary to develop models of uniform quality during the process of converting specifications into the requirements analysis model defined in this study. We developed a modeling method that consists of information that should be agreed upon in advance between experienced professionals and members, and patterns of specification description analysis.","author":[{"dropping-particle":"","family":"Hayashi","given":"Masami","non-dropping-particle":"","parse-names":false,"suffix":""},{"dropping-particle":"","family":"Hayashi","given":"Kaori","non-dropping-particle":"","parse-names":false,"suffix":""},{"dropping-particle":"","family":"Sonobe","given":"Yohei","non-dropping-particle":"","parse-names":false,"suffix":""},{"dropping-particle":"","family":"Sato","given":"Hiroyuki","non-dropping-particle":"","parse-names":false,"suffix":""},{"dropping-particle":"","family":"Takeuchi","given":"Hironori","non-dropping-particle":"","parse-names":false,"suffix":""}],"container-title":"Procedia Computer Science","id":"ITEM-1","issue":"C","issued":{"date-parts":[["2024"]]},"page":"189-198","publisher":"Elsevier B.V.","title":"Specification description analysis method for requirement modeling","type":"article-journal","volume":"246"},"uris":["http://www.mendeley.com/documents/?uuid=21e2a0dd-2000-4a1b-b4dc-204dd76d0bd6"]}],"mendeley":{"formattedCitation":"[13]","plainTextFormattedCitation":"[13]"},"properties":{"noteIndex":0},"schema":"https://github.com/citation-style-language/schema/raw/master/csl-citation.json"}</w:instrText>
+      </w:r>
+      <w:r>
+        <w:rPr>
+          <w:lang w:val="en-ID"/>
+        </w:rPr>
+        <w:fldChar w:fldCharType="separate"/>
+      </w:r>
+      <w:r>
+        <w:rPr>
+          <w:noProof/>
+          <w:lang w:val="en-ID"/>
+        </w:rPr>
+        <w:t>[13]</w:t>
+      </w:r>
+      <w:r>
+        <w:rPr>
+          <w:lang w:val="en-ID"/>
+        </w:rPr>
+        <w:fldChar w:fldCharType="end"/>
+      </w:r>
+      <w:r>
+        <w:rPr>
+          <w:lang w:val="en-ID"/>
+        </w:rPr>
+        <w:t xml:space="preserve">. </w:t>
+      </w:r>
+      <w:r>
+        <w:rPr>
+          <w:lang w:val="en-ID"/>
+        </w:rPr>
+        <w:t>Temuan tersebut mendukung penggunaan decomposition dan structured intermediate representation dalam penelitian ini daripada membandingkan dua artefak secara holistic.</w:t>
+      </w:r>
+    </w:p>
+    <w:p>
+      <w:pPr>
+        <w:rPr>
+          <w:lang w:val="en-ID"/>
+        </w:rPr>
+      </w:pPr>
+      <w:r>
+        <w:rPr>
+          <w:lang w:val="en-ID"/>
+        </w:rPr>
+        <w:t>Dari keseluruhan penelitian tersebut terlihat adanya pola yan</w:t>
+      </w:r>
+      <w:r>
+        <w:rPr>
+          <w:lang w:val="en-ID"/>
+        </w:rPr>
+        <w:t>g jelas. Metode text-mining UCD-SD [3]-</w:t>
+      </w:r>
+      <w:r>
+        <w:rPr>
+          <w:lang w:val="en-ID"/>
+        </w:rPr>
+        <w:t>[6] telah membuktikan bahwa kedua artefak dapat diekstrak dan dibandingkan secara otomatis, tetapi perbedaan hasil automated validation dengan expert menunjukkan keterbatasan similarity-based checking. Pendekatan formal seperti LBF-UML [1], CCSL [9], dan CSP/FDR [10] memiliki aturan yang eksplisit dan dapat memberikan verifikasi yang lebih deterministik, tetapi memerlukan structured representation atau anotasi formal. Sementara itu, pendekatan LLM seperti MCeT [2] mampu memahami hubungan requirement-diagram secara semantik, tetapi tetap menghasilkan false positive, false negative, dan hasil probabilistik.</w:t>
+      </w:r>
+    </w:p>
+    <w:p>
+      <w:pPr>
+        <w:rPr>
+          <w:lang w:val="en-ID"/>
+        </w:rPr>
+      </w:pPr>
+      <w:r>
+        <w:rPr>
+          <w:lang w:val="en-ID"/>
+        </w:rPr>
+        <w:t>Berdasarkan sintesis tersebut, penelitian ini mengambil posisi di antara pendekatan semantic dan formal. Natural-language Use Case Specification terlebih dahulu diubah menjadi struktur yang mempertahankan actor, action, object, ordering, condition, main flow, dan alternative flow, sedangkan Sequence Diagram diubah menjadi struktur lifeline, sender, receiver, message, ordering, guard, dan combined fragment. LLM digunakan untuk menyelesaikan masalah semantic equivalence seperti istilah berbeda yang memiliki maksud sama. Namun, keputusan akhir tidak hanya menggunakan nat</w:t>
+      </w:r>
+      <w:r>
+        <w:rPr>
+          <w:lang w:val="en-ID"/>
+        </w:rPr>
+        <w:t>ural-language judgment dari LLM. H</w:t>
+      </w:r>
+      <w:r>
+        <w:rPr>
+          <w:lang w:val="en-ID"/>
+        </w:rPr>
+        <w:t>asil alignment selanjutnya diperiksa terhadap consistency rules yang eksplisit.</w:t>
+      </w:r>
+    </w:p>
+    <w:p>
+      <w:pPr>
+        <w:rPr>
+          <w:lang w:val="en-ID"/>
+        </w:rPr>
+      </w:pPr>
+      <w:r>
+        <w:rPr>
+          <w:lang w:val="en-ID"/>
+        </w:rPr>
+        <w:t xml:space="preserve">Dengan demikian, novelty yang ditawarkan adalah integrasi structure-aware decomposition, LLM-based semantic alignment, bidirectional traceability, dan deterministic consistency validation pada pemeriksaan Use Case Specification terhadap Sequence Diagram. Pendekatan tersebut dimotivasi secara langsung oleh keberhasilan atomic decomposition MCeT dalam meningkatkan recall [2], kebutuhan semantic consistency dan explicit cross-model relationships pada LBF-UML [1], serta gagasan penggunaan checker terpisah untuk memvalidasi hasil LLM yang ditunjukkan Chen </w:t>
+      </w:r>
+      <w:r>
+        <w:rPr>
+          <w:lang w:val="en-ID"/>
+        </w:rPr>
+        <w:t>et al</w:t>
       </w:r>
       <w:bookmarkStart w:id="12" w:name="_GoBack"/>
       <w:bookmarkEnd w:id="12"/>
@@ -12890,822 +14888,7 @@
         <w:rPr>
           <w:lang w:val="en-ID"/>
         </w:rPr>
-        <w:t xml:space="preserve"> tersebut relevan untuk penelitian ini karena memperlihatkan bahwa similarity dari representasi kata tidak selalu sejalan dengan persepsi expert mengenai kesesuaian antarartefak. Cosine similarity dapat menunjukkan seberapa banyak representasi tekstual memiliki term yang berkaitan, tetapi tidak secara eksplisit membuktikan bahwa sender, receiver, direction, ordering, condition, dan alternative behavior sudah benar.</w:t>
-      </w:r>
-    </w:p>
-    <w:p>
-      <w:pPr>
-        <w:rPr>
-          <w:lang w:val="en-ID"/>
-        </w:rPr>
-      </w:pPr>
-      <w:r>
-        <w:rPr>
-          <w:lang w:val="en-ID"/>
-        </w:rPr>
-        <w:t xml:space="preserve">Apriyanto </w:t>
-      </w:r>
-      <w:r>
-        <w:rPr>
-          <w:lang w:val="en-ID"/>
-        </w:rPr>
-        <w:t xml:space="preserve">et al. </w:t>
-      </w:r>
-      <w:r>
-        <w:rPr>
-          <w:lang w:val="en-ID"/>
-        </w:rPr>
-        <w:fldChar w:fldCharType="begin" w:fldLock="1"/>
-      </w:r>
-      <w:r>
-        <w:rPr>
-          <w:lang w:val="en-ID"/>
-        </w:rPr>
-        <w:instrText>ADDIN CSL_CITATION {"citationItems":[{"id":"ITEM-1","itemData":{"DOI":"10.1109/AIIoT54504.2022.9817341","ISBN":"9781665484534","abstract":"Extraction is an essential part of processing a document to ensure the success of the text mining process. In this study, the example of the SRS document used is the Integrated Service Application (APTU) KPKNL Bandung, an application to manage the process of submitting service tickets at the State Property and Auction Service Office. There is a difference in interpreting the activities that exist in the Use Case Description artifact with a Sequence Diagram that provides an overview of the functionality of a process to show the involvement of an activity related to the Use Case Description. This study aims to perform step extraction on the Use Case description. The results of this extraction are compared for their suitability with the sequence diagram using the concept of text mining. There are core results from this research activity. First, the highest similarity between documents is in the SP01 and SD01 documents, with the similarity value being 0.69108792. Second, the highest similarity between words is found in words 'list' and 'menu,' with the similarity value being 0.9412. Third, the Kappa Score from Gwet's AC1 formula using the Python programming language is 0.12362, which means 'Slight Agreement,' while the Kappa Score value using a questionnaire filled in by the expert is 0.97464, which means 'Almost perfect.","author":[{"dropping-particle":"","family":"Apriyanto","given":"Nur","non-dropping-particle":"","parse-names":false,"suffix":""},{"dropping-particle":"","family":"Priyadi","given":"Yudi","non-dropping-particle":"","parse-names":false,"suffix":""},{"dropping-particle":"","family":"Kusumo","given":"Dana Sulistyo","non-dropping-particle":"","parse-names":false,"suffix":""}],"container-title":"2022 IEEE World AI IoT Congress, AIIoT 2022","id":"ITEM-1","issued":{"date-parts":[["2022"]]},"page":"476-482","publisher":"IEEE","title":"Extraction of Step Performed in Use Case Description as a Reference for Conformity of Sequence Diagrams Using Text Mining (Case Study: SRS APTU)","type":"article-journal"},"uris":["http://www.mendeley.com/documents/?uuid=74d112c7-d545-4fc4-9f56-164adc9ecc08"]}],"mendeley":{"formattedCitation":"[4]","plainTextFormattedCitation":"[4]","previouslyFormattedCitation":"[4]"},"properties":{"noteIndex":0},"schema":"https://github.com/citation-style-language/schema/raw/master/csl-citation.json"}</w:instrText>
-      </w:r>
-      <w:r>
-        <w:rPr>
-          <w:lang w:val="en-ID"/>
-        </w:rPr>
-        <w:fldChar w:fldCharType="separate"/>
-      </w:r>
-      <w:r>
-        <w:rPr>
-          <w:noProof/>
-          <w:lang w:val="en-ID"/>
-        </w:rPr>
-        <w:t>[4]</w:t>
-      </w:r>
-      <w:r>
-        <w:rPr>
-          <w:lang w:val="en-ID"/>
-        </w:rPr>
-        <w:fldChar w:fldCharType="end"/>
-      </w:r>
-      <w:r>
-        <w:rPr>
-          <w:lang w:val="en-ID"/>
-        </w:rPr>
-        <w:t xml:space="preserve"> menggunakan pendekatan yang mirip pada SRS APTU. Penelitian tersebut melakukan artifact modeling terhadap use case description dan sequence diagram, mengekstrak Step Performed serta isi sequence diagram, kemudian menjalankan preprocessing yang mencakup case folding, tokenization, stemming, dan stopwords. Setelah preprocessing dilakukan, cosine similarity digunakan untuk mencari tingkat kesamaan dan Gwet's AC1 digunakan untuk menguji validity dan reliability ter</w:t>
-      </w:r>
-      <w:r>
-        <w:rPr>
-          <w:lang w:val="en-ID"/>
-        </w:rPr>
-        <w:t xml:space="preserve">hadap penilaian expert </w:t>
-      </w:r>
-      <w:r>
-        <w:rPr>
-          <w:lang w:val="en-ID"/>
-        </w:rPr>
-        <w:fldChar w:fldCharType="begin" w:fldLock="1"/>
-      </w:r>
-      <w:r>
-        <w:rPr>
-          <w:lang w:val="en-ID"/>
-        </w:rPr>
-        <w:instrText>ADDIN CSL_CITATION {"citationItems":[{"id":"ITEM-1","itemData":{"DOI":"10.1109/AIIoT54504.2022.9817341","ISBN":"9781665484534","abstract":"Extraction is an essential part of processing a document to ensure the success of the text mining process. In this study, the example of the SRS document used is the Integrated Service Application (APTU) KPKNL Bandung, an application to manage the process of submitting service tickets at the State Property and Auction Service Office. There is a difference in interpreting the activities that exist in the Use Case Description artifact with a Sequence Diagram that provides an overview of the functionality of a process to show the involvement of an activity related to the Use Case Description. This study aims to perform step extraction on the Use Case description. The results of this extraction are compared for their suitability with the sequence diagram using the concept of text mining. There are core results from this research activity. First, the highest similarity between documents is in the SP01 and SD01 documents, with the similarity value being 0.69108792. Second, the highest similarity between words is found in words 'list' and 'menu,' with the similarity value being 0.9412. Third, the Kappa Score from Gwet's AC1 formula using the Python programming language is 0.12362, which means 'Slight Agreement,' while the Kappa Score value using a questionnaire filled in by the expert is 0.97464, which means 'Almost perfect.","author":[{"dropping-particle":"","family":"Apriyanto","given":"Nur","non-dropping-particle":"","parse-names":false,"suffix":""},{"dropping-particle":"","family":"Priyadi","given":"Yudi","non-dropping-particle":"","parse-names":false,"suffix":""},{"dropping-particle":"","family":"Kusumo","given":"Dana Sulistyo","non-dropping-particle":"","parse-names":false,"suffix":""}],"container-title":"2022 IEEE World AI IoT Congress, AIIoT 2022","id":"ITEM-1","issued":{"date-parts":[["2022"]]},"page":"476-482","publisher":"IEEE","title":"Extraction of Step Performed in Use Case Description as a Reference for Conformity of Sequence Diagrams Using Text Mining (Case Study: SRS APTU)","type":"article-journal"},"uris":["http://www.mendeley.com/documents/?uuid=74d112c7-d545-4fc4-9f56-164adc9ecc08"]}],"mendeley":{"formattedCitation":"[4]","plainTextFormattedCitation":"[4]","previouslyFormattedCitation":"[4]"},"properties":{"noteIndex":0},"schema":"https://github.com/citation-style-language/schema/raw/master/csl-citation.json"}</w:instrText>
-      </w:r>
-      <w:r>
-        <w:rPr>
-          <w:lang w:val="en-ID"/>
-        </w:rPr>
-        <w:fldChar w:fldCharType="separate"/>
-      </w:r>
-      <w:r>
-        <w:rPr>
-          <w:noProof/>
-          <w:lang w:val="en-ID"/>
-        </w:rPr>
-        <w:t>[4]</w:t>
-      </w:r>
-      <w:r>
-        <w:rPr>
-          <w:lang w:val="en-ID"/>
-        </w:rPr>
-        <w:fldChar w:fldCharType="end"/>
-      </w:r>
-      <w:r>
-        <w:rPr>
-          <w:lang w:val="en-ID"/>
-        </w:rPr>
-        <w:t xml:space="preserve">. </w:t>
-      </w:r>
-      <w:r>
-        <w:rPr>
-          <w:lang w:val="en-ID"/>
-        </w:rPr>
-        <w:t>Dataset APTU sebenarnya memiliki 28 use cases, 29 use case descriptions, dan 29 sequence diagrams, tetapi contoh evaluasi yang dibahas menggunakan lima Step Performed dan lima Sequence Diagram.</w:t>
-      </w:r>
-    </w:p>
-    <w:p>
-      <w:pPr>
-        <w:rPr>
-          <w:lang w:val="en-ID"/>
-        </w:rPr>
-      </w:pPr>
-      <w:r>
-        <w:rPr>
-          <w:lang w:val="en-ID"/>
-        </w:rPr>
-        <w:t>Penelitian APTU memperoleh similarity dokumen tertinggi sebesar 0,69108792 dan word similarity tertinggi sebesar 0,9412. Namun, Kappa Score yang dihasilkan program hanya 0,12362 atau Slight Agreement, sedangkan questionnaire expert menghasilkan 0,97464 atau Al</w:t>
-      </w:r>
-      <w:r>
-        <w:rPr>
-          <w:lang w:val="en-ID"/>
-        </w:rPr>
-        <w:t xml:space="preserve">most Perfect Agreement [4]. </w:t>
-      </w:r>
-      <w:r>
-        <w:rPr>
-          <w:lang w:val="en-ID"/>
-        </w:rPr>
-        <w:t>Selisih yang sangat besar tersebut semakin memperkuat indikasi bahwa pencocokan berbasis term similarity belum cukup untuk menjadi consistency checker pada relationship specification-to-design yang memiliki semantic dan behavioral constraint.</w:t>
-      </w:r>
-    </w:p>
-    <w:p>
-      <w:pPr>
-        <w:rPr>
-          <w:lang w:val="en-ID"/>
-        </w:rPr>
-      </w:pPr>
-      <w:r>
-        <w:rPr>
-          <w:lang w:val="en-ID"/>
-        </w:rPr>
-        <w:t xml:space="preserve">Abibi et al. </w:t>
-      </w:r>
-      <w:r>
-        <w:rPr>
-          <w:lang w:val="en-ID"/>
-        </w:rPr>
-        <w:fldChar w:fldCharType="begin" w:fldLock="1"/>
-      </w:r>
-      <w:r>
-        <w:rPr>
-          <w:lang w:val="en-ID"/>
-        </w:rPr>
-        <w:instrText>ADDIN CSL_CITATION {"citationItems":[{"id":"ITEM-1","itemData":{"DOI":"10.1109/AIIoT58121.2023.10174461","ISBN":"9798350337617","abstract":"In the Use Case Diagram, a Step Performed in Tabulation contains an object's explanation flow. A sequence diagram attempts to depict in detail the interaction of objects in a system, the messages or commands sent, and the implementation time. In other words, the Sequence Diagram, like the Use Case Diagram, encapsulates an object's explanation flow in a graphical diagram. The Step Performed and the Sequence Diagram should be related, yet the Step Performed and Sequence Diagram diverge while creating the Sipranta Application SRS. By adopting Text Pre-processing, this research intends to quantify the value of conformance between the Sequence Diagram and the Step Performed in Use Case Description. This study identifies the Step Performed and the Sequence Diagram using 22 documents, 11 of which are Step Performed and 11 of which are Sequence Diagrams. In addition, the Text Analysis process produces two documents with the highest conformity: d1 with d12 of 0.933461. Cohen Cappa Score produces a validation value of 0.29195, which is included in the \"Fair Agreement\"category. While the reliability results from 2 groups of experts, which is 0.8275, so it is included in the \"Substantial agreement\"category. The results differ between the two methods, which is 0.536.","author":[{"dropping-particle":"","family":"Abibi","given":"Muhammad Alfath","non-dropping-particle":"","parse-names":false,"suffix":""},{"dropping-particle":"","family":"Priyadi","given":"Yudi","non-dropping-particle":"","parse-names":false,"suffix":""},{"dropping-particle":"","family":"Dian Martha","given":"Ati Suci","non-dropping-particle":"","parse-names":false,"suffix":""}],"container-title":"2023 IEEE World AI IoT Congress, AIIoT 2023","id":"ITEM-1","issued":{"date-parts":[["2023"]]},"page":"284-290","publisher":"IEEE","title":"Object on Use Case Description: Sequence Diagram Conformance based on Step Performed using Text Pre-Processing on Sipranta Application SRS","type":"article-journal"},"uris":["http://www.mendeley.com/documents/?uuid=c3aaa1fd-999f-4a4c-ba56-77819cb824db"]}],"mendeley":{"formattedCitation":"[5]","plainTextFormattedCitation":"[5]","previouslyFormattedCitation":"[5]"},"properties":{"noteIndex":0},"schema":"https://github.com/citation-style-language/schema/raw/master/csl-citation.json"}</w:instrText>
-      </w:r>
-      <w:r>
-        <w:rPr>
-          <w:lang w:val="en-ID"/>
-        </w:rPr>
-        <w:fldChar w:fldCharType="separate"/>
-      </w:r>
-      <w:r>
-        <w:rPr>
-          <w:noProof/>
-          <w:lang w:val="en-ID"/>
-        </w:rPr>
-        <w:t>[5]</w:t>
-      </w:r>
-      <w:r>
-        <w:rPr>
-          <w:lang w:val="en-ID"/>
-        </w:rPr>
-        <w:fldChar w:fldCharType="end"/>
-      </w:r>
-      <w:r>
-        <w:rPr>
-          <w:lang w:val="en-ID"/>
-        </w:rPr>
-        <w:t xml:space="preserve"> menerapkan pendekatan serupa pada Sipranta Application SRS. Dataset berupa sebelas Step Performed dan sebelas Sequence Diagram. Setelah ekstraksi, setiap dokumen menjalani case folding, tokenization, stemming, stop-word removal, dan pembobotan TF-IDF, kemudian cosine similarity digunakan sebagai conformity measurement. Penelitian menetapkan nilai di atas 0,8 sebagai threshold kesesuaian dan menggunakan Cohen's Kappa serta Gwet's AC1 untuk vali</w:t>
-      </w:r>
-      <w:r>
-        <w:rPr>
-          <w:lang w:val="en-ID"/>
-        </w:rPr>
-        <w:t xml:space="preserve">dation dan reliability </w:t>
-      </w:r>
-      <w:r>
-        <w:rPr>
-          <w:lang w:val="en-ID"/>
-        </w:rPr>
-        <w:fldChar w:fldCharType="begin" w:fldLock="1"/>
-      </w:r>
-      <w:r>
-        <w:rPr>
-          <w:lang w:val="en-ID"/>
-        </w:rPr>
-        <w:instrText>ADDIN CSL_CITATION {"citationItems":[{"id":"ITEM-1","itemData":{"DOI":"10.1109/AIIoT58121.2023.10174461","ISBN":"9798350337617","abstract":"In the Use Case Diagram, a Step Performed in Tabulation contains an object's explanation flow. A sequence diagram attempts to depict in detail the interaction of objects in a system, the messages or commands sent, and the implementation time. In other words, the Sequence Diagram, like the Use Case Diagram, encapsulates an object's explanation flow in a graphical diagram. The Step Performed and the Sequence Diagram should be related, yet the Step Performed and Sequence Diagram diverge while creating the Sipranta Application SRS. By adopting Text Pre-processing, this research intends to quantify the value of conformance between the Sequence Diagram and the Step Performed in Use Case Description. This study identifies the Step Performed and the Sequence Diagram using 22 documents, 11 of which are Step Performed and 11 of which are Sequence Diagrams. In addition, the Text Analysis process produces two documents with the highest conformity: d1 with d12 of 0.933461. Cohen Cappa Score produces a validation value of 0.29195, which is included in the \"Fair Agreement\"category. While the reliability results from 2 groups of experts, which is 0.8275, so it is included in the \"Substantial agreement\"category. The results differ between the two methods, which is 0.536.","author":[{"dropping-particle":"","family":"Abibi","given":"Muhammad Alfath","non-dropping-particle":"","parse-names":false,"suffix":""},{"dropping-particle":"","family":"Priyadi","given":"Yudi","non-dropping-particle":"","parse-names":false,"suffix":""},{"dropping-particle":"","family":"Dian Martha","given":"Ati Suci","non-dropping-particle":"","parse-names":false,"suffix":""}],"container-title":"2023 IEEE World AI IoT Congress, AIIoT 2023","id":"ITEM-1","issued":{"date-parts":[["2023"]]},"page":"284-290","publisher":"IEEE","title":"Object on Use Case Description: Sequence Diagram Conformance based on Step Performed using Text Pre-Processing on Sipranta Application SRS","type":"article-journal"},"uris":["http://www.mendeley.com/documents/?uuid=c3aaa1fd-999f-4a4c-ba56-77819cb824db"]}],"mendeley":{"formattedCitation":"[5]","plainTextFormattedCitation":"[5]","previouslyFormattedCitation":"[5]"},"properties":{"noteIndex":0},"schema":"https://github.com/citation-style-language/schema/raw/master/csl-citation.json"}</w:instrText>
-      </w:r>
-      <w:r>
-        <w:rPr>
-          <w:lang w:val="en-ID"/>
-        </w:rPr>
-        <w:fldChar w:fldCharType="separate"/>
-      </w:r>
-      <w:r>
-        <w:rPr>
-          <w:noProof/>
-          <w:lang w:val="en-ID"/>
-        </w:rPr>
-        <w:t>[5]</w:t>
-      </w:r>
-      <w:r>
-        <w:rPr>
-          <w:lang w:val="en-ID"/>
-        </w:rPr>
-        <w:fldChar w:fldCharType="end"/>
-      </w:r>
-      <w:r>
-        <w:rPr>
-          <w:lang w:val="en-ID"/>
-        </w:rPr>
-        <w:t>.</w:t>
-      </w:r>
-      <w:r>
-        <w:rPr>
-          <w:lang w:val="en-ID"/>
-        </w:rPr>
-        <w:t xml:space="preserve"> </w:t>
-      </w:r>
-      <w:r>
-        <w:rPr>
-          <w:lang w:val="en-ID"/>
-        </w:rPr>
-        <w:t>Penilaian expert mencapai nilai 0,8275, dan penelitian menyarankan perbaikan terhadap pasangan dokumen yang memiliki conformity di bawah threshold dengan mengidentifikasi kembal</w:t>
-      </w:r>
-      <w:r>
-        <w:rPr>
-          <w:lang w:val="en-ID"/>
-        </w:rPr>
-        <w:t xml:space="preserve">i object dari Step Performed </w:t>
-      </w:r>
-      <w:r>
-        <w:rPr>
-          <w:lang w:val="en-ID"/>
-        </w:rPr>
-        <w:fldChar w:fldCharType="begin" w:fldLock="1"/>
-      </w:r>
-      <w:r>
-        <w:rPr>
-          <w:lang w:val="en-ID"/>
-        </w:rPr>
-        <w:instrText>ADDIN CSL_CITATION {"citationItems":[{"id":"ITEM-1","itemData":{"DOI":"10.1109/AIIoT58121.2023.10174461","ISBN":"9798350337617","abstract":"In the Use Case Diagram, a Step Performed in Tabulation contains an object's explanation flow. A sequence diagram attempts to depict in detail the interaction of objects in a system, the messages or commands sent, and the implementation time. In other words, the Sequence Diagram, like the Use Case Diagram, encapsulates an object's explanation flow in a graphical diagram. The Step Performed and the Sequence Diagram should be related, yet the Step Performed and Sequence Diagram diverge while creating the Sipranta Application SRS. By adopting Text Pre-processing, this research intends to quantify the value of conformance between the Sequence Diagram and the Step Performed in Use Case Description. This study identifies the Step Performed and the Sequence Diagram using 22 documents, 11 of which are Step Performed and 11 of which are Sequence Diagrams. In addition, the Text Analysis process produces two documents with the highest conformity: d1 with d12 of 0.933461. Cohen Cappa Score produces a validation value of 0.29195, which is included in the \"Fair Agreement\"category. While the reliability results from 2 groups of experts, which is 0.8275, so it is included in the \"Substantial agreement\"category. The results differ between the two methods, which is 0.536.","author":[{"dropping-particle":"","family":"Abibi","given":"Muhammad Alfath","non-dropping-particle":"","parse-names":false,"suffix":""},{"dropping-particle":"","family":"Priyadi","given":"Yudi","non-dropping-particle":"","parse-names":false,"suffix":""},{"dropping-particle":"","family":"Dian Martha","given":"Ati Suci","non-dropping-particle":"","parse-names":false,"suffix":""}],"container-title":"2023 IEEE World AI IoT Congress, AIIoT 2023","id":"ITEM-1","issued":{"date-parts":[["2023"]]},"page":"284-290","publisher":"IEEE","title":"Object on Use Case Description: Sequence Diagram Conformance based on Step Performed using Text Pre-Processing on Sipranta Application SRS","type":"article-journal"},"uris":["http://www.mendeley.com/documents/?uuid=c3aaa1fd-999f-4a4c-ba56-77819cb824db"]}],"mendeley":{"formattedCitation":"[5]","plainTextFormattedCitation":"[5]","previouslyFormattedCitation":"[5]"},"properties":{"noteIndex":0},"schema":"https://github.com/citation-style-language/schema/raw/master/csl-citation.json"}</w:instrText>
-      </w:r>
-      <w:r>
-        <w:rPr>
-          <w:lang w:val="en-ID"/>
-        </w:rPr>
-        <w:fldChar w:fldCharType="separate"/>
-      </w:r>
-      <w:r>
-        <w:rPr>
-          <w:noProof/>
-          <w:lang w:val="en-ID"/>
-        </w:rPr>
-        <w:t>[5]</w:t>
-      </w:r>
-      <w:r>
-        <w:rPr>
-          <w:lang w:val="en-ID"/>
-        </w:rPr>
-        <w:fldChar w:fldCharType="end"/>
-      </w:r>
-      <w:r>
-        <w:rPr>
-          <w:lang w:val="en-ID"/>
-        </w:rPr>
-        <w:t>.</w:t>
-      </w:r>
-    </w:p>
-    <w:p>
-      <w:pPr>
-        <w:rPr>
-          <w:lang w:val="en-ID"/>
-        </w:rPr>
-      </w:pPr>
-      <w:r>
-        <w:rPr>
-          <w:lang w:val="en-ID"/>
-        </w:rPr>
-        <w:t xml:space="preserve">Syamsir et al. </w:t>
-      </w:r>
-      <w:r>
-        <w:rPr>
-          <w:lang w:val="en-ID"/>
-        </w:rPr>
-        <w:fldChar w:fldCharType="begin" w:fldLock="1"/>
-      </w:r>
-      <w:r>
-        <w:rPr>
-          <w:lang w:val="en-ID"/>
-        </w:rPr>
-        <w:instrText>ADDIN CSL_CITATION {"citationItems":[{"id":"ITEM-1","itemData":{"DOI":"10.1109/ICE3IS59323.2023.10335375","ISBN":"9798350327762","abstract":"Only some applications that are built are successful once the client uses them. This problem occurs because there is an inconsistency between applications built with the client's needs, especially in the Software Requirements Specification (SRS) document as the reference data for software development. These losses can be avoided by implementing consistency in the contents of the SRS document. Therefore, before application development, the SRS document consistency process is crucial to match the client's needs and the developer's understanding of developing software. This study aims to propose recommendations for fixing artifacts based on the lowest value of consistency between Step Performed and Sequence Diagrams through a text-mining approach. The results of the validation and reliability tests using Gwet's AC1 formula through the Python programming language produced a Kappa Score of 0.500000, while through expert questionnaires of 0.159998. Based on the comparison of artifact consistency calculations, recommendations for fixing artifacts were made for the lowest consistency measurement values in the comparison of SP09 (d9) with SD09 (d23), which had a value of 0.840124.","author":[{"dropping-particle":"","family":"Syamsir","given":"Fiyona Anmila","non-dropping-particle":"","parse-names":false,"suffix":""},{"dropping-particle":"","family":"Jatmiko Suwawi","given":"Dawam Dwi","non-dropping-particle":"","parse-names":false,"suffix":""},{"dropping-particle":"","family":"Priyadi","given":"Yudi","non-dropping-particle":"","parse-names":false,"suffix":""}],"container-title":"Proceedings - 2023 3rd International Conference on Electronic and Electrical Engineering and Intelligent System: Responsible Technology for Sustainable Humanity, ICE3IS 2023","id":"ITEM-1","issue":"August","issued":{"date-parts":[["2023"]]},"page":"442-447","publisher":"IEEE","title":"Recommendations for Fixing of Step Performed and Sequence Diagram Based on Text Mining on SRS Digibrary","type":"article-journal"},"uris":["http://www.mendeley.com/documents/?uuid=18b59ea1-c788-4279-9985-8ca5b39e8d42"]}],"mendeley":{"formattedCitation":"[6]","plainTextFormattedCitation":"[6]","previouslyFormattedCitation":"[6]"},"properties":{"noteIndex":0},"schema":"https://github.com/citation-style-language/schema/raw/master/csl-citation.json"}</w:instrText>
-      </w:r>
-      <w:r>
-        <w:rPr>
-          <w:lang w:val="en-ID"/>
-        </w:rPr>
-        <w:fldChar w:fldCharType="separate"/>
-      </w:r>
-      <w:r>
-        <w:rPr>
-          <w:noProof/>
-          <w:lang w:val="en-ID"/>
-        </w:rPr>
-        <w:t>[6]</w:t>
-      </w:r>
-      <w:r>
-        <w:rPr>
-          <w:lang w:val="en-ID"/>
-        </w:rPr>
-        <w:fldChar w:fldCharType="end"/>
-      </w:r>
-      <w:r>
-        <w:rPr>
-          <w:lang w:val="en-ID"/>
-        </w:rPr>
-        <w:t xml:space="preserve"> kemudian mengembangkan penelitian pada SRS Digibrary dengan orientasi bukan hanya menghitung consistency tetapi juga memberikan rekomendasi perbaikan. Digibrary memiliki 14 Step Performed dan 14 Sequence Diagram. Pipeline meliputi requirements elicitation, artifact identification, extraction dan text preprocessing, TF-IDF, cosine similarity, validity/reliability testing menggunakan Gwet's AC1, kemudian fixing artifact berdasarkan pasangan denga</w:t>
-      </w:r>
-      <w:r>
-        <w:rPr>
-          <w:lang w:val="en-ID"/>
-        </w:rPr>
-        <w:t xml:space="preserve">n consistency terendah </w:t>
-      </w:r>
-      <w:r>
-        <w:rPr>
-          <w:lang w:val="en-ID"/>
-        </w:rPr>
-        <w:fldChar w:fldCharType="begin" w:fldLock="1"/>
-      </w:r>
-      <w:r>
-        <w:rPr>
-          <w:lang w:val="en-ID"/>
-        </w:rPr>
-        <w:instrText>ADDIN CSL_CITATION {"citationItems":[{"id":"ITEM-1","itemData":{"DOI":"10.1109/ICE3IS59323.2023.10335375","ISBN":"9798350327762","abstract":"Only some applications that are built are successful once the client uses them. This problem occurs because there is an inconsistency between applications built with the client's needs, especially in the Software Requirements Specification (SRS) document as the reference data for software development. These losses can be avoided by implementing consistency in the contents of the SRS document. Therefore, before application development, the SRS document consistency process is crucial to match the client's needs and the developer's understanding of developing software. This study aims to propose recommendations for fixing artifacts based on the lowest value of consistency between Step Performed and Sequence Diagrams through a text-mining approach. The results of the validation and reliability tests using Gwet's AC1 formula through the Python programming language produced a Kappa Score of 0.500000, while through expert questionnaires of 0.159998. Based on the comparison of artifact consistency calculations, recommendations for fixing artifacts were made for the lowest consistency measurement values in the comparison of SP09 (d9) with SD09 (d23), which had a value of 0.840124.","author":[{"dropping-particle":"","family":"Syamsir","given":"Fiyona Anmila","non-dropping-particle":"","parse-names":false,"suffix":""},{"dropping-particle":"","family":"Jatmiko Suwawi","given":"Dawam Dwi","non-dropping-particle":"","parse-names":false,"suffix":""},{"dropping-particle":"","family":"Priyadi","given":"Yudi","non-dropping-particle":"","parse-names":false,"suffix":""}],"container-title":"Proceedings - 2023 3rd International Conference on Electronic and Electrical Engineering and Intelligent System: Responsible Technology for Sustainable Humanity, ICE3IS 2023","id":"ITEM-1","issue":"August","issued":{"date-parts":[["2023"]]},"page":"442-447","publisher":"IEEE","title":"Recommendations for Fixing of Step Performed and Sequence Diagram Based on Text Mining on SRS Digibrary","type":"article-journal"},"uris":["http://www.mendeley.com/documents/?uuid=18b59ea1-c788-4279-9985-8ca5b39e8d42"]}],"mendeley":{"formattedCitation":"[6]","plainTextFormattedCitation":"[6]","previouslyFormattedCitation":"[6]"},"properties":{"noteIndex":0},"schema":"https://github.com/citation-style-language/schema/raw/master/csl-citation.json"}</w:instrText>
-      </w:r>
-      <w:r>
-        <w:rPr>
-          <w:lang w:val="en-ID"/>
-        </w:rPr>
-        <w:fldChar w:fldCharType="separate"/>
-      </w:r>
-      <w:r>
-        <w:rPr>
-          <w:noProof/>
-          <w:lang w:val="en-ID"/>
-        </w:rPr>
-        <w:t>[6]</w:t>
-      </w:r>
-      <w:r>
-        <w:rPr>
-          <w:lang w:val="en-ID"/>
-        </w:rPr>
-        <w:fldChar w:fldCharType="end"/>
-      </w:r>
-      <w:r>
-        <w:rPr>
-          <w:lang w:val="en-ID"/>
-        </w:rPr>
-        <w:t xml:space="preserve">. </w:t>
-      </w:r>
-      <w:r>
-        <w:rPr>
-          <w:lang w:val="en-ID"/>
-        </w:rPr>
-        <w:t>Pada penelitian tersebut, rekomendasi perbaikan diberikan pada SP09 dan SD09 yang memiliki nilai consistency terendah sebesar 0,840124 dengan melakukan perubahan placement object berdasarkan ha</w:t>
-      </w:r>
-      <w:r>
-        <w:rPr>
-          <w:lang w:val="en-ID"/>
-        </w:rPr>
-        <w:t xml:space="preserve">sil text preprocessing </w:t>
-      </w:r>
-      <w:r>
-        <w:rPr>
-          <w:lang w:val="en-ID"/>
-        </w:rPr>
-        <w:fldChar w:fldCharType="begin" w:fldLock="1"/>
-      </w:r>
-      <w:r>
-        <w:rPr>
-          <w:lang w:val="en-ID"/>
-        </w:rPr>
-        <w:instrText>ADDIN CSL_CITATION {"citationItems":[{"id":"ITEM-1","itemData":{"DOI":"10.1109/ICE3IS59323.2023.10335375","ISBN":"9798350327762","abstract":"Only some applications that are built are successful once the client uses them. This problem occurs because there is an inconsistency between applications built with the client's needs, especially in the Software Requirements Specification (SRS) document as the reference data for software development. These losses can be avoided by implementing consistency in the contents of the SRS document. Therefore, before application development, the SRS document consistency process is crucial to match the client's needs and the developer's understanding of developing software. This study aims to propose recommendations for fixing artifacts based on the lowest value of consistency between Step Performed and Sequence Diagrams through a text-mining approach. The results of the validation and reliability tests using Gwet's AC1 formula through the Python programming language produced a Kappa Score of 0.500000, while through expert questionnaires of 0.159998. Based on the comparison of artifact consistency calculations, recommendations for fixing artifacts were made for the lowest consistency measurement values in the comparison of SP09 (d9) with SD09 (d23), which had a value of 0.840124.","author":[{"dropping-particle":"","family":"Syamsir","given":"Fiyona Anmila","non-dropping-particle":"","parse-names":false,"suffix":""},{"dropping-particle":"","family":"Jatmiko Suwawi","given":"Dawam Dwi","non-dropping-particle":"","parse-names":false,"suffix":""},{"dropping-particle":"","family":"Priyadi","given":"Yudi","non-dropping-particle":"","parse-names":false,"suffix":""}],"container-title":"Proceedings - 2023 3rd International Conference on Electronic and Electrical Engineering and Intelligent System: Responsible Technology for Sustainable Humanity, ICE3IS 2023","id":"ITEM-1","issue":"August","issued":{"date-parts":[["2023"]]},"page":"442-447","publisher":"IEEE","title":"Recommendations for Fixing of Step Performed and Sequence Diagram Based on Text Mining on SRS Digibrary","type":"article-journal"},"uris":["http://www.mendeley.com/documents/?uuid=18b59ea1-c788-4279-9985-8ca5b39e8d42"]}],"mendeley":{"formattedCitation":"[6]","plainTextFormattedCitation":"[6]","previouslyFormattedCitation":"[6]"},"properties":{"noteIndex":0},"schema":"https://github.com/citation-style-language/schema/raw/master/csl-citation.json"}</w:instrText>
-      </w:r>
-      <w:r>
-        <w:rPr>
-          <w:lang w:val="en-ID"/>
-        </w:rPr>
-        <w:fldChar w:fldCharType="separate"/>
-      </w:r>
-      <w:r>
-        <w:rPr>
-          <w:noProof/>
-          <w:lang w:val="en-ID"/>
-        </w:rPr>
-        <w:t>[6]</w:t>
-      </w:r>
-      <w:r>
-        <w:rPr>
-          <w:lang w:val="en-ID"/>
-        </w:rPr>
-        <w:fldChar w:fldCharType="end"/>
-      </w:r>
-      <w:r>
-        <w:rPr>
-          <w:lang w:val="en-ID"/>
-        </w:rPr>
-        <w:t xml:space="preserve">. </w:t>
-      </w:r>
-      <w:r>
-        <w:rPr>
-          <w:lang w:val="en-ID"/>
-        </w:rPr>
-        <w:t>Pada penelitian tersebut, rekomendasi perbaikan diberikan pada SP09 dan SD09 yang memiliki nilai consistency terendah sebesar 0,840124 dengan melakukan perubahan placement object berdasarkan ha</w:t>
-      </w:r>
-      <w:r>
-        <w:rPr>
-          <w:lang w:val="en-ID"/>
-        </w:rPr>
-        <w:t>sil text preprocessing [6].</w:t>
-      </w:r>
-    </w:p>
-    <w:p>
-      <w:pPr>
-        <w:rPr>
-          <w:lang w:val="en-ID"/>
-        </w:rPr>
-      </w:pPr>
-      <w:r>
-        <w:rPr>
-          <w:lang w:val="en-ID"/>
-        </w:rPr>
-        <w:t xml:space="preserve">Rachmanda </w:t>
-      </w:r>
-      <w:r>
-        <w:rPr>
-          <w:lang w:val="en-ID"/>
-        </w:rPr>
-        <w:t xml:space="preserve">et al. </w:t>
-      </w:r>
-      <w:r>
-        <w:rPr>
-          <w:lang w:val="en-ID"/>
-        </w:rPr>
-        <w:fldChar w:fldCharType="begin" w:fldLock="1"/>
-      </w:r>
-      <w:r>
-        <w:rPr>
-          <w:lang w:val="en-ID"/>
-        </w:rPr>
-        <w:instrText>ADDIN CSL_CITATION {"citationItems":[{"id":"ITEM-1","itemData":{"DOI":"10.1109/ICE3IS66769.2025.11280707","ISBN":"9798331585235","abstract":"Inconsistencies in the creation of Unified Modeling Language (UML) artifacts occur due to differences in interpretation by each individual. These differences may arise because each individual has a different understanding of the causes and effects in an environment/system, influenced by experience, learning process, insight, intuition, and assumptions. In the process of identifying variables in a case study called IdVar4VL, there is an inconsistency between the artifacts, making this case an example of implementation in identifying UML artifacts for conformity. Our research aims to identify objects derived from all Use Case Scenario tabulations, and then use the resulting objects for the Sequence Diagram. This research has implemented stages to identify objects that produce datasets in the form of Use Case Diagrams consisting of 3 actors. The Use Case Scenario tabulation produces 10 Step-Perform documents, namely d2 to d11. After all stages are completed, this research produces an alternative dataset for UCD in the form of OCR text document, forming object tabulations based on 10 Step-Performs from 10 UCS and making improvement recommendations for Step-Performs in UCS artifacts. Additionally, the validity and reliability of the generated object tabulation against the Step-Performed score is 0.23, calculated using Gwet's AC1 formula. The resulting scores fall into the 'Fair Agreement' category based on Gwet's AC1 index, making the generated object tabulation a reference for forming a complete Sequence Diagram.","author":[{"dropping-particle":"","family":"Rachmanda","given":"Moch Alif","non-dropping-particle":"","parse-names":false,"suffix":""},{"dropping-particle":"","family":"Priyadi","given":"Yudi","non-dropping-particle":"","parse-names":false,"suffix":""},{"dropping-particle":"","family":"Fathoni","given":"M. Faris","non-dropping-particle":"","parse-names":false,"suffix":""}],"container-title":"ICE3IS 2025 - Conference Proceedings: 5th International Conference on Electronic and Electrical Engineering and Intelligent System","id":"ITEM-1","issue":"August","issued":{"date-parts":[["2025"]]},"page":"125-130","publisher":"IEEE","title":"Object Identification for Sequence Diagram based on Use Case Scenario using Text Semantic: Case Study of IdVar4CL Artefact","type":"article-journal"},"uris":["http://www.mendeley.com/documents/?uuid=8c180c32-8471-4015-981b-fcb3d272050b"]}],"mendeley":{"formattedCitation":"[7]","plainTextFormattedCitation":"[7]","previouslyFormattedCitation":"[7]"},"properties":{"noteIndex":0},"schema":"https://github.com/citation-style-language/schema/raw/master/csl-citation.json"}</w:instrText>
-      </w:r>
-      <w:r>
-        <w:rPr>
-          <w:lang w:val="en-ID"/>
-        </w:rPr>
-        <w:fldChar w:fldCharType="separate"/>
-      </w:r>
-      <w:r>
-        <w:rPr>
-          <w:noProof/>
-          <w:lang w:val="en-ID"/>
-        </w:rPr>
-        <w:t>[7]</w:t>
-      </w:r>
-      <w:r>
-        <w:rPr>
-          <w:lang w:val="en-ID"/>
-        </w:rPr>
-        <w:fldChar w:fldCharType="end"/>
-      </w:r>
-      <w:r>
-        <w:rPr>
-          <w:lang w:val="en-ID"/>
-        </w:rPr>
-        <w:t xml:space="preserve"> menggeser pendekatan dari cosine similarity murni menuju semantic processing pada penelitian Object Identification for Sequence Diagram based on Use Case Scenario using Text Semantic. Dataset IdVar4CL terdiri atas Use Case Diagram dengan tiga </w:t>
-      </w:r>
-      <w:r>
-        <w:rPr>
-          <w:lang w:val="en-ID"/>
-        </w:rPr>
-        <w:lastRenderedPageBreak/>
-        <w:t>actor dan sepuluh Use Case Scenario. Use Case Diagram terlebih dahulu diubah ke teks melalui OCR, sedangkan setiap Step-Perform pada Use Case Scenario dianalisis dengan struktur Subject-Verb-Object. Pipeline berikutnya mencakup extraction, text preprocessing, text semantic processing, dan pembentukan object tabulation yang dapat digunakan sebagai referensi dalam</w:t>
-      </w:r>
-      <w:r>
-        <w:rPr>
-          <w:lang w:val="en-ID"/>
-        </w:rPr>
-        <w:t xml:space="preserve"> pembentukan Sequence Diagram </w:t>
-      </w:r>
-      <w:r>
-        <w:rPr>
-          <w:lang w:val="en-ID"/>
-        </w:rPr>
-        <w:fldChar w:fldCharType="begin" w:fldLock="1"/>
-      </w:r>
-      <w:r>
-        <w:rPr>
-          <w:lang w:val="en-ID"/>
-        </w:rPr>
-        <w:instrText>ADDIN CSL_CITATION {"citationItems":[{"id":"ITEM-1","itemData":{"DOI":"10.1109/ICE3IS66769.2025.11280707","ISBN":"9798331585235","abstract":"Inconsistencies in the creation of Unified Modeling Language (UML) artifacts occur due to differences in interpretation by each individual. These differences may arise because each individual has a different understanding of the causes and effects in an environment/system, influenced by experience, learning process, insight, intuition, and assumptions. In the process of identifying variables in a case study called IdVar4VL, there is an inconsistency between the artifacts, making this case an example of implementation in identifying UML artifacts for conformity. Our research aims to identify objects derived from all Use Case Scenario tabulations, and then use the resulting objects for the Sequence Diagram. This research has implemented stages to identify objects that produce datasets in the form of Use Case Diagrams consisting of 3 actors. The Use Case Scenario tabulation produces 10 Step-Perform documents, namely d2 to d11. After all stages are completed, this research produces an alternative dataset for UCD in the form of OCR text document, forming object tabulations based on 10 Step-Performs from 10 UCS and making improvement recommendations for Step-Performs in UCS artifacts. Additionally, the validity and reliability of the generated object tabulation against the Step-Performed score is 0.23, calculated using Gwet's AC1 formula. The resulting scores fall into the 'Fair Agreement' category based on Gwet's AC1 index, making the generated object tabulation a reference for forming a complete Sequence Diagram.","author":[{"dropping-particle":"","family":"Rachmanda","given":"Moch Alif","non-dropping-particle":"","parse-names":false,"suffix":""},{"dropping-particle":"","family":"Priyadi","given":"Yudi","non-dropping-particle":"","parse-names":false,"suffix":""},{"dropping-particle":"","family":"Fathoni","given":"M. Faris","non-dropping-particle":"","parse-names":false,"suffix":""}],"container-title":"ICE3IS 2025 - Conference Proceedings: 5th International Conference on Electronic and Electrical Engineering and Intelligent System","id":"ITEM-1","issue":"August","issued":{"date-parts":[["2025"]]},"page":"125-130","publisher":"IEEE","title":"Object Identification for Sequence Diagram based on Use Case Scenario using Text Semantic: Case Study of IdVar4CL Artefact","type":"article-journal"},"uris":["http://www.mendeley.com/documents/?uuid=8c180c32-8471-4015-981b-fcb3d272050b"]}],"mendeley":{"formattedCitation":"[7]","plainTextFormattedCitation":"[7]","previouslyFormattedCitation":"[7]"},"properties":{"noteIndex":0},"schema":"https://github.com/citation-style-language/schema/raw/master/csl-citation.json"}</w:instrText>
-      </w:r>
-      <w:r>
-        <w:rPr>
-          <w:lang w:val="en-ID"/>
-        </w:rPr>
-        <w:fldChar w:fldCharType="separate"/>
-      </w:r>
-      <w:r>
-        <w:rPr>
-          <w:noProof/>
-          <w:lang w:val="en-ID"/>
-        </w:rPr>
-        <w:t>[7]</w:t>
-      </w:r>
-      <w:r>
-        <w:rPr>
-          <w:lang w:val="en-ID"/>
-        </w:rPr>
-        <w:fldChar w:fldCharType="end"/>
-      </w:r>
-      <w:r>
-        <w:rPr>
-          <w:lang w:val="en-ID"/>
-        </w:rPr>
-        <w:t xml:space="preserve">. </w:t>
-      </w:r>
-      <w:r>
-        <w:rPr>
-          <w:lang w:val="en-ID"/>
-        </w:rPr>
-        <w:t>Pendekatan tersebut lebih dekat dengan semantic mapping yang dibutuhkan penelitian ini, tetapi hasil validation dan reliability terhadap object tabulation hanya memperoleh nilai 0,23 atau Fair Agreement dan output masih berupa kandidat object, bukan hasil consistency checking pada k</w:t>
-      </w:r>
-      <w:r>
-        <w:rPr>
-          <w:lang w:val="en-ID"/>
-        </w:rPr>
-        <w:t xml:space="preserve">eseluruhan sequence behavior </w:t>
-      </w:r>
-      <w:r>
-        <w:rPr>
-          <w:lang w:val="en-ID"/>
-        </w:rPr>
-        <w:fldChar w:fldCharType="begin" w:fldLock="1"/>
-      </w:r>
-      <w:r>
-        <w:rPr>
-          <w:lang w:val="en-ID"/>
-        </w:rPr>
-        <w:instrText>ADDIN CSL_CITATION {"citationItems":[{"id":"ITEM-1","itemData":{"DOI":"10.1109/ICE3IS66769.2025.11280707","ISBN":"9798331585235","abstract":"Inconsistencies in the creation of Unified Modeling Language (UML) artifacts occur due to differences in interpretation by each individual. These differences may arise because each individual has a different understanding of the causes and effects in an environment/system, influenced by experience, learning process, insight, intuition, and assumptions. In the process of identifying variables in a case study called IdVar4VL, there is an inconsistency between the artifacts, making this case an example of implementation in identifying UML artifacts for conformity. Our research aims to identify objects derived from all Use Case Scenario tabulations, and then use the resulting objects for the Sequence Diagram. This research has implemented stages to identify objects that produce datasets in the form of Use Case Diagrams consisting of 3 actors. The Use Case Scenario tabulation produces 10 Step-Perform documents, namely d2 to d11. After all stages are completed, this research produces an alternative dataset for UCD in the form of OCR text document, forming object tabulations based on 10 Step-Performs from 10 UCS and making improvement recommendations for Step-Performs in UCS artifacts. Additionally, the validity and reliability of the generated object tabulation against the Step-Performed score is 0.23, calculated using Gwet's AC1 formula. The resulting scores fall into the 'Fair Agreement' category based on Gwet's AC1 index, making the generated object tabulation a reference for forming a complete Sequence Diagram.","author":[{"dropping-particle":"","family":"Rachmanda","given":"Moch Alif","non-dropping-particle":"","parse-names":false,"suffix":""},{"dropping-particle":"","family":"Priyadi","given":"Yudi","non-dropping-particle":"","parse-names":false,"suffix":""},{"dropping-particle":"","family":"Fathoni","given":"M. Faris","non-dropping-particle":"","parse-names":false,"suffix":""}],"container-title":"ICE3IS 2025 - Conference Proceedings: 5th International Conference on Electronic and Electrical Engineering and Intelligent System","id":"ITEM-1","issue":"August","issued":{"date-parts":[["2025"]]},"page":"125-130","publisher":"IEEE","title":"Object Identification for Sequence Diagram based on Use Case Scenario using Text Semantic: Case Study of IdVar4CL Artefact","type":"article-journal"},"uris":["http://www.mendeley.com/documents/?uuid=8c180c32-8471-4015-981b-fcb3d272050b"]}],"mendeley":{"formattedCitation":"[7]","plainTextFormattedCitation":"[7]","previouslyFormattedCitation":"[7]"},"properties":{"noteIndex":0},"schema":"https://github.com/citation-style-language/schema/raw/master/csl-citation.json"}</w:instrText>
-      </w:r>
-      <w:r>
-        <w:rPr>
-          <w:lang w:val="en-ID"/>
-        </w:rPr>
-        <w:fldChar w:fldCharType="separate"/>
-      </w:r>
-      <w:r>
-        <w:rPr>
-          <w:noProof/>
-          <w:lang w:val="en-ID"/>
-        </w:rPr>
-        <w:t>[7]</w:t>
-      </w:r>
-      <w:r>
-        <w:rPr>
-          <w:lang w:val="en-ID"/>
-        </w:rPr>
-        <w:fldChar w:fldCharType="end"/>
-      </w:r>
-      <w:r>
-        <w:rPr>
-          <w:lang w:val="en-ID"/>
-        </w:rPr>
-        <w:t>.</w:t>
-      </w:r>
-    </w:p>
-    <w:p>
-      <w:pPr>
-        <w:rPr>
-          <w:lang w:val="en-ID"/>
-        </w:rPr>
-      </w:pPr>
-      <w:r>
-        <w:rPr>
-          <w:lang w:val="en-ID"/>
-        </w:rPr>
-        <w:t xml:space="preserve">Alyami </w:t>
-      </w:r>
-      <w:r>
-        <w:rPr>
-          <w:lang w:val="en-ID"/>
-        </w:rPr>
-        <w:t xml:space="preserve">et al. </w:t>
-      </w:r>
-      <w:r>
-        <w:rPr>
-          <w:lang w:val="en-ID"/>
-        </w:rPr>
-        <w:fldChar w:fldCharType="begin" w:fldLock="1"/>
-      </w:r>
-      <w:r>
-        <w:rPr>
-          <w:lang w:val="en-ID"/>
-        </w:rPr>
-        <w:instrText>ADDIN CSL_CITATION {"citationItems":[{"id":"ITEM-1","itemData":{"DOI":"10.7717/PEERJ-CS.1444","ISSN":"23765992","abstract":"System design is an essential subject taught in information systems and has become a core course in its curriculum. Unified modelling language (UML) has been broadly adopted, and it is common to support the system design process using different diagrams. Each diagram serves a purpose by focusing on a specific part of a particular system. Design consistency ensures a seamless process, as the diagrams are generally interrelated. However, creating a well-designed system takes a lot of work, especially for university students with work experience. To overcome this challenge, aligning the concepts across diagrams is essential, which can help achieve better consistency and management of the design system, especially in an educational setting. This article is an extension of our previous work, as we have discussed a simple scenario of Automated teller machines to demonstrate the alignment concepts between UML diagrams. From a more technical perspective, the current contribution provides a Java program that aligns concepts by converting text-based use cases to text-based sequence diagrams. Then, the text is transformed in PlantUML to generate its graphical representation. The developed alignment tool is expected to contribute to helping students and instructors during the system design phases to be more consistent and practical. Limitations and future work are presented.","author":[{"dropping-particle":"","family":"Alyami","given":"Abdulrahman","non-dropping-particle":"","parse-names":false,"suffix":""},{"dropping-particle":"","family":"Pileggi","given":"Salvatore Flavio","non-dropping-particle":"","parse-names":false,"suffix":""},{"dropping-particle":"","family":"Sohaib","given":"Osama","non-dropping-particle":"","parse-names":false,"suffix":""},{"dropping-particle":"","family":"Hawryszkiewycz","given":"Igor","non-dropping-particle":"","parse-names":false,"suffix":""}],"container-title":"PeerJ Computer Science","id":"ITEM-1","issued":{"date-parts":[["2023"]]},"page":"1-26","title":"Seamless transformation from use case to sequence diagrams","type":"article-journal","volume":"9"},"uris":["http://www.mendeley.com/documents/?uuid=49563a86-dbdb-4be9-85ea-60c8f97000b7"]}],"mendeley":{"formattedCitation":"[8]","plainTextFormattedCitation":"[8]","previouslyFormattedCitation":"[8]"},"properties":{"noteIndex":0},"schema":"https://github.com/citation-style-language/schema/raw/master/csl-citation.json"}</w:instrText>
-      </w:r>
-      <w:r>
-        <w:rPr>
-          <w:lang w:val="en-ID"/>
-        </w:rPr>
-        <w:fldChar w:fldCharType="separate"/>
-      </w:r>
-      <w:r>
-        <w:rPr>
-          <w:noProof/>
-          <w:lang w:val="en-ID"/>
-        </w:rPr>
-        <w:t>[8]</w:t>
-      </w:r>
-      <w:r>
-        <w:rPr>
-          <w:lang w:val="en-ID"/>
-        </w:rPr>
-        <w:fldChar w:fldCharType="end"/>
-      </w:r>
-      <w:r>
-        <w:rPr>
-          <w:lang w:val="en-ID"/>
-        </w:rPr>
-        <w:t xml:space="preserve"> </w:t>
-      </w:r>
-      <w:r>
-        <w:rPr>
-          <w:lang w:val="en-ID"/>
-        </w:rPr>
-        <w:t>mengambil perspektif yang berbeda melalui Seamless Transformation from Use Case to Sequence Diagrams. Penelitian tersebut mengembangkan Java program untuk mengubah text-based use case menjadi text-based sequence diagram dan menggunakan PlantUML untuk membangun representasi grafis. Java, Eclipse, dan PlantUML menjadi tiga komponen ut</w:t>
-      </w:r>
-      <w:r>
-        <w:rPr>
-          <w:lang w:val="en-ID"/>
-        </w:rPr>
-        <w:t xml:space="preserve">ama dari tool tersebut </w:t>
-      </w:r>
-      <w:r>
-        <w:rPr>
-          <w:lang w:val="en-ID"/>
-        </w:rPr>
-        <w:fldChar w:fldCharType="begin" w:fldLock="1"/>
-      </w:r>
-      <w:r>
-        <w:rPr>
-          <w:lang w:val="en-ID"/>
-        </w:rPr>
-        <w:instrText>ADDIN CSL_CITATION {"citationItems":[{"id":"ITEM-1","itemData":{"DOI":"10.7717/PEERJ-CS.1444","ISSN":"23765992","abstract":"System design is an essential subject taught in information systems and has become a core course in its curriculum. Unified modelling language (UML) has been broadly adopted, and it is common to support the system design process using different diagrams. Each diagram serves a purpose by focusing on a specific part of a particular system. Design consistency ensures a seamless process, as the diagrams are generally interrelated. However, creating a well-designed system takes a lot of work, especially for university students with work experience. To overcome this challenge, aligning the concepts across diagrams is essential, which can help achieve better consistency and management of the design system, especially in an educational setting. This article is an extension of our previous work, as we have discussed a simple scenario of Automated teller machines to demonstrate the alignment concepts between UML diagrams. From a more technical perspective, the current contribution provides a Java program that aligns concepts by converting text-based use cases to text-based sequence diagrams. Then, the text is transformed in PlantUML to generate its graphical representation. The developed alignment tool is expected to contribute to helping students and instructors during the system design phases to be more consistent and practical. Limitations and future work are presented.","author":[{"dropping-particle":"","family":"Alyami","given":"Abdulrahman","non-dropping-particle":"","parse-names":false,"suffix":""},{"dropping-particle":"","family":"Pileggi","given":"Salvatore Flavio","non-dropping-particle":"","parse-names":false,"suffix":""},{"dropping-particle":"","family":"Sohaib","given":"Osama","non-dropping-particle":"","parse-names":false,"suffix":""},{"dropping-particle":"","family":"Hawryszkiewycz","given":"Igor","non-dropping-particle":"","parse-names":false,"suffix":""}],"container-title":"PeerJ Computer Science","id":"ITEM-1","issued":{"date-parts":[["2023"]]},"page":"1-26","title":"Seamless transformation from use case to sequence diagrams","type":"article-journal","volume":"9"},"uris":["http://www.mendeley.com/documents/?uuid=49563a86-dbdb-4be9-85ea-60c8f97000b7"]}],"mendeley":{"formattedCitation":"[8]","plainTextFormattedCitation":"[8]","previouslyFormattedCitation":"[8]"},"properties":{"noteIndex":0},"schema":"https://github.com/citation-style-language/schema/raw/master/csl-citation.json"}</w:instrText>
-      </w:r>
-      <w:r>
-        <w:rPr>
-          <w:lang w:val="en-ID"/>
-        </w:rPr>
-        <w:fldChar w:fldCharType="separate"/>
-      </w:r>
-      <w:r>
-        <w:rPr>
-          <w:noProof/>
-          <w:lang w:val="en-ID"/>
-        </w:rPr>
-        <w:t>[8]</w:t>
-      </w:r>
-      <w:r>
-        <w:rPr>
-          <w:lang w:val="en-ID"/>
-        </w:rPr>
-        <w:fldChar w:fldCharType="end"/>
-      </w:r>
-      <w:r>
-        <w:rPr>
-          <w:lang w:val="en-ID"/>
-        </w:rPr>
-        <w:t xml:space="preserve">. </w:t>
-      </w:r>
-      <w:r>
-        <w:rPr>
-          <w:lang w:val="en-ID"/>
-        </w:rPr>
-        <w:t>Pendekatan transformation mengandalkan alignment terhadap concept yang sama pada kedua diagram, seperti actors, actions, dan messages. Dengan text-to-text transformation, perubahan model menjadi lebih mudah dikelola dan dapat diotomatisasi dibandingkan transf</w:t>
-      </w:r>
-      <w:r>
-        <w:rPr>
-          <w:lang w:val="en-ID"/>
-        </w:rPr>
-        <w:t xml:space="preserve">ormasi melalui format grafis </w:t>
-      </w:r>
-      <w:r>
-        <w:rPr>
-          <w:lang w:val="en-ID"/>
-        </w:rPr>
-        <w:fldChar w:fldCharType="begin" w:fldLock="1"/>
-      </w:r>
-      <w:r>
-        <w:rPr>
-          <w:lang w:val="en-ID"/>
-        </w:rPr>
-        <w:instrText>ADDIN CSL_CITATION {"citationItems":[{"id":"ITEM-1","itemData":{"DOI":"10.7717/PEERJ-CS.1444","ISSN":"23765992","abstract":"System design is an essential subject taught in information systems and has become a core course in its curriculum. Unified modelling language (UML) has been broadly adopted, and it is common to support the system design process using different diagrams. Each diagram serves a purpose by focusing on a specific part of a particular system. Design consistency ensures a seamless process, as the diagrams are generally interrelated. However, creating a well-designed system takes a lot of work, especially for university students with work experience. To overcome this challenge, aligning the concepts across diagrams is essential, which can help achieve better consistency and management of the design system, especially in an educational setting. This article is an extension of our previous work, as we have discussed a simple scenario of Automated teller machines to demonstrate the alignment concepts between UML diagrams. From a more technical perspective, the current contribution provides a Java program that aligns concepts by converting text-based use cases to text-based sequence diagrams. Then, the text is transformed in PlantUML to generate its graphical representation. The developed alignment tool is expected to contribute to helping students and instructors during the system design phases to be more consistent and practical. Limitations and future work are presented.","author":[{"dropping-particle":"","family":"Alyami","given":"Abdulrahman","non-dropping-particle":"","parse-names":false,"suffix":""},{"dropping-particle":"","family":"Pileggi","given":"Salvatore Flavio","non-dropping-particle":"","parse-names":false,"suffix":""},{"dropping-particle":"","family":"Sohaib","given":"Osama","non-dropping-particle":"","parse-names":false,"suffix":""},{"dropping-particle":"","family":"Hawryszkiewycz","given":"Igor","non-dropping-particle":"","parse-names":false,"suffix":""}],"container-title":"PeerJ Computer Science","id":"ITEM-1","issued":{"date-parts":[["2023"]]},"page":"1-26","title":"Seamless transformation from use case to sequence diagrams","type":"article-journal","volume":"9"},"uris":["http://www.mendeley.com/documents/?uuid=49563a86-dbdb-4be9-85ea-60c8f97000b7"]}],"mendeley":{"formattedCitation":"[8]","plainTextFormattedCitation":"[8]","previouslyFormattedCitation":"[8]"},"properties":{"noteIndex":0},"schema":"https://github.com/citation-style-language/schema/raw/master/csl-citation.json"}</w:instrText>
-      </w:r>
-      <w:r>
-        <w:rPr>
-          <w:lang w:val="en-ID"/>
-        </w:rPr>
-        <w:fldChar w:fldCharType="separate"/>
-      </w:r>
-      <w:r>
-        <w:rPr>
-          <w:noProof/>
-          <w:lang w:val="en-ID"/>
-        </w:rPr>
-        <w:t>[8]</w:t>
-      </w:r>
-      <w:r>
-        <w:rPr>
-          <w:lang w:val="en-ID"/>
-        </w:rPr>
-        <w:fldChar w:fldCharType="end"/>
-      </w:r>
-      <w:r>
-        <w:rPr>
-          <w:lang w:val="en-ID"/>
-        </w:rPr>
-        <w:t>.</w:t>
-      </w:r>
-    </w:p>
-    <w:p>
-      <w:pPr>
-        <w:rPr>
-          <w:lang w:val="en-ID"/>
-        </w:rPr>
-      </w:pPr>
-      <w:r>
-        <w:rPr>
-          <w:lang w:val="en-ID"/>
-        </w:rPr>
-        <w:t xml:space="preserve">Meskipun relevan terhadap traceability antara use case dan sequence diagram, Alyami </w:t>
-      </w:r>
-      <w:r>
-        <w:rPr>
-          <w:lang w:val="en-ID"/>
-        </w:rPr>
-        <w:t>et al</w:t>
-      </w:r>
-      <w:r>
-        <w:rPr>
-          <w:lang w:val="en-ID"/>
-        </w:rPr>
-        <w:t>. tidak berfokus pada evaluasi sequence diagram independen yang mungkin telah mengandung kesalahan terhadap specification aslinya. Penulis juga menyatakan bahwa pendekatannya baru mendukung primary and essential features dari use case dan sequence diagram, serta input harus ditulis mengikuti format</w:t>
-      </w:r>
-      <w:r>
-        <w:rPr>
-          <w:lang w:val="en-ID"/>
-        </w:rPr>
-        <w:t xml:space="preserve"> yang telah ditentukan </w:t>
-      </w:r>
-      <w:r>
-        <w:rPr>
-          <w:lang w:val="en-ID"/>
-        </w:rPr>
-        <w:fldChar w:fldCharType="begin" w:fldLock="1"/>
-      </w:r>
-      <w:r>
-        <w:rPr>
-          <w:lang w:val="en-ID"/>
-        </w:rPr>
-        <w:instrText>ADDIN CSL_CITATION {"citationItems":[{"id":"ITEM-1","itemData":{"DOI":"10.7717/PEERJ-CS.1444","ISSN":"23765992","abstract":"System design is an essential subject taught in information systems and has become a core course in its curriculum. Unified modelling language (UML) has been broadly adopted, and it is common to support the system design process using different diagrams. Each diagram serves a purpose by focusing on a specific part of a particular system. Design consistency ensures a seamless process, as the diagrams are generally interrelated. However, creating a well-designed system takes a lot of work, especially for university students with work experience. To overcome this challenge, aligning the concepts across diagrams is essential, which can help achieve better consistency and management of the design system, especially in an educational setting. This article is an extension of our previous work, as we have discussed a simple scenario of Automated teller machines to demonstrate the alignment concepts between UML diagrams. From a more technical perspective, the current contribution provides a Java program that aligns concepts by converting text-based use cases to text-based sequence diagrams. Then, the text is transformed in PlantUML to generate its graphical representation. The developed alignment tool is expected to contribute to helping students and instructors during the system design phases to be more consistent and practical. Limitations and future work are presented.","author":[{"dropping-particle":"","family":"Alyami","given":"Abdulrahman","non-dropping-particle":"","parse-names":false,"suffix":""},{"dropping-particle":"","family":"Pileggi","given":"Salvatore Flavio","non-dropping-particle":"","parse-names":false,"suffix":""},{"dropping-particle":"","family":"Sohaib","given":"Osama","non-dropping-particle":"","parse-names":false,"suffix":""},{"dropping-particle":"","family":"Hawryszkiewycz","given":"Igor","non-dropping-particle":"","parse-names":false,"suffix":""}],"container-title":"PeerJ Computer Science","id":"ITEM-1","issued":{"date-parts":[["2023"]]},"page":"1-26","title":"Seamless transformation from use case to sequence diagrams","type":"article-journal","volume":"9"},"uris":["http://www.mendeley.com/documents/?uuid=49563a86-dbdb-4be9-85ea-60c8f97000b7"]}],"mendeley":{"formattedCitation":"[8]","plainTextFormattedCitation":"[8]"},"properties":{"noteIndex":0},"schema":"https://github.com/citation-style-language/schema/raw/master/csl-citation.json"}</w:instrText>
-      </w:r>
-      <w:r>
-        <w:rPr>
-          <w:lang w:val="en-ID"/>
-        </w:rPr>
-        <w:fldChar w:fldCharType="separate"/>
-      </w:r>
-      <w:r>
-        <w:rPr>
-          <w:noProof/>
-          <w:lang w:val="en-ID"/>
-        </w:rPr>
-        <w:t>[8]</w:t>
-      </w:r>
-      <w:r>
-        <w:rPr>
-          <w:lang w:val="en-ID"/>
-        </w:rPr>
-        <w:fldChar w:fldCharType="end"/>
-      </w:r>
-      <w:r>
-        <w:rPr>
-          <w:lang w:val="en-ID"/>
-        </w:rPr>
-        <w:t xml:space="preserve">. </w:t>
-      </w:r>
-      <w:r>
-        <w:rPr>
-          <w:lang w:val="en-ID"/>
-        </w:rPr>
-        <w:t>Oleh karena itu, transformation dan consistency checking perlu dibedakan: model yang berhasil ditransformasikan secara sintaktik belum tentu memberikan mekanisme diagnosis ketika artefak desain yang telah tersedia berbeda dari spesifikasi.</w:t>
+        <w:t>. [12]. Pada kumpulan literatur yang dianalisis dalam penelitian ini, kombinasi keempat komponen tersebut belum digunakan secara terpadu untuk specification-to-sequence-diagram consistency checking.</w:t>
       </w:r>
     </w:p>
     <w:p>
@@ -14454,6 +15637,7 @@
         <w:rPr>
           <w:rFonts w:cs="Times New Roman"/>
           <w:noProof/>
+          <w:szCs w:val="24"/>
         </w:rPr>
       </w:pPr>
       <w:r>
@@ -14491,6 +15675,55 @@
           <w:szCs w:val="24"/>
         </w:rPr>
         <w:t>, pp. 231–243, 2025, doi: 10.1109/RE63999.2025.00030.</w:t>
+      </w:r>
+    </w:p>
+    <w:p>
+      <w:pPr>
+        <w:widowControl w:val="0"/>
+        <w:autoSpaceDE w:val="0"/>
+        <w:autoSpaceDN w:val="0"/>
+        <w:adjustRightInd w:val="0"/>
+        <w:spacing w:line="240" w:lineRule="auto"/>
+        <w:ind w:left="640" w:hanging="640"/>
+        <w:rPr>
+          <w:rFonts w:cs="Times New Roman"/>
+          <w:noProof/>
+        </w:rPr>
+      </w:pPr>
+      <w:r>
+        <w:rPr>
+          <w:rFonts w:cs="Times New Roman"/>
+          <w:noProof/>
+          <w:szCs w:val="24"/>
+        </w:rPr>
+        <w:t>[13]</w:t>
+      </w:r>
+      <w:r>
+        <w:rPr>
+          <w:rFonts w:cs="Times New Roman"/>
+          <w:noProof/>
+          <w:szCs w:val="24"/>
+        </w:rPr>
+        <w:tab/>
+        <w:t xml:space="preserve">M. Hayashi, K. Hayashi, Y. Sonobe, H. Sato, and H. Takeuchi, “Specification description analysis method for requirement modeling,” </w:t>
+      </w:r>
+      <w:r>
+        <w:rPr>
+          <w:rFonts w:cs="Times New Roman"/>
+          <w:i/>
+          <w:iCs/>
+          <w:noProof/>
+          <w:szCs w:val="24"/>
+        </w:rPr>
+        <w:t>Procedia Comput. Sci.</w:t>
+      </w:r>
+      <w:r>
+        <w:rPr>
+          <w:rFonts w:cs="Times New Roman"/>
+          <w:noProof/>
+          <w:szCs w:val="24"/>
+        </w:rPr>
+        <w:t>, vol. 246, no. C, pp. 189–198, 2024, doi: 10.1016/j.procs.2024.09.265.</w:t>
       </w:r>
     </w:p>
     <w:p>
@@ -14645,7 +15878,7 @@
                                                 <a14:useLocalDpi xmlns:a14="http://schemas.microsoft.com/office/drawing/2010/main" val="0"/>
                                               </a:ext>
                                               <a:ext uri="{96DAC541-7B7A-43D3-8B79-37D633B846F1}">
-                                                <asvg:svgBlip xmlns:asvg="http://schemas.microsoft.com/office/drawing/2016/SVG/main" xmlns:w16sdtfl="http://schemas.microsoft.com/office/word/2024/wordml/sdtformatlock" xmlns:w16sdtdh="http://schemas.microsoft.com/office/word/2020/wordml/sdtdatahash" xmlns:w16du="http://schemas.microsoft.com/office/word/2023/wordml/word16du" xmlns:w16="http://schemas.microsoft.com/office/word/2018/wordml" xmlns:w16cid="http://schemas.microsoft.com/office/word/2016/wordml/cid" xmlns:w16cex="http://schemas.microsoft.com/office/word/2018/wordml/cex" xmlns:w="http://schemas.openxmlformats.org/wordprocessingml/2006/main" xmlns:w10="urn:schemas-microsoft-com:office:word" xmlns:v="urn:schemas-microsoft-com:vml" xmlns:oel="http://schemas.microsoft.com/office/2019/extlst" xmlns:o="urn:schemas-microsoft-com:office:office" xmlns:am3d="http://schemas.microsoft.com/office/drawing/2017/model3d" xmlns:aink="http://schemas.microsoft.com/office/drawing/2016/ink" xmlns:cx8="http://schemas.microsoft.com/office/drawing/2016/5/14/chartex" xmlns:cx7="http://schemas.microsoft.com/office/drawing/2016/5/13/chartex" xmlns:cx6="http://schemas.microsoft.com/office/drawing/2016/5/12/chartex" xmlns:cx5="http://schemas.microsoft.com/office/drawing/2016/5/11/chartex" xmlns:cx4="http://schemas.microsoft.com/office/drawing/2016/5/10/chartex" xmlns:cx3="http://schemas.microsoft.com/office/drawing/2016/5/9/chartex" xmlns:cx2="http://schemas.microsoft.com/office/drawing/2015/10/21/chartex" xmlns:cx1="http://schemas.microsoft.com/office/drawing/2015/9/8/chartex" xmlns="" r:embed="rId12"/>
+                                                <asvg:svgBlip xmlns="" xmlns:cx1="http://schemas.microsoft.com/office/drawing/2015/9/8/chartex" xmlns:cx2="http://schemas.microsoft.com/office/drawing/2015/10/21/chartex" xmlns:cx3="http://schemas.microsoft.com/office/drawing/2016/5/9/chartex" xmlns:cx4="http://schemas.microsoft.com/office/drawing/2016/5/10/chartex" xmlns:cx5="http://schemas.microsoft.com/office/drawing/2016/5/11/chartex" xmlns:cx6="http://schemas.microsoft.com/office/drawing/2016/5/12/chartex" xmlns:cx7="http://schemas.microsoft.com/office/drawing/2016/5/13/chartex" xmlns:cx8="http://schemas.microsoft.com/office/drawing/2016/5/14/chartex" xmlns:aink="http://schemas.microsoft.com/office/drawing/2016/ink" xmlns:am3d="http://schemas.microsoft.com/office/drawing/2017/model3d" xmlns:o="urn:schemas-microsoft-com:office:office" xmlns:oel="http://schemas.microsoft.com/office/2019/extlst" xmlns:v="urn:schemas-microsoft-com:vml" xmlns:w10="urn:schemas-microsoft-com:office:word" xmlns:w="http://schemas.openxmlformats.org/wordprocessingml/2006/main" xmlns:w16cex="http://schemas.microsoft.com/office/word/2018/wordml/cex" xmlns:w16cid="http://schemas.microsoft.com/office/word/2016/wordml/cid" xmlns:w16="http://schemas.microsoft.com/office/word/2018/wordml" xmlns:w16du="http://schemas.microsoft.com/office/word/2023/wordml/word16du" xmlns:w16sdtdh="http://schemas.microsoft.com/office/word/2020/wordml/sdtdatahash" xmlns:w16sdtfl="http://schemas.microsoft.com/office/word/2024/wordml/sdtformatlock" xmlns:asvg="http://schemas.microsoft.com/office/drawing/2016/SVG/main" r:embed="rId12"/>
                                               </a:ext>
                                             </a:extLst>
                                           </a:blip>
@@ -14743,7 +15976,7 @@
                                           <a14:useLocalDpi xmlns:a14="http://schemas.microsoft.com/office/drawing/2010/main" val="0"/>
                                         </a:ext>
                                         <a:ext uri="{96DAC541-7B7A-43D3-8B79-37D633B846F1}">
-                                          <asvg:svgBlip xmlns:asvg="http://schemas.microsoft.com/office/drawing/2016/SVG/main" xmlns:w16sdtfl="http://schemas.microsoft.com/office/word/2024/wordml/sdtformatlock" xmlns:w16sdtdh="http://schemas.microsoft.com/office/word/2020/wordml/sdtdatahash" xmlns:w16du="http://schemas.microsoft.com/office/word/2023/wordml/word16du" xmlns:w16="http://schemas.microsoft.com/office/word/2018/wordml" xmlns:w16cid="http://schemas.microsoft.com/office/word/2016/wordml/cid" xmlns:w16cex="http://schemas.microsoft.com/office/word/2018/wordml/cex" xmlns:w="http://schemas.openxmlformats.org/wordprocessingml/2006/main" xmlns:w10="urn:schemas-microsoft-com:office:word" xmlns:v="urn:schemas-microsoft-com:vml" xmlns:oel="http://schemas.microsoft.com/office/2019/extlst" xmlns:o="urn:schemas-microsoft-com:office:office" xmlns:am3d="http://schemas.microsoft.com/office/drawing/2017/model3d" xmlns:aink="http://schemas.microsoft.com/office/drawing/2016/ink" xmlns:cx8="http://schemas.microsoft.com/office/drawing/2016/5/14/chartex" xmlns:cx7="http://schemas.microsoft.com/office/drawing/2016/5/13/chartex" xmlns:cx6="http://schemas.microsoft.com/office/drawing/2016/5/12/chartex" xmlns:cx5="http://schemas.microsoft.com/office/drawing/2016/5/11/chartex" xmlns:cx4="http://schemas.microsoft.com/office/drawing/2016/5/10/chartex" xmlns:cx3="http://schemas.microsoft.com/office/drawing/2016/5/9/chartex" xmlns:cx2="http://schemas.microsoft.com/office/drawing/2015/10/21/chartex" xmlns:cx1="http://schemas.microsoft.com/office/drawing/2015/9/8/chartex" xmlns="" r:embed="rId12"/>
+                                          <asvg:svgBlip xmlns="" xmlns:cx1="http://schemas.microsoft.com/office/drawing/2015/9/8/chartex" xmlns:cx2="http://schemas.microsoft.com/office/drawing/2015/10/21/chartex" xmlns:cx3="http://schemas.microsoft.com/office/drawing/2016/5/9/chartex" xmlns:cx4="http://schemas.microsoft.com/office/drawing/2016/5/10/chartex" xmlns:cx5="http://schemas.microsoft.com/office/drawing/2016/5/11/chartex" xmlns:cx6="http://schemas.microsoft.com/office/drawing/2016/5/12/chartex" xmlns:cx7="http://schemas.microsoft.com/office/drawing/2016/5/13/chartex" xmlns:cx8="http://schemas.microsoft.com/office/drawing/2016/5/14/chartex" xmlns:aink="http://schemas.microsoft.com/office/drawing/2016/ink" xmlns:am3d="http://schemas.microsoft.com/office/drawing/2017/model3d" xmlns:o="urn:schemas-microsoft-com:office:office" xmlns:oel="http://schemas.microsoft.com/office/2019/extlst" xmlns:v="urn:schemas-microsoft-com:vml" xmlns:w10="urn:schemas-microsoft-com:office:word" xmlns:w="http://schemas.openxmlformats.org/wordprocessingml/2006/main" xmlns:w16cex="http://schemas.microsoft.com/office/word/2018/wordml/cex" xmlns:w16cid="http://schemas.microsoft.com/office/word/2016/wordml/cid" xmlns:w16="http://schemas.microsoft.com/office/word/2018/wordml" xmlns:w16du="http://schemas.microsoft.com/office/word/2023/wordml/word16du" xmlns:w16sdtdh="http://schemas.microsoft.com/office/word/2020/wordml/sdtdatahash" xmlns:w16sdtfl="http://schemas.microsoft.com/office/word/2024/wordml/sdtformatlock" xmlns:asvg="http://schemas.microsoft.com/office/drawing/2016/SVG/main" r:embed="rId12"/>
                                         </a:ext>
                                       </a:extLst>
                                     </a:blip>
@@ -17814,7 +19047,7 @@
           <w:rPr>
             <w:noProof/>
           </w:rPr>
-          <w:t>24</w:t>
+          <w:t>28</w:t>
         </w:r>
         <w:r>
           <w:rPr>
@@ -20462,6 +21695,46 @@
       <w:bCs/>
     </w:rPr>
   </w:style>
+  <w:style w:type="paragraph" w:styleId="FootnoteText">
+    <w:name w:val="footnote text"/>
+    <w:basedOn w:val="Normal"/>
+    <w:link w:val="FootnoteTextChar"/>
+    <w:uiPriority w:val="99"/>
+    <w:semiHidden/>
+    <w:unhideWhenUsed/>
+    <w:rsid w:val="00D54F1B"/>
+    <w:pPr>
+      <w:spacing w:after="0" w:line="240" w:lineRule="auto"/>
+    </w:pPr>
+    <w:rPr>
+      <w:sz w:val="20"/>
+      <w:szCs w:val="20"/>
+    </w:rPr>
+  </w:style>
+  <w:style w:type="character" w:customStyle="1" w:styleId="FootnoteTextChar">
+    <w:name w:val="Footnote Text Char"/>
+    <w:basedOn w:val="DefaultParagraphFont"/>
+    <w:link w:val="FootnoteText"/>
+    <w:uiPriority w:val="99"/>
+    <w:semiHidden/>
+    <w:rsid w:val="00D54F1B"/>
+    <w:rPr>
+      <w:rFonts w:ascii="Times New Roman" w:hAnsi="Times New Roman"/>
+      <w:sz w:val="20"/>
+      <w:szCs w:val="20"/>
+    </w:rPr>
+  </w:style>
+  <w:style w:type="character" w:styleId="FootnoteReference">
+    <w:name w:val="footnote reference"/>
+    <w:basedOn w:val="DefaultParagraphFont"/>
+    <w:uiPriority w:val="99"/>
+    <w:semiHidden/>
+    <w:unhideWhenUsed/>
+    <w:rsid w:val="00D54F1B"/>
+    <w:rPr>
+      <w:vertAlign w:val="superscript"/>
+    </w:rPr>
+  </w:style>
 </w:styles>
 </file>
 
@@ -20790,7 +22063,7 @@
 </file>
 
 <file path=customXml/itemProps1.xml><?xml version="1.0" encoding="utf-8"?>
-<ds:datastoreItem xmlns:ds="http://schemas.openxmlformats.org/officeDocument/2006/customXml" ds:itemID="{7D5AAB70-C331-4FA6-80C5-8F9446328B42}">
+<ds:datastoreItem xmlns:ds="http://schemas.openxmlformats.org/officeDocument/2006/customXml" ds:itemID="{FE8E5508-910B-45BD-8016-3414E925C63B}">
   <ds:schemaRefs>
     <ds:schemaRef ds:uri="http://schemas.openxmlformats.org/officeDocument/2006/bibliography"/>
   </ds:schemaRefs>

</xml_diff>